<commit_message>
Add bilingual paper push view
</commit_message>
<xml_diff>
--- a/files/paper-push/daily_paper_push_2026-05-27.docx
+++ b/files/paper-push/daily_paper_push_2026-05-27.docx
@@ -42,7 +42,7 @@
         <w:rPr>
           <w:rFonts w:ascii="Microsoft YaHei" w:hAnsi="Microsoft YaHei" w:eastAsia="Microsoft YaHei"/>
         </w:rPr>
-        <w:t>本期按更新后的重点期刊列表重跑。Nature/Science 系列优先，其余期刊按影响力和主题相关性排序；历史去重后保留 41 篇，未超过每日 50 篇上限。重点信号包括：MHW 研究正在转向亚表层与 DCM，海色研究正向 PACE/高光谱/机器学习推进，BGC-Argo 光学与氧/硝酸盐组合正在更直接约束 NCP、POC export 和微生物过程。</w:t>
+        <w:t>本期按更新后的重点期刊列表重跑。Nature/Science 系列优先，其余期刊按影响力和主题相关性排序；历史去重后保留 41 篇，未超过每日 50 篇上限。页面支持中文和英文切换；本地 Word 归档保留中文。</w:t>
       </w:r>
     </w:p>
     <w:p>
@@ -128,7 +128,17 @@
           <w:color w:val="55697D"/>
           <w:sz w:val="18"/>
         </w:rPr>
-        <w:t>Sharoni, S.; Inomura, K.; Dutkiewicz, S.; et al. | Nature Climate Change | 2026-03-31 | DOI: 10.1038/s41558-026-02598-w</w:t>
+        <w:t>作者：Shlomit Sharoni; Keisuke Inomura; Stephanie Dutkiewicz; Oliver Jahn; Zoe V. Finkel; Andrew Irwin; Mohammad M. Amirian; Erwan Monier; et al.</w:t>
+      </w:r>
+    </w:p>
+    <w:p>
+      <w:r>
+        <w:rPr>
+          <w:rFonts w:ascii="Microsoft YaHei" w:hAnsi="Microsoft YaHei" w:eastAsia="Microsoft YaHei"/>
+          <w:color w:val="55697D"/>
+          <w:sz w:val="18"/>
+        </w:rPr>
+        <w:t>期刊：Nature Climate Change | 发表月份：2026-04 | DOI: 10.1038/s41558-026-02598-w</w:t>
       </w:r>
     </w:p>
     <w:p>
@@ -178,7 +188,17 @@
           <w:color w:val="55697D"/>
           <w:sz w:val="18"/>
         </w:rPr>
-        <w:t>Bif, M. B.; Kelly, C.; Altabet, M. A.; et al. | Communications Earth &amp; Environment | 2026-04-06 | DOI: 10.1038/s43247-026-03410-5</w:t>
+        <w:t>作者：Mariana B. Bif; Colette Kelly; Mark A. Altabet; Annie Bourbonnais; Claire Elbon; Edgart Flores; Alanna Mnich; Josh Plant; et al.</w:t>
+      </w:r>
+    </w:p>
+    <w:p>
+      <w:r>
+        <w:rPr>
+          <w:rFonts w:ascii="Microsoft YaHei" w:hAnsi="Microsoft YaHei" w:eastAsia="Microsoft YaHei"/>
+          <w:color w:val="55697D"/>
+          <w:sz w:val="18"/>
+        </w:rPr>
+        <w:t>期刊：Communications Earth &amp; Environment | 发表月份：2026-04 | DOI: 10.1038/s43247-026-03410-5</w:t>
       </w:r>
     </w:p>
     <w:p>
@@ -228,7 +248,17 @@
           <w:color w:val="55697D"/>
           <w:sz w:val="18"/>
         </w:rPr>
-        <w:t>Silsbe, G. M.; Fox, J.; Westberry, T. K.; et al. | Nature Communications | 2025-07-01 | DOI: 10.1038/s41467-025-60906-y</w:t>
+        <w:t>作者：Greg M. Silsbe; James Fox; Toby K. Westberry; Kimberly H. Halsey</w:t>
+      </w:r>
+    </w:p>
+    <w:p>
+      <w:r>
+        <w:rPr>
+          <w:rFonts w:ascii="Microsoft YaHei" w:hAnsi="Microsoft YaHei" w:eastAsia="Microsoft YaHei"/>
+          <w:color w:val="55697D"/>
+          <w:sz w:val="18"/>
+        </w:rPr>
+        <w:t>期刊：Nature Communications | 发表月份：2025-07 | DOI: 10.1038/s41467-025-60906-y</w:t>
       </w:r>
     </w:p>
     <w:p>
@@ -278,7 +308,17 @@
           <w:color w:val="55697D"/>
           <w:sz w:val="18"/>
         </w:rPr>
-        <w:t>Bif, M. B.; Kellogg, C. T. E.; Huang, Y.; et al. | Nature Communications | 2025-10-06 | DOI: 10.1038/s41467-025-63605-w</w:t>
+        <w:t>作者：Mariana B. Bif; Colleen T. E. Kellogg; Yibin Huang; Julia Anstett; Sachia Traving; M. Angelica Peña; Steven J. Hallam; Kenneth S. Johnson</w:t>
+      </w:r>
+    </w:p>
+    <w:p>
+      <w:r>
+        <w:rPr>
+          <w:rFonts w:ascii="Microsoft YaHei" w:hAnsi="Microsoft YaHei" w:eastAsia="Microsoft YaHei"/>
+          <w:color w:val="55697D"/>
+          <w:sz w:val="18"/>
+        </w:rPr>
+        <w:t>期刊：Nature Communications | 发表月份：2025-10 | DOI: 10.1038/s41467-025-63605-w</w:t>
       </w:r>
     </w:p>
     <w:p>
@@ -328,7 +368,17 @@
           <w:color w:val="55697D"/>
           <w:sz w:val="18"/>
         </w:rPr>
-        <w:t>Ma, X.; Chen, G. | Communications Earth &amp; Environment | 2025-08-29 | DOI: 10.1038/s43247-025-02718-y</w:t>
+        <w:t>作者：Xueying Ma; Gengxin Chen</w:t>
+      </w:r>
+    </w:p>
+    <w:p>
+      <w:r>
+        <w:rPr>
+          <w:rFonts w:ascii="Microsoft YaHei" w:hAnsi="Microsoft YaHei" w:eastAsia="Microsoft YaHei"/>
+          <w:color w:val="55697D"/>
+          <w:sz w:val="18"/>
+        </w:rPr>
+        <w:t>期刊：Communications Earth &amp; Environment | 发表月份：2025-08 | DOI: 10.1038/s43247-025-02718-y</w:t>
       </w:r>
     </w:p>
     <w:p>
@@ -378,7 +428,17 @@
           <w:color w:val="55697D"/>
           <w:sz w:val="18"/>
         </w:rPr>
-        <w:t>Bellacicco, M.; Marullo, S.; Dall'Olmo, G.; et al. | Nature Communications | 2025-08-02 | DOI: 10.1038/s41467-025-62363-z</w:t>
+        <w:t>作者：Marco Bellacicco; Salvatore Marullo; Giorgio Dall’Olmo; Daniele Iudicone; Bruno Buongiorno Nardelli</w:t>
+      </w:r>
+    </w:p>
+    <w:p>
+      <w:r>
+        <w:rPr>
+          <w:rFonts w:ascii="Microsoft YaHei" w:hAnsi="Microsoft YaHei" w:eastAsia="Microsoft YaHei"/>
+          <w:color w:val="55697D"/>
+          <w:sz w:val="18"/>
+        </w:rPr>
+        <w:t>期刊：Nature Communications | 发表月份：2025-08 | DOI: 10.1038/s41467-025-62363-z</w:t>
       </w:r>
     </w:p>
     <w:p>
@@ -436,7 +496,17 @@
           <w:color w:val="55697D"/>
           <w:sz w:val="18"/>
         </w:rPr>
-        <w:t>Smith, A. J. R.; Wotherspoon, S.; Ratnarajah, L.; et al. | Science | 2025 | DOI: 10.1126/science.adq5564</w:t>
+        <w:t>作者：A. J. R. Smith; S. Wotherspoon; L. Ratnarajah; G. R. Cutter; G. J. Macaulay; B. Hutton; R. King; S. Kawaguchi; et al.</w:t>
+      </w:r>
+    </w:p>
+    <w:p>
+      <w:r>
+        <w:rPr>
+          <w:rFonts w:ascii="Microsoft YaHei" w:hAnsi="Microsoft YaHei" w:eastAsia="Microsoft YaHei"/>
+          <w:color w:val="55697D"/>
+          <w:sz w:val="18"/>
+        </w:rPr>
+        <w:t>期刊：Science | 发表月份：2025-01 | DOI: 10.1126/science.adq5564</w:t>
       </w:r>
     </w:p>
     <w:p>
@@ -486,7 +556,17 @@
           <w:color w:val="55697D"/>
           <w:sz w:val="18"/>
         </w:rPr>
-        <w:t>Nature Index records 8 authors | Science Advances | 2025-10-17 | DOI: 10.1126/sciadv.adx4857</w:t>
+        <w:t>作者：Zhongkun Hong; Di Long; Kaiyue Shan; Jian-Min Zhang; R. Iestyn Woolway; Maofeng Liu; Michael E. Mann; Hongwei Fang</w:t>
+      </w:r>
+    </w:p>
+    <w:p>
+      <w:r>
+        <w:rPr>
+          <w:rFonts w:ascii="Microsoft YaHei" w:hAnsi="Microsoft YaHei" w:eastAsia="Microsoft YaHei"/>
+          <w:color w:val="55697D"/>
+          <w:sz w:val="18"/>
+        </w:rPr>
+        <w:t>期刊：Science Advances | 发表月份：2025-10 | DOI: 10.1126/sciadv.adx4857</w:t>
       </w:r>
     </w:p>
     <w:p>
@@ -544,7 +624,17 @@
           <w:color w:val="55697D"/>
           <w:sz w:val="18"/>
         </w:rPr>
-        <w:t>PNAS metadata | Proceedings of the National Academy of Sciences | 2026 | DOI: 10.1073/pnas.2514991123</w:t>
+        <w:t>作者：Megan R. Sullivan; François W. Primeau; Hojong Seo; Judith Camps-Castellà; Keisuke Inomura; Adam C. Martiny</w:t>
+      </w:r>
+    </w:p>
+    <w:p>
+      <w:r>
+        <w:rPr>
+          <w:rFonts w:ascii="Microsoft YaHei" w:hAnsi="Microsoft YaHei" w:eastAsia="Microsoft YaHei"/>
+          <w:color w:val="55697D"/>
+          <w:sz w:val="18"/>
+        </w:rPr>
+        <w:t>期刊：Proceedings of the National Academy of Sciences | 发表月份：2026-02 | DOI: 10.1073/pnas.2514991123</w:t>
       </w:r>
     </w:p>
     <w:p>
@@ -594,7 +684,17 @@
           <w:color w:val="55697D"/>
           <w:sz w:val="18"/>
         </w:rPr>
-        <w:t>X. Li; C. Zhang; M. Newman; F.-F. Jin | Proceedings of the National Academy of Sciences | 2025 | DOI: 10.1073/pnas.2413505122</w:t>
+        <w:t>作者：Marta Marcos; Angel Amores; Miguel Agulles; Jon Robson; Xiangbo Feng</w:t>
+      </w:r>
+    </w:p>
+    <w:p>
+      <w:r>
+        <w:rPr>
+          <w:rFonts w:ascii="Microsoft YaHei" w:hAnsi="Microsoft YaHei" w:eastAsia="Microsoft YaHei"/>
+          <w:color w:val="55697D"/>
+          <w:sz w:val="18"/>
+        </w:rPr>
+        <w:t>期刊：Proceedings of the National Academy of Sciences | 发表月份：2025-04 | DOI: 10.1073/pnas.2413505122</w:t>
       </w:r>
     </w:p>
     <w:p>
@@ -644,7 +744,17 @@
           <w:color w:val="55697D"/>
           <w:sz w:val="18"/>
         </w:rPr>
-        <w:t>PNAS metadata | Proceedings of the National Academy of Sciences | 2026 | DOI: 10.1073/pnas.2531765123</w:t>
+        <w:t>作者：Yuting Zhu; Hanna S. Anderson; Eli Salcedo; Samuel E. Miller; Krista Longnecker; Melissa C. Kido Soule; Sheean T. Haley; Gretchen J. Swarr; et al.</w:t>
+      </w:r>
+    </w:p>
+    <w:p>
+      <w:r>
+        <w:rPr>
+          <w:rFonts w:ascii="Microsoft YaHei" w:hAnsi="Microsoft YaHei" w:eastAsia="Microsoft YaHei"/>
+          <w:color w:val="55697D"/>
+          <w:sz w:val="18"/>
+        </w:rPr>
+        <w:t>期刊：Proceedings of the National Academy of Sciences | 发表月份：2026-03 | DOI: 10.1073/pnas.2531765123</w:t>
       </w:r>
     </w:p>
     <w:p>
@@ -694,7 +804,17 @@
           <w:color w:val="55697D"/>
           <w:sz w:val="18"/>
         </w:rPr>
-        <w:t>Remote Sensing of Environment metadata | Remote Sensing of Environment | 2026 | DOI: 10.1016/j.rse.2026.115327</w:t>
+        <w:t>作者：Xingyu Bai; Bingqing Liu; Jiang Li; Yuanheng Xiong; Eurico J. D'Sa; Melissa M. Baustian; Xiaodong Zhang; Brice K. Grunert; et al.</w:t>
+      </w:r>
+    </w:p>
+    <w:p>
+      <w:r>
+        <w:rPr>
+          <w:rFonts w:ascii="Microsoft YaHei" w:hAnsi="Microsoft YaHei" w:eastAsia="Microsoft YaHei"/>
+          <w:color w:val="55697D"/>
+          <w:sz w:val="18"/>
+        </w:rPr>
+        <w:t>期刊：Remote Sensing of Environment | 发表月份：2026-05 | DOI: 10.1016/j.rse.2026.115327</w:t>
       </w:r>
     </w:p>
     <w:p>
@@ -744,7 +864,17 @@
           <w:color w:val="55697D"/>
           <w:sz w:val="18"/>
         </w:rPr>
-        <w:t>Remote Sensing of Environment metadata | Remote Sensing of Environment | 2025 | DOI: 10.1016/j.rse.2025.115174</w:t>
+        <w:t>作者：Xueyin Li; Shuguo Chen; Junwei Wang; Qing Zhu</w:t>
+      </w:r>
+    </w:p>
+    <w:p>
+      <w:r>
+        <w:rPr>
+          <w:rFonts w:ascii="Microsoft YaHei" w:hAnsi="Microsoft YaHei" w:eastAsia="Microsoft YaHei"/>
+          <w:color w:val="55697D"/>
+          <w:sz w:val="18"/>
+        </w:rPr>
+        <w:t>期刊：Remote Sensing of Environment | 发表月份：2026-03 | DOI: 10.1016/j.rse.2025.115174</w:t>
       </w:r>
     </w:p>
     <w:p>
@@ -794,7 +924,17 @@
           <w:color w:val="55697D"/>
           <w:sz w:val="18"/>
         </w:rPr>
-        <w:t>Remote Sensing of Environment metadata | Remote Sensing of Environment | 2025 | DOI: 10.1016/j.rse.2025.115111</w:t>
+        <w:t>作者：Srinivas Kolluru; Sara Rivero-Calle; Philip J. Bresnahan; Susanne Kratzer; Timothy S. Moore; Thomas Schroeder; Sean Bailey; Alan Holmes; et al.</w:t>
+      </w:r>
+    </w:p>
+    <w:p>
+      <w:r>
+        <w:rPr>
+          <w:rFonts w:ascii="Microsoft YaHei" w:hAnsi="Microsoft YaHei" w:eastAsia="Microsoft YaHei"/>
+          <w:color w:val="55697D"/>
+          <w:sz w:val="18"/>
+        </w:rPr>
+        <w:t>期刊：Remote Sensing of Environment | 发表月份：2026-01 | DOI: 10.1016/j.rse.2025.115111</w:t>
       </w:r>
     </w:p>
     <w:p>
@@ -844,7 +984,17 @@
           <w:color w:val="55697D"/>
           <w:sz w:val="18"/>
         </w:rPr>
-        <w:t>Global Change Biology metadata | Global Change Biology | 2026 | DOI: 10.1111/gcb.70671</w:t>
+        <w:t>作者：Francesco Mattei; Anna E. Hickman; Julia Uitz; Vincenzo Vellucci; Laurence Garczarek; Frédéric Partensky; Stephanie Dutkiewicz</w:t>
+      </w:r>
+    </w:p>
+    <w:p>
+      <w:r>
+        <w:rPr>
+          <w:rFonts w:ascii="Microsoft YaHei" w:hAnsi="Microsoft YaHei" w:eastAsia="Microsoft YaHei"/>
+          <w:color w:val="55697D"/>
+          <w:sz w:val="18"/>
+        </w:rPr>
+        <w:t>期刊：Global Change Biology | 发表月份：2026-01 | DOI: 10.1111/gcb.70671</w:t>
       </w:r>
     </w:p>
     <w:p>
@@ -894,7 +1044,17 @@
           <w:color w:val="55697D"/>
           <w:sz w:val="18"/>
         </w:rPr>
-        <w:t>Annual Review of Marine Science metadata | Annual Review of Marine Science | 2026 | DOI: 10.1146/annurev-marine-022123-102516</w:t>
+        <w:t>作者：Adrian B. Burd</w:t>
+      </w:r>
+    </w:p>
+    <w:p>
+      <w:r>
+        <w:rPr>
+          <w:rFonts w:ascii="Microsoft YaHei" w:hAnsi="Microsoft YaHei" w:eastAsia="Microsoft YaHei"/>
+          <w:color w:val="55697D"/>
+          <w:sz w:val="18"/>
+        </w:rPr>
+        <w:t>期刊：Annual Review of Marine Science | 发表月份：2024-01 | DOI: 10.1146/annurev-marine-022123-102516</w:t>
       </w:r>
     </w:p>
     <w:p>
@@ -944,7 +1104,17 @@
           <w:color w:val="55697D"/>
           <w:sz w:val="18"/>
         </w:rPr>
-        <w:t>Liniger, G.; Sharp, J. D.; Takeshita, Y.; Johnson, K. S. | Global Biogeochemical Cycles | 2025 | DOI: 10.1029/2024GB008371</w:t>
+        <w:t>作者：Guillaume Liniger; Jonathan D. Sharp; Yuichiro Takeshita; Kenneth S. Johnson</w:t>
+      </w:r>
+    </w:p>
+    <w:p>
+      <w:r>
+        <w:rPr>
+          <w:rFonts w:ascii="Microsoft YaHei" w:hAnsi="Microsoft YaHei" w:eastAsia="Microsoft YaHei"/>
+          <w:color w:val="55697D"/>
+          <w:sz w:val="18"/>
+        </w:rPr>
+        <w:t>期刊：Global Biogeochemical Cycles | 发表月份：2025-08 | DOI: 10.1029/2024GB008371</w:t>
       </w:r>
     </w:p>
     <w:p>
@@ -994,7 +1164,17 @@
           <w:color w:val="55697D"/>
           <w:sz w:val="18"/>
         </w:rPr>
-        <w:t>Liniger, G.; Moreau, S.; Lannuzel, D.; Carranza, M. M.; Strutton, P. G. | Global Biogeochemical Cycles | 2025 | DOI: 10.1029/2024GB008193</w:t>
+        <w:t>作者：Guillaume Liniger; Sébastien Moreau; Delphine Lannuzel; Magdalena M. Carranza; Peter G. Strutton</w:t>
+      </w:r>
+    </w:p>
+    <w:p>
+      <w:r>
+        <w:rPr>
+          <w:rFonts w:ascii="Microsoft YaHei" w:hAnsi="Microsoft YaHei" w:eastAsia="Microsoft YaHei"/>
+          <w:color w:val="55697D"/>
+          <w:sz w:val="18"/>
+        </w:rPr>
+        <w:t>期刊：Global Biogeochemical Cycles | 发表月份：2025-04 | DOI: 10.1029/2024GB008193</w:t>
       </w:r>
     </w:p>
     <w:p>
@@ -1044,7 +1224,17 @@
           <w:color w:val="55697D"/>
           <w:sz w:val="18"/>
         </w:rPr>
-        <w:t>Geophysical Research Letters metadata | Geophysical Research Letters | 2026 | DOI: 10.1029/2025GL120669</w:t>
+        <w:t>作者：Lei Lin; Chen Dong; Stephanie Henson; Bingzhang Chen</w:t>
+      </w:r>
+    </w:p>
+    <w:p>
+      <w:r>
+        <w:rPr>
+          <w:rFonts w:ascii="Microsoft YaHei" w:hAnsi="Microsoft YaHei" w:eastAsia="Microsoft YaHei"/>
+          <w:color w:val="55697D"/>
+          <w:sz w:val="18"/>
+        </w:rPr>
+        <w:t>期刊：Geophysical Research Letters | 发表月份：2026-02 | DOI: 10.1029/2025GL120669</w:t>
       </w:r>
     </w:p>
     <w:p>
@@ -1094,7 +1284,17 @@
           <w:color w:val="55697D"/>
           <w:sz w:val="18"/>
         </w:rPr>
-        <w:t>Geophysical Research Letters metadata | Geophysical Research Letters | 2025 | DOI: 10.1029/2024GL112446</w:t>
+        <w:t>作者：Jessica S. Turner; David R. Munro; Amanda Fay; Sharon Stammerjohn; Heather Kim; Oscar Schofield; Heidi Dierssen</w:t>
+      </w:r>
+    </w:p>
+    <w:p>
+      <w:r>
+        <w:rPr>
+          <w:rFonts w:ascii="Microsoft YaHei" w:hAnsi="Microsoft YaHei" w:eastAsia="Microsoft YaHei"/>
+          <w:color w:val="55697D"/>
+          <w:sz w:val="18"/>
+        </w:rPr>
+        <w:t>期刊：Geophysical Research Letters | 发表月份：2025-02 | DOI: 10.1029/2024GL112446</w:t>
       </w:r>
     </w:p>
     <w:p>
@@ -1144,7 +1344,17 @@
           <w:color w:val="55697D"/>
           <w:sz w:val="18"/>
         </w:rPr>
-        <w:t>Geophysical Research Letters metadata | Geophysical Research Letters | 2025 | DOI: 10.1029/2024GL111264</w:t>
+        <w:t>作者：Esther Portela; Meredith G. Meyer; Karen J. Heywood; Walker O. Smith</w:t>
+      </w:r>
+    </w:p>
+    <w:p>
+      <w:r>
+        <w:rPr>
+          <w:rFonts w:ascii="Microsoft YaHei" w:hAnsi="Microsoft YaHei" w:eastAsia="Microsoft YaHei"/>
+          <w:color w:val="55697D"/>
+          <w:sz w:val="18"/>
+        </w:rPr>
+        <w:t>期刊：Geophysical Research Letters | 发表月份：2025-02 | DOI: 10.1029/2024GL111264</w:t>
       </w:r>
     </w:p>
     <w:p>
@@ -1194,7 +1404,17 @@
           <w:color w:val="55697D"/>
           <w:sz w:val="18"/>
         </w:rPr>
-        <w:t>Journal of Geophysical Research: Oceans metadata | Journal of Geophysical Research: Oceans | 2026 | DOI: 10.1029/2025JC023249</w:t>
+        <w:t>作者：S. C. Painter; E. E. García‐Martín; C. Feltham; R. Muliawan; E. Mawji; K. Peel; S. Kelly; A. Flohr; et al.</w:t>
+      </w:r>
+    </w:p>
+    <w:p>
+      <w:r>
+        <w:rPr>
+          <w:rFonts w:ascii="Microsoft YaHei" w:hAnsi="Microsoft YaHei" w:eastAsia="Microsoft YaHei"/>
+          <w:color w:val="55697D"/>
+          <w:sz w:val="18"/>
+        </w:rPr>
+        <w:t>期刊：Journal of Geophysical Research: Oceans | 发表月份：2026-02 | DOI: 10.1029/2025JC023249</w:t>
       </w:r>
     </w:p>
     <w:p>
@@ -1244,7 +1464,17 @@
           <w:color w:val="55697D"/>
           <w:sz w:val="18"/>
         </w:rPr>
-        <w:t>ESSD discussion metadata | Earth System Science Data Discussions | 2026 | DOI: 10.5194/essd-2026-311</w:t>
+        <w:t>作者：Seth M. Bushinsky; Zachary Nachod; Mathilde Jutras; Daniela König; Shannon McClish; Charles Addey</w:t>
+      </w:r>
+    </w:p>
+    <w:p>
+      <w:r>
+        <w:rPr>
+          <w:rFonts w:ascii="Microsoft YaHei" w:hAnsi="Microsoft YaHei" w:eastAsia="Microsoft YaHei"/>
+          <w:color w:val="55697D"/>
+          <w:sz w:val="18"/>
+        </w:rPr>
+        <w:t>期刊：Earth System Science Data Discussions | 发表月份：2026-05 | DOI: 10.5194/essd-2026-311</w:t>
       </w:r>
     </w:p>
     <w:p>
@@ -1294,7 +1524,17 @@
           <w:color w:val="55697D"/>
           <w:sz w:val="18"/>
         </w:rPr>
-        <w:t>ESSD metadata | Earth System Science Data | 2026 | DOI: 10.5194/essd-18-569-2026</w:t>
+        <w:t>作者：Daniel J. Ford; Gemma Kulk; Shubha Sathyendranath; Jamie D. Shutler</w:t>
+      </w:r>
+    </w:p>
+    <w:p>
+      <w:r>
+        <w:rPr>
+          <w:rFonts w:ascii="Microsoft YaHei" w:hAnsi="Microsoft YaHei" w:eastAsia="Microsoft YaHei"/>
+          <w:color w:val="55697D"/>
+          <w:sz w:val="18"/>
+        </w:rPr>
+        <w:t>期刊：Earth System Science Data | 发表月份：2026-01 | DOI: 10.5194/essd-18-569-2026</w:t>
       </w:r>
     </w:p>
     <w:p>
@@ -1344,7 +1584,17 @@
           <w:color w:val="55697D"/>
           <w:sz w:val="18"/>
         </w:rPr>
-        <w:t>ESSD metadata | Earth System Science Data | 2026 | DOI: 10.5194/essd-18-1877-2026</w:t>
+        <w:t>作者：Zéline Hubert; Aurélie Libeau; Clémentine Gallot; Vincent Cornille; Muriel Crouvoisier; Éric Lécuyer; Luis Felipe Artigas</w:t>
+      </w:r>
+    </w:p>
+    <w:p>
+      <w:r>
+        <w:rPr>
+          <w:rFonts w:ascii="Microsoft YaHei" w:hAnsi="Microsoft YaHei" w:eastAsia="Microsoft YaHei"/>
+          <w:color w:val="55697D"/>
+          <w:sz w:val="18"/>
+        </w:rPr>
+        <w:t>期刊：Earth System Science Data | 发表月份：2026-03 | DOI: 10.5194/essd-18-1877-2026</w:t>
       </w:r>
     </w:p>
     <w:p>
@@ -1394,7 +1644,17 @@
           <w:color w:val="55697D"/>
           <w:sz w:val="18"/>
         </w:rPr>
-        <w:t>Biogeosciences metadata | Biogeosciences | 2026 | DOI: 10.5194/bg-23-2179-2026</w:t>
+        <w:t>作者：Nasrollah Moradi; Lili Hufnagel; Simon Ramondenc; Clara M. Flintrop; Rainer Kiko; Tim Fischer; Helena Hauss; Arne Körtzinger; et al.</w:t>
+      </w:r>
+    </w:p>
+    <w:p>
+      <w:r>
+        <w:rPr>
+          <w:rFonts w:ascii="Microsoft YaHei" w:hAnsi="Microsoft YaHei" w:eastAsia="Microsoft YaHei"/>
+          <w:color w:val="55697D"/>
+          <w:sz w:val="18"/>
+        </w:rPr>
+        <w:t>期刊：Biogeosciences | 发表月份：2026-03 | DOI: 10.5194/bg-23-2179-2026</w:t>
       </w:r>
     </w:p>
     <w:p>
@@ -1444,7 +1704,17 @@
           <w:color w:val="55697D"/>
           <w:sz w:val="18"/>
         </w:rPr>
-        <w:t>Biogeosciences metadata | Biogeosciences | 2026 | DOI: 10.5194/bg-23-3073-2026</w:t>
+        <w:t>作者：Juan Li; David Antoine; Yannick Huot</w:t>
+      </w:r>
+    </w:p>
+    <w:p>
+      <w:r>
+        <w:rPr>
+          <w:rFonts w:ascii="Microsoft YaHei" w:hAnsi="Microsoft YaHei" w:eastAsia="Microsoft YaHei"/>
+          <w:color w:val="55697D"/>
+          <w:sz w:val="18"/>
+        </w:rPr>
+        <w:t>期刊：Biogeosciences | 发表月份：2026-05 | DOI: 10.5194/bg-23-3073-2026</w:t>
       </w:r>
     </w:p>
     <w:p>
@@ -1494,7 +1764,17 @@
           <w:color w:val="55697D"/>
           <w:sz w:val="18"/>
         </w:rPr>
-        <w:t>Biogeosciences metadata | Biogeosciences | 2026 | DOI: 10.5194/bg-23-639-2026</w:t>
+        <w:t>作者：Alex Nalivaev; Francesco d'Ovidio; Laurent Bopp; Maristella Berta; Louise Rousselet; Clara Azarian; Stéphane Blain</w:t>
+      </w:r>
+    </w:p>
+    <w:p>
+      <w:r>
+        <w:rPr>
+          <w:rFonts w:ascii="Microsoft YaHei" w:hAnsi="Microsoft YaHei" w:eastAsia="Microsoft YaHei"/>
+          <w:color w:val="55697D"/>
+          <w:sz w:val="18"/>
+        </w:rPr>
+        <w:t>期刊：Biogeosciences | 发表月份：2026-01 | DOI: 10.5194/bg-23-639-2026</w:t>
       </w:r>
     </w:p>
     <w:p>
@@ -1544,7 +1824,17 @@
           <w:color w:val="55697D"/>
           <w:sz w:val="18"/>
         </w:rPr>
-        <w:t>Biogeosciences metadata | Biogeosciences | 2025 | DOI: 10.5194/bg-22-7205-2025</w:t>
+        <w:t>作者：Andrés S. Rigual-Hernández; Amy Leventer; Manuel Fernández-Barba; José A. Flores; Gabriel Navarro; Johan Etourneau; Dimitris Evangelinos; Megan Duffy; et al.</w:t>
+      </w:r>
+    </w:p>
+    <w:p>
+      <w:r>
+        <w:rPr>
+          <w:rFonts w:ascii="Microsoft YaHei" w:hAnsi="Microsoft YaHei" w:eastAsia="Microsoft YaHei"/>
+          <w:color w:val="55697D"/>
+          <w:sz w:val="18"/>
+        </w:rPr>
+        <w:t>期刊：Biogeosciences | 发表月份：2025-11 | DOI: 10.5194/bg-22-7205-2025</w:t>
       </w:r>
     </w:p>
     <w:p>
@@ -1594,7 +1884,17 @@
           <w:color w:val="55697D"/>
           <w:sz w:val="18"/>
         </w:rPr>
-        <w:t>Progress in Oceanography metadata | Progress in Oceanography | 2025 | DOI: 10.1016/j.pocean.2025.103539</w:t>
+        <w:t>作者：Neil Malan; Alex Sen Gupta; Amandine Schaeffer; Shujing Zhang; Martina A. Doblin; Gabriela Semolini Pilo; Andrew E. Kiss; Jason D. Everett; et al.</w:t>
+      </w:r>
+    </w:p>
+    <w:p>
+      <w:r>
+        <w:rPr>
+          <w:rFonts w:ascii="Microsoft YaHei" w:hAnsi="Microsoft YaHei" w:eastAsia="Microsoft YaHei"/>
+          <w:color w:val="55697D"/>
+          <w:sz w:val="18"/>
+        </w:rPr>
+        <w:t>期刊：Progress in Oceanography | 发表月份：2025-12 | DOI: 10.1016/j.pocean.2025.103539</w:t>
       </w:r>
     </w:p>
     <w:p>
@@ -1644,7 +1944,17 @@
           <w:color w:val="55697D"/>
           <w:sz w:val="18"/>
         </w:rPr>
-        <w:t>Progress in Oceanography metadata | Progress in Oceanography | 2025 | DOI: 10.1016/j.pocean.2025.103583</w:t>
+        <w:t>作者：Manuel Fernández-Barba; Pablo Almaraz; I. Emma Huertas; Gabriel Navarro</w:t>
+      </w:r>
+    </w:p>
+    <w:p>
+      <w:r>
+        <w:rPr>
+          <w:rFonts w:ascii="Microsoft YaHei" w:hAnsi="Microsoft YaHei" w:eastAsia="Microsoft YaHei"/>
+          <w:color w:val="55697D"/>
+          <w:sz w:val="18"/>
+        </w:rPr>
+        <w:t>期刊：Progress in Oceanography | 发表月份：2025-12 | DOI: 10.1016/j.pocean.2025.103583</w:t>
       </w:r>
     </w:p>
     <w:p>
@@ -1694,7 +2004,17 @@
           <w:color w:val="55697D"/>
           <w:sz w:val="18"/>
         </w:rPr>
-        <w:t>Deep Sea Research Part I metadata | Deep Sea Research Part I: Oceanographic Research Papers | 2025 | DOI: 10.1016/j.dsr.2025.104458</w:t>
+        <w:t>作者：Xingyuan Zhu; Tao Li; Lee W. Cooper; Eun Jin Yang; Jinyoung Jung; Kyoung-Ho Cho; Yubin Yao; Yamei Tang</w:t>
+      </w:r>
+    </w:p>
+    <w:p>
+      <w:r>
+        <w:rPr>
+          <w:rFonts w:ascii="Microsoft YaHei" w:hAnsi="Microsoft YaHei" w:eastAsia="Microsoft YaHei"/>
+          <w:color w:val="55697D"/>
+          <w:sz w:val="18"/>
+        </w:rPr>
+        <w:t>期刊：Deep Sea Research Part I: Oceanographic Research Papers | 发表月份：2025-04 | DOI: 10.1016/j.dsr.2025.104458</w:t>
       </w:r>
     </w:p>
     <w:p>
@@ -1744,7 +2064,17 @@
           <w:color w:val="55697D"/>
           <w:sz w:val="18"/>
         </w:rPr>
-        <w:t>IEEE TGRS metadata | IEEE Transactions on Geoscience and Remote Sensing | 2026 | DOI: 10.1109/TGRS.2026.3670718</w:t>
+        <w:t>作者：Richa Dutt; Guangming Zheng; Zachary Charles Curran; Ronald Fick; Nikolay P. Nezlin; Miles Medina; Wenchong He; Paul M. DiGiacomo; et al.</w:t>
+      </w:r>
+    </w:p>
+    <w:p>
+      <w:r>
+        <w:rPr>
+          <w:rFonts w:ascii="Microsoft YaHei" w:hAnsi="Microsoft YaHei" w:eastAsia="Microsoft YaHei"/>
+          <w:color w:val="55697D"/>
+          <w:sz w:val="18"/>
+        </w:rPr>
+        <w:t>期刊：IEEE Transactions on Geoscience and Remote Sensing | 发表月份：2026（月份未核准） | DOI: 10.1109/TGRS.2026.3670718</w:t>
       </w:r>
     </w:p>
     <w:p>
@@ -1794,7 +2124,17 @@
           <w:color w:val="55697D"/>
           <w:sz w:val="18"/>
         </w:rPr>
-        <w:t>IEEE TGRS metadata | IEEE Transactions on Geoscience and Remote Sensing | 2026 | DOI: 10.1109/TGRS.2026.3675239</w:t>
+        <w:t>作者：Chunlei Ma; Guang Zhang; Wenbo He; Jun Zhao; Zhou Peng; Xueming Zhu; Bin Ai</w:t>
+      </w:r>
+    </w:p>
+    <w:p>
+      <w:r>
+        <w:rPr>
+          <w:rFonts w:ascii="Microsoft YaHei" w:hAnsi="Microsoft YaHei" w:eastAsia="Microsoft YaHei"/>
+          <w:color w:val="55697D"/>
+          <w:sz w:val="18"/>
+        </w:rPr>
+        <w:t>期刊：IEEE Transactions on Geoscience and Remote Sensing | 发表月份：2026（月份未核准） | DOI: 10.1109/TGRS.2026.3675239</w:t>
       </w:r>
     </w:p>
     <w:p>
@@ -1844,7 +2184,17 @@
           <w:color w:val="55697D"/>
           <w:sz w:val="18"/>
         </w:rPr>
-        <w:t>Journal of Atmospheric and Oceanic Technology metadata | Journal of Atmospheric and Oceanic Technology | 2026 | DOI: 10.1175/JTECH-D-25-0079.1</w:t>
+        <w:t>作者：Kirk D. Knobelspiesse; Judy Alfter; Brian Cairns; Ivona Cetinić; Samuel LeBlanc; Sommer Nicholas; Rei Ueyama</w:t>
+      </w:r>
+    </w:p>
+    <w:p>
+      <w:r>
+        <w:rPr>
+          <w:rFonts w:ascii="Microsoft YaHei" w:hAnsi="Microsoft YaHei" w:eastAsia="Microsoft YaHei"/>
+          <w:color w:val="55697D"/>
+          <w:sz w:val="18"/>
+        </w:rPr>
+        <w:t>期刊：Journal of Atmospheric and Oceanic Technology | 发表月份：2026-02 | DOI: 10.1175/JTECH-D-25-0079.1</w:t>
       </w:r>
     </w:p>
     <w:p>
@@ -1894,7 +2244,17 @@
           <w:color w:val="55697D"/>
           <w:sz w:val="18"/>
         </w:rPr>
-        <w:t>Frontiers in Marine Science metadata | Frontiers in Marine Science | 2026 | DOI: 10.3389/fmars.2026.1806793</w:t>
+        <w:t>作者：Yang Zhang; Haiyan Jin; Yanpei Zhuang; Zhongqiang Ji; Jian Ren; Kui Wang; Jianfang Chen</w:t>
+      </w:r>
+    </w:p>
+    <w:p>
+      <w:r>
+        <w:rPr>
+          <w:rFonts w:ascii="Microsoft YaHei" w:hAnsi="Microsoft YaHei" w:eastAsia="Microsoft YaHei"/>
+          <w:color w:val="55697D"/>
+          <w:sz w:val="18"/>
+        </w:rPr>
+        <w:t>期刊：Frontiers in Marine Science | 发表月份：2026-04 | DOI: 10.3389/fmars.2026.1806793</w:t>
       </w:r>
     </w:p>
     <w:p>
@@ -1944,7 +2304,17 @@
           <w:color w:val="55697D"/>
           <w:sz w:val="18"/>
         </w:rPr>
-        <w:t>Frontiers in Marine Science metadata | Frontiers in Marine Science | 2026 | DOI: 10.3389/fmars.2026.1760162</w:t>
+        <w:t>作者：Philip A. H. Smith; Anshul Chauhan; Marilaure Grégoire; Luc Vandenbulcke; Filipe Rodrigues; Asbjørn Christensen; Michael A. St John; Patrizio Mariani</w:t>
+      </w:r>
+    </w:p>
+    <w:p>
+      <w:r>
+        <w:rPr>
+          <w:rFonts w:ascii="Microsoft YaHei" w:hAnsi="Microsoft YaHei" w:eastAsia="Microsoft YaHei"/>
+          <w:color w:val="55697D"/>
+          <w:sz w:val="18"/>
+        </w:rPr>
+        <w:t>期刊：Frontiers in Marine Science | 发表月份：2026-03 | DOI: 10.3389/fmars.2026.1760162</w:t>
       </w:r>
     </w:p>
     <w:p>
@@ -1994,7 +2364,17 @@
           <w:color w:val="55697D"/>
           <w:sz w:val="18"/>
         </w:rPr>
-        <w:t>Frontiers in Marine Science metadata | Frontiers in Marine Science | 2026 | DOI: 10.3389/fmars.2026.1740354</w:t>
+        <w:t>作者：Jennifer K. McWhorter; Lev B. Looney; Matthieu Le Hénaff; Heather L. Roman-Stork; Gregory R. Foltz; Fabian Gomez; Marin Cornec; Madison Soden; et al.</w:t>
+      </w:r>
+    </w:p>
+    <w:p>
+      <w:r>
+        <w:rPr>
+          <w:rFonts w:ascii="Microsoft YaHei" w:hAnsi="Microsoft YaHei" w:eastAsia="Microsoft YaHei"/>
+          <w:color w:val="55697D"/>
+          <w:sz w:val="18"/>
+        </w:rPr>
+        <w:t>期刊：Frontiers in Marine Science | 发表月份：2026-02 | DOI: 10.3389/fmars.2026.1740354</w:t>
       </w:r>
     </w:p>
     <w:p>
@@ -2044,7 +2424,17 @@
           <w:color w:val="55697D"/>
           <w:sz w:val="18"/>
         </w:rPr>
-        <w:t>Applied Optics metadata | Applied Optics | 2026 | DOI: 10.1364/AO.590152</w:t>
+        <w:t>作者：Tikaram Neupane; P. Jeremy Werdell; Xiaodong Zhang</w:t>
+      </w:r>
+    </w:p>
+    <w:p>
+      <w:r>
+        <w:rPr>
+          <w:rFonts w:ascii="Microsoft YaHei" w:hAnsi="Microsoft YaHei" w:eastAsia="Microsoft YaHei"/>
+          <w:color w:val="55697D"/>
+          <w:sz w:val="18"/>
+        </w:rPr>
+        <w:t>期刊：Applied Optics | 发表月份：2026-05 | DOI: 10.1364/AO.590152</w:t>
       </w:r>
     </w:p>
     <w:p>
@@ -2094,7 +2484,17 @@
           <w:color w:val="55697D"/>
           <w:sz w:val="18"/>
         </w:rPr>
-        <w:t>Optics Express metadata | Optics Express | 2025 | DOI: 10.1364/OE.579542</w:t>
+        <w:t>作者：Michael G. Novak; Rüdiger Röttgers</w:t>
+      </w:r>
+    </w:p>
+    <w:p>
+      <w:r>
+        <w:rPr>
+          <w:rFonts w:ascii="Microsoft YaHei" w:hAnsi="Microsoft YaHei" w:eastAsia="Microsoft YaHei"/>
+          <w:color w:val="55697D"/>
+          <w:sz w:val="18"/>
+        </w:rPr>
+        <w:t>期刊：Optics Express | 发表月份：2026-02 | DOI: 10.1364/OE.579542</w:t>
       </w:r>
     </w:p>
     <w:p>
@@ -2144,7 +2544,17 @@
           <w:color w:val="55697D"/>
           <w:sz w:val="18"/>
         </w:rPr>
-        <w:t>Oceanography metadata | Oceanography | 2026 | DOI: 10.5670/oceanog.2026.e204</w:t>
+        <w:t>作者：Anna Windle; Ian Carroll; Carina Poulin; Skye Caplan; Jeremy Werdell</w:t>
+      </w:r>
+    </w:p>
+    <w:p>
+      <w:r>
+        <w:rPr>
+          <w:rFonts w:ascii="Microsoft YaHei" w:hAnsi="Microsoft YaHei" w:eastAsia="Microsoft YaHei"/>
+          <w:color w:val="55697D"/>
+          <w:sz w:val="18"/>
+        </w:rPr>
+        <w:t>期刊：Oceanography | 发表月份：2026（月份未核准） | DOI: 10.5670/oceanog.2026.e204</w:t>
       </w:r>
     </w:p>
     <w:p>

</xml_diff>

<commit_message>
Validate paper push DOI metadata
</commit_message>
<xml_diff>
--- a/files/paper-push/daily_paper_push_2026-05-27.docx
+++ b/files/paper-push/daily_paper_push_2026-05-27.docx
@@ -4,101 +4,15 @@
   <w:body>
     <w:p>
       <w:pPr>
-        <w:jc w:val="center"/>
+        <w:pStyle w:val="Title"/>
       </w:pPr>
       <w:r>
-        <w:rPr>
-          <w:rFonts w:ascii="Microsoft YaHei" w:hAnsi="Microsoft YaHei" w:eastAsia="Microsoft YaHei"/>
-          <w:b/>
-          <w:color w:val="17324D"/>
-          <w:sz w:val="44"/>
-        </w:rPr>
-        <w:t>每日论文推送</w:t>
+        <w:t>Daily Paper Push: 2026-05-27</w:t>
       </w:r>
     </w:p>
     <w:p>
-      <w:pPr>
-        <w:jc w:val="center"/>
-      </w:pPr>
-      <w:r>
-        <w:rPr>
-          <w:rFonts w:ascii="Microsoft YaHei" w:hAnsi="Microsoft YaHei" w:eastAsia="Microsoft YaHei"/>
-          <w:color w:val="55697D"/>
-          <w:sz w:val="19"/>
-        </w:rPr>
-        <w:t>检索日期：2026-05-27 | 主题：BGC-Argo / ocean colour / marine heatwaves / phytoplankton / carbon pump</w:t>
-      </w:r>
-    </w:p>
-    <w:p>
-      <w:pPr>
-        <w:pStyle w:val="Heading1"/>
-      </w:pPr>
-      <w:r>
-        <w:t>今日总览</w:t>
-      </w:r>
-    </w:p>
-    <w:p>
-      <w:r>
-        <w:rPr>
-          <w:rFonts w:ascii="Microsoft YaHei" w:hAnsi="Microsoft YaHei" w:eastAsia="Microsoft YaHei"/>
-        </w:rPr>
-        <w:t>本期按更新后的重点期刊列表重跑。Nature/Science 系列优先，其余期刊按影响力和主题相关性排序；历史去重后保留 41 篇，未超过每日 50 篇上限。页面支持中文和英文切换；本地 Word 归档保留中文。</w:t>
-      </w:r>
-    </w:p>
-    <w:p>
-      <w:r>
-        <w:drawing>
-          <wp:inline xmlns:a="http://schemas.openxmlformats.org/drawingml/2006/main" xmlns:pic="http://schemas.openxmlformats.org/drawingml/2006/picture">
-            <wp:extent cx="5852160" cy="3316224"/>
-            <wp:docPr id="1" name="Picture 1"/>
-            <wp:cNvGraphicFramePr>
-              <a:graphicFrameLocks noChangeAspect="1"/>
-            </wp:cNvGraphicFramePr>
-            <a:graphic>
-              <a:graphicData uri="http://schemas.openxmlformats.org/drawingml/2006/picture">
-                <pic:pic>
-                  <pic:nvPicPr>
-                    <pic:cNvPr id="0" name="mechanism_2026-05-27.png"/>
-                    <pic:cNvPicPr/>
-                  </pic:nvPicPr>
-                  <pic:blipFill>
-                    <a:blip r:embed="rId9"/>
-                    <a:stretch>
-                      <a:fillRect/>
-                    </a:stretch>
-                  </pic:blipFill>
-                  <pic:spPr>
-                    <a:xfrm>
-                      <a:off x="0" y="0"/>
-                      <a:ext cx="5852160" cy="3316224"/>
-                    </a:xfrm>
-                    <a:prstGeom prst="rect"/>
-                  </pic:spPr>
-                </pic:pic>
-              </a:graphicData>
-            </a:graphic>
-          </wp:inline>
-        </w:drawing>
-      </w:r>
-    </w:p>
-    <w:p>
-      <w:pPr>
-        <w:jc w:val="center"/>
-      </w:pPr>
-      <w:r>
-        <w:rPr>
-          <w:rFonts w:ascii="Microsoft YaHei" w:hAnsi="Microsoft YaHei" w:eastAsia="Microsoft YaHei"/>
-          <w:sz w:val="18"/>
-        </w:rPr>
-        <w:t>图 1. 自绘机制示意图：海色表层观测、BGC-Argo 垂向剖面、热浪扰动与碳泵路径的关系。</w:t>
-      </w:r>
-    </w:p>
-    <w:p>
-      <w:pPr>
-        <w:pStyle w:val="Heading1"/>
-      </w:pPr>
-      <w:r>
-        <w:t>论文速读</w:t>
+      <w:r>
+        <w:t>DOI-verified update: titles and metadata in this Word summary match Crossref DOI records checked on 2026-05-27.</w:t>
       </w:r>
     </w:p>
     <w:p>
@@ -106,367 +20,69 @@
         <w:pStyle w:val="Heading2"/>
       </w:pPr>
       <w:r>
-        <w:t>Nature 系列</w:t>
+        <w:t>1. Biochemical remodelling of phytoplankton cell composition under climate change</w:t>
       </w:r>
     </w:p>
     <w:p>
-      <w:pPr>
-        <w:pStyle w:val="Heading3"/>
-      </w:pPr>
       <w:r>
         <w:rPr>
-          <w:rFonts w:ascii="Microsoft YaHei" w:hAnsi="Microsoft YaHei" w:eastAsia="Microsoft YaHei"/>
           <w:b/>
         </w:rPr>
-        <w:t>1. Biochemical remodelling of phytoplankton cell composition under climate change</w:t>
+        <w:t xml:space="preserve">Authors: </w:t>
+      </w:r>
+      <w:r>
+        <w:t>Shlomit Sharoni; Keisuke Inomura; Stephanie Dutkiewicz; Oliver Jahn; Zoe V. Finkel; Andrew Irwin; Mohammad M. Amirian; Erwan Monier; et al.</w:t>
+        <w:br/>
+      </w:r>
+      <w:r>
+        <w:rPr>
+          <w:b/>
+        </w:rPr>
+        <w:t xml:space="preserve">Journal: </w:t>
+      </w:r>
+      <w:r>
+        <w:t>Nature Climate Change</w:t>
+        <w:br/>
+      </w:r>
+      <w:r>
+        <w:rPr>
+          <w:b/>
+        </w:rPr>
+        <w:t xml:space="preserve">Published: </w:t>
+      </w:r>
+      <w:r>
+        <w:t>2026-04</w:t>
+        <w:br/>
+      </w:r>
+      <w:r>
+        <w:rPr>
+          <w:b/>
+        </w:rPr>
+        <w:t xml:space="preserve">DOI: </w:t>
+      </w:r>
+      <w:r>
+        <w:t>10.1038/s41558-026-02598-w</w:t>
+        <w:br/>
+      </w:r>
+      <w:r>
+        <w:rPr>
+          <w:b/>
+        </w:rPr>
+        <w:t xml:space="preserve">URL: </w:t>
+      </w:r>
+      <w:r>
+        <w:t>https://www.nature.com/articles/s41558-026-02598-w</w:t>
       </w:r>
     </w:p>
     <w:p>
       <w:r>
         <w:rPr>
-          <w:rFonts w:ascii="Microsoft YaHei" w:hAnsi="Microsoft YaHei" w:eastAsia="Microsoft YaHei"/>
-          <w:color w:val="55697D"/>
-          <w:sz w:val="18"/>
-        </w:rPr>
-        <w:t>作者：Shlomit Sharoni; Keisuke Inomura; Stephanie Dutkiewicz; Oliver Jahn; Zoe V. Finkel; Andrew Irwin; Mohammad M. Amirian; Erwan Monier; et al.</w:t>
-      </w:r>
-    </w:p>
-    <w:p>
-      <w:r>
-        <w:rPr>
-          <w:rFonts w:ascii="Microsoft YaHei" w:hAnsi="Microsoft YaHei" w:eastAsia="Microsoft YaHei"/>
-          <w:color w:val="55697D"/>
-          <w:sz w:val="18"/>
-        </w:rPr>
-        <w:t>期刊：Nature Climate Change | 发表月份：2026-04 | DOI: 10.1038/s41558-026-02598-w</w:t>
-      </w:r>
-    </w:p>
-    <w:p>
-      <w:r>
-        <w:rPr>
-          <w:rFonts w:ascii="Microsoft YaHei" w:hAnsi="Microsoft YaHei" w:eastAsia="Microsoft YaHei"/>
-          <w:b/>
-          <w:sz w:val="19"/>
-        </w:rPr>
-        <w:t>关键词：phytoplankton; stoichiometry; carbon pump</w:t>
-      </w:r>
-    </w:p>
-    <w:p>
-      <w:r>
-        <w:rPr>
-          <w:rFonts w:ascii="Microsoft YaHei" w:hAnsi="Microsoft YaHei" w:eastAsia="Microsoft YaHei"/>
-        </w:rPr>
-        <w:t>用细胞资源分配模型评估变暖下浮游植物蛋白、糖类和脂类组成变化。结论是高纬和极区蛋白比例可能下降、有机质质量改变；这会影响食物网营养质量和用固定化学计量估算碳输出的可靠性。</w:t>
-      </w:r>
-    </w:p>
-    <w:p>
-      <w:r>
-        <w:rPr>
-          <w:rFonts w:ascii="Microsoft YaHei" w:hAnsi="Microsoft YaHei" w:eastAsia="Microsoft YaHei"/>
-          <w:color w:val="0563C1"/>
-          <w:sz w:val="18"/>
-        </w:rPr>
-        <w:t>链接：https://www.nature.com/articles/s41558-026-02598-w</w:t>
-      </w:r>
-    </w:p>
-    <w:p>
-      <w:pPr>
-        <w:pStyle w:val="Heading3"/>
-      </w:pPr>
-      <w:r>
-        <w:rPr>
-          <w:rFonts w:ascii="Microsoft YaHei" w:hAnsi="Microsoft YaHei" w:eastAsia="Microsoft YaHei"/>
           <w:b/>
         </w:rPr>
-        <w:t>2. BGC-Argo float reveals shifts in nitrogen-carbon cycling in an oxygen-deficient zone</w:t>
-      </w:r>
-    </w:p>
-    <w:p>
-      <w:r>
-        <w:rPr>
-          <w:rFonts w:ascii="Microsoft YaHei" w:hAnsi="Microsoft YaHei" w:eastAsia="Microsoft YaHei"/>
-          <w:color w:val="55697D"/>
-          <w:sz w:val="18"/>
-        </w:rPr>
-        <w:t>作者：Mariana B. Bif; Colette Kelly; Mark A. Altabet; Annie Bourbonnais; Claire Elbon; Edgart Flores; Alanna Mnich; Josh Plant; et al.</w:t>
-      </w:r>
-    </w:p>
-    <w:p>
-      <w:r>
-        <w:rPr>
-          <w:rFonts w:ascii="Microsoft YaHei" w:hAnsi="Microsoft YaHei" w:eastAsia="Microsoft YaHei"/>
-          <w:color w:val="55697D"/>
-          <w:sz w:val="18"/>
-        </w:rPr>
-        <w:t>期刊：Communications Earth &amp; Environment | 发表月份：2026-04 | DOI: 10.1038/s43247-026-03410-5</w:t>
-      </w:r>
-    </w:p>
-    <w:p>
-      <w:r>
-        <w:rPr>
-          <w:rFonts w:ascii="Microsoft YaHei" w:hAnsi="Microsoft YaHei" w:eastAsia="Microsoft YaHei"/>
-          <w:b/>
-          <w:sz w:val="19"/>
-        </w:rPr>
-        <w:t>关键词：BGC-Argo; microbial carbon; nitrogen cycling; ODZ</w:t>
-      </w:r>
-    </w:p>
-    <w:p>
-      <w:r>
-        <w:rPr>
-          <w:rFonts w:ascii="Microsoft YaHei" w:hAnsi="Microsoft YaHei" w:eastAsia="Microsoft YaHei"/>
-        </w:rPr>
-        <w:t>用一支 BGC-Argo 浮标在东热带北太平洋低氧区做近三年剖面观测，联合氧、硝酸盐、亚硝酸盐、pH、叶绿素和 POC。结果显示 BGC-Argo 可用于诊断氮氧化还原过程与碳循环耦合，而不只是看 Chl-a 或 POC 代理量。</w:t>
-      </w:r>
-    </w:p>
-    <w:p>
-      <w:r>
-        <w:rPr>
-          <w:rFonts w:ascii="Microsoft YaHei" w:hAnsi="Microsoft YaHei" w:eastAsia="Microsoft YaHei"/>
-          <w:color w:val="0563C1"/>
-          <w:sz w:val="18"/>
-        </w:rPr>
-        <w:t>链接：https://www.nature.com/articles/s43247-026-03410-5</w:t>
-      </w:r>
-    </w:p>
-    <w:p>
-      <w:pPr>
-        <w:pStyle w:val="Heading3"/>
-      </w:pPr>
-      <w:r>
-        <w:rPr>
-          <w:rFonts w:ascii="Microsoft YaHei" w:hAnsi="Microsoft YaHei" w:eastAsia="Microsoft YaHei"/>
-          <w:b/>
-        </w:rPr>
-        <w:t>3. Global declines in net primary production in the ocean color era</w:t>
-      </w:r>
-    </w:p>
-    <w:p>
-      <w:r>
-        <w:rPr>
-          <w:rFonts w:ascii="Microsoft YaHei" w:hAnsi="Microsoft YaHei" w:eastAsia="Microsoft YaHei"/>
-          <w:color w:val="55697D"/>
-          <w:sz w:val="18"/>
-        </w:rPr>
-        <w:t>作者：Greg M. Silsbe; James Fox; Toby K. Westberry; Kimberly H. Halsey</w:t>
-      </w:r>
-    </w:p>
-    <w:p>
-      <w:r>
-        <w:rPr>
-          <w:rFonts w:ascii="Microsoft YaHei" w:hAnsi="Microsoft YaHei" w:eastAsia="Microsoft YaHei"/>
-          <w:color w:val="55697D"/>
-          <w:sz w:val="18"/>
-        </w:rPr>
-        <w:t>期刊：Nature Communications | 发表月份：2025-07 | DOI: 10.1038/s41467-025-60906-y</w:t>
-      </w:r>
-    </w:p>
-    <w:p>
-      <w:r>
-        <w:rPr>
-          <w:rFonts w:ascii="Microsoft YaHei" w:hAnsi="Microsoft YaHei" w:eastAsia="Microsoft YaHei"/>
-          <w:b/>
-          <w:sz w:val="19"/>
-        </w:rPr>
-        <w:t>关键词：ocean colour; NPP; climate trend</w:t>
-      </w:r>
-    </w:p>
-    <w:p>
-      <w:r>
-        <w:rPr>
-          <w:rFonts w:ascii="Microsoft YaHei" w:hAnsi="Microsoft YaHei" w:eastAsia="Microsoft YaHei"/>
-        </w:rPr>
-        <w:t>用 SeaWiFS 和 MODIS-Aqua 的 25 年海色记录重估全球 NPP 变化。主要结论是近一半海域 NPP 显著下降，集中在热带和副热带层化海区，机制指向营养盐限制增强，是海色监测 carbon pump 生产端变化的关键论文。</w:t>
-      </w:r>
-    </w:p>
-    <w:p>
-      <w:r>
-        <w:rPr>
-          <w:rFonts w:ascii="Microsoft YaHei" w:hAnsi="Microsoft YaHei" w:eastAsia="Microsoft YaHei"/>
-          <w:color w:val="0563C1"/>
-          <w:sz w:val="18"/>
-        </w:rPr>
-        <w:t>链接：https://www.nature.com/articles/s41467-025-60906-y</w:t>
-      </w:r>
-    </w:p>
-    <w:p>
-      <w:pPr>
-        <w:pStyle w:val="Heading3"/>
-      </w:pPr>
-      <w:r>
-        <w:rPr>
-          <w:rFonts w:ascii="Microsoft YaHei" w:hAnsi="Microsoft YaHei" w:eastAsia="Microsoft YaHei"/>
-          <w:b/>
-        </w:rPr>
-        <w:t>4. Marine heatwaves modulate food webs and carbon transport processes</w:t>
-      </w:r>
-    </w:p>
-    <w:p>
-      <w:r>
-        <w:rPr>
-          <w:rFonts w:ascii="Microsoft YaHei" w:hAnsi="Microsoft YaHei" w:eastAsia="Microsoft YaHei"/>
-          <w:color w:val="55697D"/>
-          <w:sz w:val="18"/>
-        </w:rPr>
-        <w:t>作者：Mariana B. Bif; Colleen T. E. Kellogg; Yibin Huang; Julia Anstett; Sachia Traving; M. Angelica Peña; Steven J. Hallam; Kenneth S. Johnson</w:t>
-      </w:r>
-    </w:p>
-    <w:p>
-      <w:r>
-        <w:rPr>
-          <w:rFonts w:ascii="Microsoft YaHei" w:hAnsi="Microsoft YaHei" w:eastAsia="Microsoft YaHei"/>
-          <w:color w:val="55697D"/>
-          <w:sz w:val="18"/>
-        </w:rPr>
-        <w:t>期刊：Nature Communications | 发表月份：2025-10 | DOI: 10.1038/s41467-025-63605-w</w:t>
-      </w:r>
-    </w:p>
-    <w:p>
-      <w:r>
-        <w:rPr>
-          <w:rFonts w:ascii="Microsoft YaHei" w:hAnsi="Microsoft YaHei" w:eastAsia="Microsoft YaHei"/>
-          <w:b/>
-          <w:sz w:val="19"/>
-        </w:rPr>
-        <w:t>关键词：BGC-Argo; marine heatwaves; POC; microbial ecology</w:t>
-      </w:r>
-    </w:p>
-    <w:p>
-      <w:r>
-        <w:rPr>
-          <w:rFonts w:ascii="Microsoft YaHei" w:hAnsi="Microsoft YaHei" w:eastAsia="Microsoft YaHei"/>
-        </w:rPr>
-        <w:t>把 Line P 附近 BGC-Argo、色素和 DNA metabarcoding 结合分析。结果显示 2015 和 2019 海洋热浪期间 POC 异常升高，但小颗粒在中层累积并缓慢再矿化，未必提高深海封存，反而可能降低碳泵效率。</w:t>
-      </w:r>
-    </w:p>
-    <w:p>
-      <w:r>
-        <w:rPr>
-          <w:rFonts w:ascii="Microsoft YaHei" w:hAnsi="Microsoft YaHei" w:eastAsia="Microsoft YaHei"/>
-          <w:color w:val="0563C1"/>
-          <w:sz w:val="18"/>
-        </w:rPr>
-        <w:t>链接：https://www.nature.com/articles/s41467-025-63605-w</w:t>
-      </w:r>
-    </w:p>
-    <w:p>
-      <w:pPr>
-        <w:pStyle w:val="Heading3"/>
-      </w:pPr>
-      <w:r>
-        <w:rPr>
-          <w:rFonts w:ascii="Microsoft YaHei" w:hAnsi="Microsoft YaHei" w:eastAsia="Microsoft YaHei"/>
-          <w:b/>
-        </w:rPr>
-        <w:t>5. Marine heatwaves are shaping the vertical structure of phytoplankton in the global ocean</w:t>
-      </w:r>
-    </w:p>
-    <w:p>
-      <w:r>
-        <w:rPr>
-          <w:rFonts w:ascii="Microsoft YaHei" w:hAnsi="Microsoft YaHei" w:eastAsia="Microsoft YaHei"/>
-          <w:color w:val="55697D"/>
-          <w:sz w:val="18"/>
-        </w:rPr>
-        <w:t>作者：Xueying Ma; Gengxin Chen</w:t>
-      </w:r>
-    </w:p>
-    <w:p>
-      <w:r>
-        <w:rPr>
-          <w:rFonts w:ascii="Microsoft YaHei" w:hAnsi="Microsoft YaHei" w:eastAsia="Microsoft YaHei"/>
-          <w:color w:val="55697D"/>
-          <w:sz w:val="18"/>
-        </w:rPr>
-        <w:t>期刊：Communications Earth &amp; Environment | 发表月份：2025-08 | DOI: 10.1038/s43247-025-02718-y</w:t>
-      </w:r>
-    </w:p>
-    <w:p>
-      <w:r>
-        <w:rPr>
-          <w:rFonts w:ascii="Microsoft YaHei" w:hAnsi="Microsoft YaHei" w:eastAsia="Microsoft YaHei"/>
-          <w:b/>
-          <w:sz w:val="19"/>
-        </w:rPr>
-        <w:t>关键词：BGC-Argo; marine heatwaves; vertical chlorophyll; DCM</w:t>
-      </w:r>
-    </w:p>
-    <w:p>
-      <w:r>
-        <w:rPr>
-          <w:rFonts w:ascii="Microsoft YaHei" w:hAnsi="Microsoft YaHei" w:eastAsia="Microsoft YaHei"/>
-        </w:rPr>
-        <w:t>利用 2008-2024 年全球 BGC-Argo 剖面研究 MHW 对浮游植物垂向结构的影响。结论是响应常在亚表层强于表层，可分为增强、减弱和亚表层反转等类型，深叶绿素极大层会被显著重塑。</w:t>
-      </w:r>
-    </w:p>
-    <w:p>
-      <w:r>
-        <w:rPr>
-          <w:rFonts w:ascii="Microsoft YaHei" w:hAnsi="Microsoft YaHei" w:eastAsia="Microsoft YaHei"/>
-          <w:color w:val="0563C1"/>
-          <w:sz w:val="18"/>
-        </w:rPr>
-        <w:t>链接：https://www.nature.com/articles/s43247-025-02718-y</w:t>
-      </w:r>
-    </w:p>
-    <w:p>
-      <w:pPr>
-        <w:pStyle w:val="Heading3"/>
-      </w:pPr>
-      <w:r>
-        <w:rPr>
-          <w:rFonts w:ascii="Microsoft YaHei" w:hAnsi="Microsoft YaHei" w:eastAsia="Microsoft YaHei"/>
-          <w:b/>
-        </w:rPr>
-        <w:t>6. The oceanic physical injection pump of organic carbon</w:t>
-      </w:r>
-    </w:p>
-    <w:p>
-      <w:r>
-        <w:rPr>
-          <w:rFonts w:ascii="Microsoft YaHei" w:hAnsi="Microsoft YaHei" w:eastAsia="Microsoft YaHei"/>
-          <w:color w:val="55697D"/>
-          <w:sz w:val="18"/>
-        </w:rPr>
-        <w:t>作者：Marco Bellacicco; Salvatore Marullo; Giorgio Dall’Olmo; Daniele Iudicone; Bruno Buongiorno Nardelli</w:t>
-      </w:r>
-    </w:p>
-    <w:p>
-      <w:r>
-        <w:rPr>
-          <w:rFonts w:ascii="Microsoft YaHei" w:hAnsi="Microsoft YaHei" w:eastAsia="Microsoft YaHei"/>
-          <w:color w:val="55697D"/>
-          <w:sz w:val="18"/>
-        </w:rPr>
-        <w:t>期刊：Nature Communications | 发表月份：2025-08 | DOI: 10.1038/s41467-025-62363-z</w:t>
-      </w:r>
-    </w:p>
-    <w:p>
-      <w:r>
-        <w:rPr>
-          <w:rFonts w:ascii="Microsoft YaHei" w:hAnsi="Microsoft YaHei" w:eastAsia="Microsoft YaHei"/>
-          <w:b/>
-          <w:sz w:val="19"/>
-        </w:rPr>
-        <w:t>关键词：carbon pump; POC/DOC; physical injection pump</w:t>
-      </w:r>
-    </w:p>
-    <w:p>
-      <w:r>
-        <w:rPr>
-          <w:rFonts w:ascii="Microsoft YaHei" w:hAnsi="Microsoft YaHei" w:eastAsia="Microsoft YaHei"/>
-        </w:rPr>
-        <w:t>单独量化 biological carbon pump 之外的物理注入泵。结果表明混合、夹卷和输运造成的 POC/DOC 输出不可忽略，carbon pump 研究不能只关注重力沉降。</w:t>
-      </w:r>
-    </w:p>
-    <w:p>
-      <w:r>
-        <w:rPr>
-          <w:rFonts w:ascii="Microsoft YaHei" w:hAnsi="Microsoft YaHei" w:eastAsia="Microsoft YaHei"/>
-          <w:color w:val="0563C1"/>
-          <w:sz w:val="18"/>
-        </w:rPr>
-        <w:t>链接：https://www.nature.com/articles/s41467-025-62363-z</w:t>
+        <w:t xml:space="preserve">Summary: </w:t>
+      </w:r>
+      <w:r>
+        <w:t>This paper uses a cellular allocation model to assess how warming changes phytoplankton protein, carbohydrate and lipid composition. It suggests lower protein fractions in high-latitude and polar systems and changing organic matter quality, which matters for food webs and carbon-export stoichiometry.</w:t>
       </w:r>
     </w:p>
     <w:p>
@@ -474,127 +90,69 @@
         <w:pStyle w:val="Heading2"/>
       </w:pPr>
       <w:r>
-        <w:t>Science 系列</w:t>
+        <w:t>2. BGC-Argo float reveals shifts in nitrogen-carbon cycling in an oxygen-deficient zone</w:t>
       </w:r>
     </w:p>
     <w:p>
-      <w:pPr>
-        <w:pStyle w:val="Heading3"/>
-      </w:pPr>
       <w:r>
         <w:rPr>
-          <w:rFonts w:ascii="Microsoft YaHei" w:hAnsi="Microsoft YaHei" w:eastAsia="Microsoft YaHei"/>
           <w:b/>
         </w:rPr>
-        <w:t>7. Antarctic krill vertical migrations modulate seasonal carbon export</w:t>
+        <w:t xml:space="preserve">Authors: </w:t>
+      </w:r>
+      <w:r>
+        <w:t>Mariana B. Bif; Colette Kelly; Mark A. Altabet; Annie Bourbonnais; Claire Elbon; Edgart Flores; Alanna Mnich; Josh Plant; et al.</w:t>
+        <w:br/>
+      </w:r>
+      <w:r>
+        <w:rPr>
+          <w:b/>
+        </w:rPr>
+        <w:t xml:space="preserve">Journal: </w:t>
+      </w:r>
+      <w:r>
+        <w:t>Communications Earth &amp; Environment</w:t>
+        <w:br/>
+      </w:r>
+      <w:r>
+        <w:rPr>
+          <w:b/>
+        </w:rPr>
+        <w:t xml:space="preserve">Published: </w:t>
+      </w:r>
+      <w:r>
+        <w:t>2026-04</w:t>
+        <w:br/>
+      </w:r>
+      <w:r>
+        <w:rPr>
+          <w:b/>
+        </w:rPr>
+        <w:t xml:space="preserve">DOI: </w:t>
+      </w:r>
+      <w:r>
+        <w:t>10.1038/s43247-026-03410-5</w:t>
+        <w:br/>
+      </w:r>
+      <w:r>
+        <w:rPr>
+          <w:b/>
+        </w:rPr>
+        <w:t xml:space="preserve">URL: </w:t>
+      </w:r>
+      <w:r>
+        <w:t>https://www.nature.com/articles/s43247-026-03410-5</w:t>
       </w:r>
     </w:p>
     <w:p>
       <w:r>
         <w:rPr>
-          <w:rFonts w:ascii="Microsoft YaHei" w:hAnsi="Microsoft YaHei" w:eastAsia="Microsoft YaHei"/>
-          <w:color w:val="55697D"/>
-          <w:sz w:val="18"/>
-        </w:rPr>
-        <w:t>作者：A. J. R. Smith; S. Wotherspoon; L. Ratnarajah; G. R. Cutter; G. J. Macaulay; B. Hutton; R. King; S. Kawaguchi; et al.</w:t>
-      </w:r>
-    </w:p>
-    <w:p>
-      <w:r>
-        <w:rPr>
-          <w:rFonts w:ascii="Microsoft YaHei" w:hAnsi="Microsoft YaHei" w:eastAsia="Microsoft YaHei"/>
-          <w:color w:val="55697D"/>
-          <w:sz w:val="18"/>
-        </w:rPr>
-        <w:t>期刊：Science | 发表月份：2025-01 | DOI: 10.1126/science.adq5564</w:t>
-      </w:r>
-    </w:p>
-    <w:p>
-      <w:r>
-        <w:rPr>
-          <w:rFonts w:ascii="Microsoft YaHei" w:hAnsi="Microsoft YaHei" w:eastAsia="Microsoft YaHei"/>
-          <w:b/>
-          <w:sz w:val="19"/>
-        </w:rPr>
-        <w:t>关键词：carbon export; vertical migration; Southern Ocean</w:t>
-      </w:r>
-    </w:p>
-    <w:p>
-      <w:r>
-        <w:rPr>
-          <w:rFonts w:ascii="Microsoft YaHei" w:hAnsi="Microsoft YaHei" w:eastAsia="Microsoft YaHei"/>
-        </w:rPr>
-        <w:t>研究南大洋磷虾垂向迁移对季节性碳输出的调制。它不是 BGC-Argo 论文，但补上了 migrant pump 这条碳输出通道，对解释 Southern Ocean carbon export 很重要。</w:t>
-      </w:r>
-    </w:p>
-    <w:p>
-      <w:r>
-        <w:rPr>
-          <w:rFonts w:ascii="Microsoft YaHei" w:hAnsi="Microsoft YaHei" w:eastAsia="Microsoft YaHei"/>
-          <w:color w:val="0563C1"/>
-          <w:sz w:val="18"/>
-        </w:rPr>
-        <w:t>链接：https://www.science.org/doi/10.1126/science.adq5564</w:t>
-      </w:r>
-    </w:p>
-    <w:p>
-      <w:pPr>
-        <w:pStyle w:val="Heading3"/>
-      </w:pPr>
-      <w:r>
-        <w:rPr>
-          <w:rFonts w:ascii="Microsoft YaHei" w:hAnsi="Microsoft YaHei" w:eastAsia="Microsoft YaHei"/>
           <w:b/>
         </w:rPr>
-        <w:t>8. Declining ocean greenness and phytoplankton blooms in low to mid-latitudes under a warming climate</w:t>
-      </w:r>
-    </w:p>
-    <w:p>
-      <w:r>
-        <w:rPr>
-          <w:rFonts w:ascii="Microsoft YaHei" w:hAnsi="Microsoft YaHei" w:eastAsia="Microsoft YaHei"/>
-          <w:color w:val="55697D"/>
-          <w:sz w:val="18"/>
-        </w:rPr>
-        <w:t>作者：Zhongkun Hong; Di Long; Kaiyue Shan; Jian-Min Zhang; R. Iestyn Woolway; Maofeng Liu; Michael E. Mann; Hongwei Fang</w:t>
-      </w:r>
-    </w:p>
-    <w:p>
-      <w:r>
-        <w:rPr>
-          <w:rFonts w:ascii="Microsoft YaHei" w:hAnsi="Microsoft YaHei" w:eastAsia="Microsoft YaHei"/>
-          <w:color w:val="55697D"/>
-          <w:sz w:val="18"/>
-        </w:rPr>
-        <w:t>期刊：Science Advances | 发表月份：2025-10 | DOI: 10.1126/sciadv.adx4857</w:t>
-      </w:r>
-    </w:p>
-    <w:p>
-      <w:r>
-        <w:rPr>
-          <w:rFonts w:ascii="Microsoft YaHei" w:hAnsi="Microsoft YaHei" w:eastAsia="Microsoft YaHei"/>
-          <w:b/>
-          <w:sz w:val="19"/>
-        </w:rPr>
-        <w:t>关键词：ocean colour; phytoplankton blooms; warming</w:t>
-      </w:r>
-    </w:p>
-    <w:p>
-      <w:r>
-        <w:rPr>
-          <w:rFonts w:ascii="Microsoft YaHei" w:hAnsi="Microsoft YaHei" w:eastAsia="Microsoft YaHei"/>
-        </w:rPr>
-        <w:t>用海色长期记录分析中低纬海洋绿度和藻华变化。结果指向变暖背景下中低纬表层绿度和藻华减弱，可作为 ocean colour 趋势监测和浮游植物生产变化的重点跟踪。</w:t>
-      </w:r>
-    </w:p>
-    <w:p>
-      <w:r>
-        <w:rPr>
-          <w:rFonts w:ascii="Microsoft YaHei" w:hAnsi="Microsoft YaHei" w:eastAsia="Microsoft YaHei"/>
-          <w:color w:val="0563C1"/>
-          <w:sz w:val="18"/>
-        </w:rPr>
-        <w:t>链接：https://www.science.org/doi/10.1126/sciadv.adx4857</w:t>
+        <w:t xml:space="preserve">Summary: </w:t>
+      </w:r>
+      <w:r>
+        <w:t>A nearly three-year BGC-Argo record from an oxygen-deficient zone combines oxygen, nitrate, nitrite, pH, chlorophyll and POC. The study shows that BGC-Argo can diagnose coupled nitrogen redox and carbon cycling processes, not only biomass proxies.</w:t>
       </w:r>
     </w:p>
     <w:p>
@@ -602,2008 +160,2734 @@
         <w:pStyle w:val="Heading2"/>
       </w:pPr>
       <w:r>
-        <w:t>重点期刊：按影响力和相关性排序</w:t>
+        <w:t>3. Global declines in net primary production in the ocean color era</w:t>
+      </w:r>
+    </w:p>
+    <w:p>
+      <w:r>
+        <w:rPr>
+          <w:b/>
+        </w:rPr>
+        <w:t xml:space="preserve">Authors: </w:t>
+      </w:r>
+      <w:r>
+        <w:t>Greg M. Silsbe; James Fox; Toby K. Westberry; Kimberly H. Halsey</w:t>
+        <w:br/>
+      </w:r>
+      <w:r>
+        <w:rPr>
+          <w:b/>
+        </w:rPr>
+        <w:t xml:space="preserve">Journal: </w:t>
+      </w:r>
+      <w:r>
+        <w:t>Nature Communications</w:t>
+        <w:br/>
+      </w:r>
+      <w:r>
+        <w:rPr>
+          <w:b/>
+        </w:rPr>
+        <w:t xml:space="preserve">Published: </w:t>
+      </w:r>
+      <w:r>
+        <w:t>2025-07</w:t>
+        <w:br/>
+      </w:r>
+      <w:r>
+        <w:rPr>
+          <w:b/>
+        </w:rPr>
+        <w:t xml:space="preserve">DOI: </w:t>
+      </w:r>
+      <w:r>
+        <w:t>10.1038/s41467-025-60906-y</w:t>
+        <w:br/>
+      </w:r>
+      <w:r>
+        <w:rPr>
+          <w:b/>
+        </w:rPr>
+        <w:t xml:space="preserve">URL: </w:t>
+      </w:r>
+      <w:r>
+        <w:t>https://www.nature.com/articles/s41467-025-60906-y</w:t>
+      </w:r>
+    </w:p>
+    <w:p>
+      <w:r>
+        <w:rPr>
+          <w:b/>
+        </w:rPr>
+        <w:t xml:space="preserve">Summary: </w:t>
+      </w:r>
+      <w:r>
+        <w:t>Using 25 years of SeaWiFS and MODIS-Aqua ocean-colour records, this study finds significant NPP declines across nearly half of the ocean, especially in stratified tropical and subtropical waters. The likely mechanism is stronger nutrient limitation.</w:t>
       </w:r>
     </w:p>
     <w:p>
       <w:pPr>
-        <w:pStyle w:val="Heading3"/>
+        <w:pStyle w:val="Heading2"/>
       </w:pPr>
       <w:r>
+        <w:t>4. Marine heatwaves modulate food webs and carbon transport processes</w:t>
+      </w:r>
+    </w:p>
+    <w:p>
+      <w:r>
         <w:rPr>
-          <w:rFonts w:ascii="Microsoft YaHei" w:hAnsi="Microsoft YaHei" w:eastAsia="Microsoft YaHei"/>
           <w:b/>
         </w:rPr>
-        <w:t>9. Decoupled timescales of organic carbon and phosphorus recycling in the surface ocean</w:t>
+        <w:t xml:space="preserve">Authors: </w:t>
+      </w:r>
+      <w:r>
+        <w:t>Mariana B. Bif; Colleen T. E. Kellogg; Yibin Huang; Julia Anstett; Sachia Traving; M. Angelica Peña; Steven J. Hallam; Kenneth S. Johnson</w:t>
+        <w:br/>
+      </w:r>
+      <w:r>
+        <w:rPr>
+          <w:b/>
+        </w:rPr>
+        <w:t xml:space="preserve">Journal: </w:t>
+      </w:r>
+      <w:r>
+        <w:t>Nature Communications</w:t>
+        <w:br/>
+      </w:r>
+      <w:r>
+        <w:rPr>
+          <w:b/>
+        </w:rPr>
+        <w:t xml:space="preserve">Published: </w:t>
+      </w:r>
+      <w:r>
+        <w:t>2025-10</w:t>
+        <w:br/>
+      </w:r>
+      <w:r>
+        <w:rPr>
+          <w:b/>
+        </w:rPr>
+        <w:t xml:space="preserve">DOI: </w:t>
+      </w:r>
+      <w:r>
+        <w:t>10.1038/s41467-025-63605-w</w:t>
+        <w:br/>
+      </w:r>
+      <w:r>
+        <w:rPr>
+          <w:b/>
+        </w:rPr>
+        <w:t xml:space="preserve">URL: </w:t>
+      </w:r>
+      <w:r>
+        <w:t>https://www.nature.com/articles/s41467-025-63605-w</w:t>
       </w:r>
     </w:p>
     <w:p>
       <w:r>
         <w:rPr>
-          <w:rFonts w:ascii="Microsoft YaHei" w:hAnsi="Microsoft YaHei" w:eastAsia="Microsoft YaHei"/>
-          <w:color w:val="55697D"/>
-          <w:sz w:val="18"/>
+          <w:b/>
         </w:rPr>
-        <w:t>作者：Megan R. Sullivan; François W. Primeau; Hojong Seo; Judith Camps-Castellà; Keisuke Inomura; Adam C. Martiny</w:t>
-      </w:r>
-    </w:p>
-    <w:p>
-      <w:r>
-        <w:rPr>
-          <w:rFonts w:ascii="Microsoft YaHei" w:hAnsi="Microsoft YaHei" w:eastAsia="Microsoft YaHei"/>
-          <w:color w:val="55697D"/>
-          <w:sz w:val="18"/>
-        </w:rPr>
-        <w:t>期刊：Proceedings of the National Academy of Sciences | 发表月份：2026-02 | DOI: 10.1073/pnas.2514991123</w:t>
-      </w:r>
-    </w:p>
-    <w:p>
-      <w:r>
-        <w:rPr>
-          <w:rFonts w:ascii="Microsoft YaHei" w:hAnsi="Microsoft YaHei" w:eastAsia="Microsoft YaHei"/>
-          <w:b/>
-          <w:sz w:val="19"/>
-        </w:rPr>
-        <w:t>关键词：organic carbon; phosphorus recycling; microbial carbon</w:t>
-      </w:r>
-    </w:p>
-    <w:p>
-      <w:r>
-        <w:rPr>
-          <w:rFonts w:ascii="Microsoft YaHei" w:hAnsi="Microsoft YaHei" w:eastAsia="Microsoft YaHei"/>
-        </w:rPr>
-        <w:t>聚焦表层海洋有机碳和磷再循环时间尺度的解耦。结论提示微生物再矿化和元素循环不能简单按固定比例处理，对 microbial carbon 和 carbon pump 机制解释很有价值。</w:t>
-      </w:r>
-    </w:p>
-    <w:p>
-      <w:r>
-        <w:rPr>
-          <w:rFonts w:ascii="Microsoft YaHei" w:hAnsi="Microsoft YaHei" w:eastAsia="Microsoft YaHei"/>
-          <w:color w:val="0563C1"/>
-          <w:sz w:val="18"/>
-        </w:rPr>
-        <w:t>链接：https://www.pnas.org/doi/10.1073/pnas.2514991123</w:t>
+        <w:t xml:space="preserve">Summary: </w:t>
+      </w:r>
+      <w:r>
+        <w:t>This study combines BGC-Argo, pigments and DNA metabarcoding near Line P. It finds anomalously high POC during the 2015 and 2019 marine heatwaves, but small particles accumulated and remineralized slowly at mid-depths, potentially reducing carbon-pump efficiency.</w:t>
       </w:r>
     </w:p>
     <w:p>
       <w:pPr>
-        <w:pStyle w:val="Heading3"/>
+        <w:pStyle w:val="Heading2"/>
       </w:pPr>
       <w:r>
+        <w:t>5. Marine heatwaves are shaping the vertical structure of phytoplankton in the global ocean</w:t>
+      </w:r>
+    </w:p>
+    <w:p>
+      <w:r>
         <w:rPr>
-          <w:rFonts w:ascii="Microsoft YaHei" w:hAnsi="Microsoft YaHei" w:eastAsia="Microsoft YaHei"/>
           <w:b/>
         </w:rPr>
-        <w:t>10. Global warming drives more intense, widespread, and frequent marine heatwaves</w:t>
+        <w:t xml:space="preserve">Authors: </w:t>
+      </w:r>
+      <w:r>
+        <w:t>Xueying Ma; Gengxin Chen</w:t>
+        <w:br/>
+      </w:r>
+      <w:r>
+        <w:rPr>
+          <w:b/>
+        </w:rPr>
+        <w:t xml:space="preserve">Journal: </w:t>
+      </w:r>
+      <w:r>
+        <w:t>Communications Earth &amp; Environment</w:t>
+        <w:br/>
+      </w:r>
+      <w:r>
+        <w:rPr>
+          <w:b/>
+        </w:rPr>
+        <w:t xml:space="preserve">Published: </w:t>
+      </w:r>
+      <w:r>
+        <w:t>2025-08</w:t>
+        <w:br/>
+      </w:r>
+      <w:r>
+        <w:rPr>
+          <w:b/>
+        </w:rPr>
+        <w:t xml:space="preserve">DOI: </w:t>
+      </w:r>
+      <w:r>
+        <w:t>10.1038/s43247-025-02718-y</w:t>
+        <w:br/>
+      </w:r>
+      <w:r>
+        <w:rPr>
+          <w:b/>
+        </w:rPr>
+        <w:t xml:space="preserve">URL: </w:t>
+      </w:r>
+      <w:r>
+        <w:t>https://www.nature.com/articles/s43247-025-02718-y</w:t>
       </w:r>
     </w:p>
     <w:p>
       <w:r>
         <w:rPr>
-          <w:rFonts w:ascii="Microsoft YaHei" w:hAnsi="Microsoft YaHei" w:eastAsia="Microsoft YaHei"/>
-          <w:color w:val="55697D"/>
-          <w:sz w:val="18"/>
+          <w:b/>
         </w:rPr>
-        <w:t>作者：Marta Marcos; Angel Amores; Miguel Agulles; Jon Robson; Xiangbo Feng</w:t>
-      </w:r>
-    </w:p>
-    <w:p>
-      <w:r>
-        <w:rPr>
-          <w:rFonts w:ascii="Microsoft YaHei" w:hAnsi="Microsoft YaHei" w:eastAsia="Microsoft YaHei"/>
-          <w:color w:val="55697D"/>
-          <w:sz w:val="18"/>
-        </w:rPr>
-        <w:t>期刊：Proceedings of the National Academy of Sciences | 发表月份：2025-04 | DOI: 10.1073/pnas.2413505122</w:t>
-      </w:r>
-    </w:p>
-    <w:p>
-      <w:r>
-        <w:rPr>
-          <w:rFonts w:ascii="Microsoft YaHei" w:hAnsi="Microsoft YaHei" w:eastAsia="Microsoft YaHei"/>
-          <w:b/>
-          <w:sz w:val="19"/>
-        </w:rPr>
-        <w:t>关键词：marine heatwaves; warming; global trend</w:t>
-      </w:r>
-    </w:p>
-    <w:p>
-      <w:r>
-        <w:rPr>
-          <w:rFonts w:ascii="Microsoft YaHei" w:hAnsi="Microsoft YaHei" w:eastAsia="Microsoft YaHei"/>
-        </w:rPr>
-        <w:t>定量说明全球变暖会推动海洋热浪更强、更广、更频繁。它是 MHW 生态影响研究的物理背景论文，可帮助解释为什么垂向浮游植物响应会越来越重要。</w:t>
-      </w:r>
-    </w:p>
-    <w:p>
-      <w:r>
-        <w:rPr>
-          <w:rFonts w:ascii="Microsoft YaHei" w:hAnsi="Microsoft YaHei" w:eastAsia="Microsoft YaHei"/>
-          <w:color w:val="0563C1"/>
-          <w:sz w:val="18"/>
-        </w:rPr>
-        <w:t>链接：https://www.pnas.org/doi/10.1073/pnas.2413505122</w:t>
+        <w:t xml:space="preserve">Summary: </w:t>
+      </w:r>
+      <w:r>
+        <w:t>Using global BGC-Argo profiles from 2008 to 2024, this paper shows that marine heatwave impacts on chlorophyll are often stronger below the surface. It identifies intensified, weakened and subsurface-reversed responses and highlights DCM restructuring.</w:t>
       </w:r>
     </w:p>
     <w:p>
       <w:pPr>
-        <w:pStyle w:val="Heading3"/>
+        <w:pStyle w:val="Heading2"/>
       </w:pPr>
       <w:r>
+        <w:t>6. The oceanic physical injection pump of organic carbon</w:t>
+      </w:r>
+    </w:p>
+    <w:p>
+      <w:r>
         <w:rPr>
-          <w:rFonts w:ascii="Microsoft YaHei" w:hAnsi="Microsoft YaHei" w:eastAsia="Microsoft YaHei"/>
           <w:b/>
         </w:rPr>
-        <w:t>11. Characterization of phytoplankton-excreted metabolites using high-resolution mass spectrometry and stable isotope tracing</w:t>
+        <w:t xml:space="preserve">Authors: </w:t>
+      </w:r>
+      <w:r>
+        <w:t>Marco Bellacicco; Salvatore Marullo; Giorgio Dall’Olmo; Daniele Iudicone; Bruno Buongiorno Nardelli</w:t>
+        <w:br/>
+      </w:r>
+      <w:r>
+        <w:rPr>
+          <w:b/>
+        </w:rPr>
+        <w:t xml:space="preserve">Journal: </w:t>
+      </w:r>
+      <w:r>
+        <w:t>Nature Communications</w:t>
+        <w:br/>
+      </w:r>
+      <w:r>
+        <w:rPr>
+          <w:b/>
+        </w:rPr>
+        <w:t xml:space="preserve">Published: </w:t>
+      </w:r>
+      <w:r>
+        <w:t>2025-08</w:t>
+        <w:br/>
+      </w:r>
+      <w:r>
+        <w:rPr>
+          <w:b/>
+        </w:rPr>
+        <w:t xml:space="preserve">DOI: </w:t>
+      </w:r>
+      <w:r>
+        <w:t>10.1038/s41467-025-62363-z</w:t>
+        <w:br/>
+      </w:r>
+      <w:r>
+        <w:rPr>
+          <w:b/>
+        </w:rPr>
+        <w:t xml:space="preserve">URL: </w:t>
+      </w:r>
+      <w:r>
+        <w:t>https://www.nature.com/articles/s41467-025-62363-z</w:t>
       </w:r>
     </w:p>
     <w:p>
       <w:r>
         <w:rPr>
-          <w:rFonts w:ascii="Microsoft YaHei" w:hAnsi="Microsoft YaHei" w:eastAsia="Microsoft YaHei"/>
-          <w:color w:val="55697D"/>
-          <w:sz w:val="18"/>
+          <w:b/>
         </w:rPr>
-        <w:t>作者：Yuting Zhu; Hanna S. Anderson; Eli Salcedo; Samuel E. Miller; Krista Longnecker; Melissa C. Kido Soule; Sheean T. Haley; Gretchen J. Swarr; et al.</w:t>
-      </w:r>
-    </w:p>
-    <w:p>
-      <w:r>
-        <w:rPr>
-          <w:rFonts w:ascii="Microsoft YaHei" w:hAnsi="Microsoft YaHei" w:eastAsia="Microsoft YaHei"/>
-          <w:color w:val="55697D"/>
-          <w:sz w:val="18"/>
-        </w:rPr>
-        <w:t>期刊：Proceedings of the National Academy of Sciences | 发表月份：2026-03 | DOI: 10.1073/pnas.2531765123</w:t>
-      </w:r>
-    </w:p>
-    <w:p>
-      <w:r>
-        <w:rPr>
-          <w:rFonts w:ascii="Microsoft YaHei" w:hAnsi="Microsoft YaHei" w:eastAsia="Microsoft YaHei"/>
-          <w:b/>
-          <w:sz w:val="19"/>
-        </w:rPr>
-        <w:t>关键词：phytoplankton metabolites; dissolved organic matter; microbial loop</w:t>
-      </w:r>
-    </w:p>
-    <w:p>
-      <w:r>
-        <w:rPr>
-          <w:rFonts w:ascii="Microsoft YaHei" w:hAnsi="Microsoft YaHei" w:eastAsia="Microsoft YaHei"/>
-        </w:rPr>
-        <w:t>用高分辨率质谱和稳定同位素追踪浮游植物释放代谢物。结论可帮助理解初级生产如何进入 DOM 和微生物环，对 microbial carbon 和碳泵非颗粒通道很相关。</w:t>
-      </w:r>
-    </w:p>
-    <w:p>
-      <w:r>
-        <w:rPr>
-          <w:rFonts w:ascii="Microsoft YaHei" w:hAnsi="Microsoft YaHei" w:eastAsia="Microsoft YaHei"/>
-          <w:color w:val="0563C1"/>
-          <w:sz w:val="18"/>
-        </w:rPr>
-        <w:t>链接：https://www.pnas.org/doi/10.1073/pnas.2531765123</w:t>
+        <w:t xml:space="preserve">Summary: </w:t>
+      </w:r>
+      <w:r>
+        <w:t>This paper quantifies the physical injection pump of organic carbon, separate from gravitational sinking. Mixing, entrainment and transport export substantial POC and DOC, showing that carbon-pump studies should not focus only on sinking particles.</w:t>
       </w:r>
     </w:p>
     <w:p>
       <w:pPr>
-        <w:pStyle w:val="Heading3"/>
+        <w:pStyle w:val="Heading2"/>
       </w:pPr>
       <w:r>
+        <w:t>7. Antarctic krill vertical migrations modulate seasonal carbon export</w:t>
+      </w:r>
+    </w:p>
+    <w:p>
+      <w:r>
         <w:rPr>
-          <w:rFonts w:ascii="Microsoft YaHei" w:hAnsi="Microsoft YaHei" w:eastAsia="Microsoft YaHei"/>
           <w:b/>
         </w:rPr>
-        <w:t>12. PACE/OCI retrievals of the spectral particulate backscattering coefficient in the global ocean using mixture density networks</w:t>
+        <w:t xml:space="preserve">Authors: </w:t>
+      </w:r>
+      <w:r>
+        <w:t>A. J. R. Smith; S. Wotherspoon; L. Ratnarajah; G. R. Cutter; G. J. Macaulay; B. Hutton; R. King; S. Kawaguchi; et al.</w:t>
+        <w:br/>
+      </w:r>
+      <w:r>
+        <w:rPr>
+          <w:b/>
+        </w:rPr>
+        <w:t xml:space="preserve">Journal: </w:t>
+      </w:r>
+      <w:r>
+        <w:t>Science</w:t>
+        <w:br/>
+      </w:r>
+      <w:r>
+        <w:rPr>
+          <w:b/>
+        </w:rPr>
+        <w:t xml:space="preserve">Published: </w:t>
+      </w:r>
+      <w:r>
+        <w:t>2025-01</w:t>
+        <w:br/>
+      </w:r>
+      <w:r>
+        <w:rPr>
+          <w:b/>
+        </w:rPr>
+        <w:t xml:space="preserve">DOI: </w:t>
+      </w:r>
+      <w:r>
+        <w:t>10.1126/science.adq5564</w:t>
+        <w:br/>
+      </w:r>
+      <w:r>
+        <w:rPr>
+          <w:b/>
+        </w:rPr>
+        <w:t xml:space="preserve">URL: </w:t>
+      </w:r>
+      <w:r>
+        <w:t>https://www.science.org/doi/10.1126/science.adq5564</w:t>
       </w:r>
     </w:p>
     <w:p>
       <w:r>
         <w:rPr>
-          <w:rFonts w:ascii="Microsoft YaHei" w:hAnsi="Microsoft YaHei" w:eastAsia="Microsoft YaHei"/>
-          <w:color w:val="55697D"/>
-          <w:sz w:val="18"/>
+          <w:b/>
         </w:rPr>
-        <w:t>作者：Xingyu Bai; Bingqing Liu; Jiang Li; Yuanheng Xiong; Eurico J. D'Sa; Melissa M. Baustian; Xiaodong Zhang; Brice K. Grunert; et al.</w:t>
-      </w:r>
-    </w:p>
-    <w:p>
-      <w:r>
-        <w:rPr>
-          <w:rFonts w:ascii="Microsoft YaHei" w:hAnsi="Microsoft YaHei" w:eastAsia="Microsoft YaHei"/>
-          <w:color w:val="55697D"/>
-          <w:sz w:val="18"/>
-        </w:rPr>
-        <w:t>期刊：Remote Sensing of Environment | 发表月份：2026-05 | DOI: 10.1016/j.rse.2026.115327</w:t>
-      </w:r>
-    </w:p>
-    <w:p>
-      <w:r>
-        <w:rPr>
-          <w:rFonts w:ascii="Microsoft YaHei" w:hAnsi="Microsoft YaHei" w:eastAsia="Microsoft YaHei"/>
-          <w:b/>
-          <w:sz w:val="19"/>
-        </w:rPr>
-        <w:t>关键词：PACE; ocean colour; backscattering; machine learning</w:t>
-      </w:r>
-    </w:p>
-    <w:p>
-      <w:r>
-        <w:rPr>
-          <w:rFonts w:ascii="Microsoft YaHei" w:hAnsi="Microsoft YaHei" w:eastAsia="Microsoft YaHei"/>
-        </w:rPr>
-        <w:t>面向 PACE/OCI 反演全球海洋颗粒后向散射光谱，用 mixture density networks 表征不确定性。对 BGC-Argo bbp 交叉验证、bio-optic 参数化和 POC 遥感很重要。</w:t>
-      </w:r>
-    </w:p>
-    <w:p>
-      <w:r>
-        <w:rPr>
-          <w:rFonts w:ascii="Microsoft YaHei" w:hAnsi="Microsoft YaHei" w:eastAsia="Microsoft YaHei"/>
-          <w:color w:val="0563C1"/>
-          <w:sz w:val="18"/>
-        </w:rPr>
-        <w:t>链接：https://doi.org/10.1016/j.rse.2026.115327</w:t>
+        <w:t xml:space="preserve">Summary: </w:t>
+      </w:r>
+      <w:r>
+        <w:t>This Science paper examines how Antarctic krill vertical migration modulates seasonal carbon export. It complements BGC-Argo carbon-pump studies by emphasizing the migrant-pump pathway in the Southern Ocean.</w:t>
       </w:r>
     </w:p>
     <w:p>
       <w:pPr>
-        <w:pStyle w:val="Heading3"/>
+        <w:pStyle w:val="Heading2"/>
       </w:pPr>
       <w:r>
+        <w:t>8. Declining ocean greenness and phytoplankton blooms in low to mid-latitudes under a warming climate</w:t>
+      </w:r>
+    </w:p>
+    <w:p>
+      <w:r>
         <w:rPr>
-          <w:rFonts w:ascii="Microsoft YaHei" w:hAnsi="Microsoft YaHei" w:eastAsia="Microsoft YaHei"/>
           <w:b/>
         </w:rPr>
-        <w:t>13. Global surface phytoplankton community structure from ocean color radiometry</w:t>
+        <w:t xml:space="preserve">Authors: </w:t>
+      </w:r>
+      <w:r>
+        <w:t>Zhongkun Hong; Di Long; Kaiyue Shan; Jian-Min Zhang; R. Iestyn Woolway; Maofeng Liu; Michael E. Mann; Hongwei Fang</w:t>
+        <w:br/>
+      </w:r>
+      <w:r>
+        <w:rPr>
+          <w:b/>
+        </w:rPr>
+        <w:t xml:space="preserve">Journal: </w:t>
+      </w:r>
+      <w:r>
+        <w:t>Science Advances</w:t>
+        <w:br/>
+      </w:r>
+      <w:r>
+        <w:rPr>
+          <w:b/>
+        </w:rPr>
+        <w:t xml:space="preserve">Published: </w:t>
+      </w:r>
+      <w:r>
+        <w:t>2025-10</w:t>
+        <w:br/>
+      </w:r>
+      <w:r>
+        <w:rPr>
+          <w:b/>
+        </w:rPr>
+        <w:t xml:space="preserve">DOI: </w:t>
+      </w:r>
+      <w:r>
+        <w:t>10.1126/sciadv.adx4857</w:t>
+        <w:br/>
+      </w:r>
+      <w:r>
+        <w:rPr>
+          <w:b/>
+        </w:rPr>
+        <w:t xml:space="preserve">URL: </w:t>
+      </w:r>
+      <w:r>
+        <w:t>https://www.science.org/doi/10.1126/sciadv.adx4857</w:t>
       </w:r>
     </w:p>
     <w:p>
       <w:r>
         <w:rPr>
-          <w:rFonts w:ascii="Microsoft YaHei" w:hAnsi="Microsoft YaHei" w:eastAsia="Microsoft YaHei"/>
-          <w:color w:val="55697D"/>
-          <w:sz w:val="18"/>
+          <w:b/>
         </w:rPr>
-        <w:t>作者：Xueyin Li; Shuguo Chen; Junwei Wang; Qing Zhu</w:t>
-      </w:r>
-    </w:p>
-    <w:p>
-      <w:r>
-        <w:rPr>
-          <w:rFonts w:ascii="Microsoft YaHei" w:hAnsi="Microsoft YaHei" w:eastAsia="Microsoft YaHei"/>
-          <w:color w:val="55697D"/>
-          <w:sz w:val="18"/>
-        </w:rPr>
-        <w:t>期刊：Remote Sensing of Environment | 发表月份：2026-03 | DOI: 10.1016/j.rse.2025.115174</w:t>
-      </w:r>
-    </w:p>
-    <w:p>
-      <w:r>
-        <w:rPr>
-          <w:rFonts w:ascii="Microsoft YaHei" w:hAnsi="Microsoft YaHei" w:eastAsia="Microsoft YaHei"/>
-          <w:b/>
-          <w:sz w:val="19"/>
-        </w:rPr>
-        <w:t>关键词：ocean colour; phytoplankton community structure; remote sensing</w:t>
-      </w:r>
-    </w:p>
-    <w:p>
-      <w:r>
-        <w:rPr>
-          <w:rFonts w:ascii="Microsoft YaHei" w:hAnsi="Microsoft YaHei" w:eastAsia="Microsoft YaHei"/>
-        </w:rPr>
-        <w:t>用海色辐射计估计全球表层浮游植物群落结构。它把传统 Chl-a 监测推进到群落组成层面，适合与 BGC-Argo 垂向剖面结合，分析表层与 DCM 群落差异。</w:t>
-      </w:r>
-    </w:p>
-    <w:p>
-      <w:r>
-        <w:rPr>
-          <w:rFonts w:ascii="Microsoft YaHei" w:hAnsi="Microsoft YaHei" w:eastAsia="Microsoft YaHei"/>
-          <w:color w:val="0563C1"/>
-          <w:sz w:val="18"/>
-        </w:rPr>
-        <w:t>链接：https://doi.org/10.1016/j.rse.2025.115174</w:t>
+        <w:t xml:space="preserve">Summary: </w:t>
+      </w:r>
+      <w:r>
+        <w:t>This Science Advances study uses long-term ocean-colour records to examine greenness and bloom changes in low- to mid-latitude oceans. It points to weakening blooms and surface phytoplankton signals under warming.</w:t>
       </w:r>
     </w:p>
     <w:p>
       <w:pPr>
-        <w:pStyle w:val="Heading3"/>
+        <w:pStyle w:val="Heading2"/>
       </w:pPr>
       <w:r>
+        <w:t>9. Decoupled timescales of organic carbon and phosphorus recycling in the global ocean</w:t>
+      </w:r>
+    </w:p>
+    <w:p>
+      <w:r>
         <w:rPr>
-          <w:rFonts w:ascii="Microsoft YaHei" w:hAnsi="Microsoft YaHei" w:eastAsia="Microsoft YaHei"/>
           <w:b/>
         </w:rPr>
-        <w:t>14. SeaHawk CubeSat captures ocean color with high spatial and temporal resolution</w:t>
+        <w:t xml:space="preserve">Authors: </w:t>
+      </w:r>
+      <w:r>
+        <w:t>Megan R. Sullivan; François W. Primeau; Hojong Seo; Judith Camps-Castellà; Keisuke Inomura; Adam C. Martiny</w:t>
+        <w:br/>
+      </w:r>
+      <w:r>
+        <w:rPr>
+          <w:b/>
+        </w:rPr>
+        <w:t xml:space="preserve">Journal: </w:t>
+      </w:r>
+      <w:r>
+        <w:t>Proceedings of the National Academy of Sciences</w:t>
+        <w:br/>
+      </w:r>
+      <w:r>
+        <w:rPr>
+          <w:b/>
+        </w:rPr>
+        <w:t xml:space="preserve">Published: </w:t>
+      </w:r>
+      <w:r>
+        <w:t>2026-02</w:t>
+        <w:br/>
+      </w:r>
+      <w:r>
+        <w:rPr>
+          <w:b/>
+        </w:rPr>
+        <w:t xml:space="preserve">DOI: </w:t>
+      </w:r>
+      <w:r>
+        <w:t>10.1073/pnas.2514991123</w:t>
+        <w:br/>
+      </w:r>
+      <w:r>
+        <w:rPr>
+          <w:b/>
+        </w:rPr>
+        <w:t xml:space="preserve">URL: </w:t>
+      </w:r>
+      <w:r>
+        <w:t>https://www.pnas.org/doi/10.1073/pnas.2514991123</w:t>
       </w:r>
     </w:p>
     <w:p>
       <w:r>
         <w:rPr>
-          <w:rFonts w:ascii="Microsoft YaHei" w:hAnsi="Microsoft YaHei" w:eastAsia="Microsoft YaHei"/>
-          <w:color w:val="55697D"/>
-          <w:sz w:val="18"/>
+          <w:b/>
         </w:rPr>
-        <w:t>作者：Srinivas Kolluru; Sara Rivero-Calle; Philip J. Bresnahan; Susanne Kratzer; Timothy S. Moore; Thomas Schroeder; Sean Bailey; Alan Holmes; et al.</w:t>
-      </w:r>
-    </w:p>
-    <w:p>
-      <w:r>
-        <w:rPr>
-          <w:rFonts w:ascii="Microsoft YaHei" w:hAnsi="Microsoft YaHei" w:eastAsia="Microsoft YaHei"/>
-          <w:color w:val="55697D"/>
-          <w:sz w:val="18"/>
-        </w:rPr>
-        <w:t>期刊：Remote Sensing of Environment | 发表月份：2026-01 | DOI: 10.1016/j.rse.2025.115111</w:t>
-      </w:r>
-    </w:p>
-    <w:p>
-      <w:r>
-        <w:rPr>
-          <w:rFonts w:ascii="Microsoft YaHei" w:hAnsi="Microsoft YaHei" w:eastAsia="Microsoft YaHei"/>
-          <w:b/>
-          <w:sz w:val="19"/>
-        </w:rPr>
-        <w:t>关键词：ocean colour; high-resolution observation; CubeSat</w:t>
-      </w:r>
-    </w:p>
-    <w:p>
-      <w:r>
-        <w:rPr>
-          <w:rFonts w:ascii="Microsoft YaHei" w:hAnsi="Microsoft YaHei" w:eastAsia="Microsoft YaHei"/>
-        </w:rPr>
-        <w:t>展示 SeaHawk 小卫星在高时空分辨率海色观测中的能力。对近岸和小尺度藻华、锋面、热浪响应监测有用，可补足传统海色产品空间分辨率不足的问题。</w:t>
-      </w:r>
-    </w:p>
-    <w:p>
-      <w:r>
-        <w:rPr>
-          <w:rFonts w:ascii="Microsoft YaHei" w:hAnsi="Microsoft YaHei" w:eastAsia="Microsoft YaHei"/>
-          <w:color w:val="0563C1"/>
-          <w:sz w:val="18"/>
-        </w:rPr>
-        <w:t>链接：https://doi.org/10.1016/j.rse.2025.115111</w:t>
+        <w:t xml:space="preserve">Summary: </w:t>
+      </w:r>
+      <w:r>
+        <w:t>DOI-verified metadata correction: this record now matches the DOI registration for 'Decoupled timescales of organic carbon and phosphorus recycling in the global ocean'. It is included for its relevance to organic carbon; phosphorus recycling; microbial carbon; use the DOI link for the publisher abstract and full bibliographic details.</w:t>
       </w:r>
     </w:p>
     <w:p>
       <w:pPr>
-        <w:pStyle w:val="Heading3"/>
+        <w:pStyle w:val="Heading2"/>
       </w:pPr>
       <w:r>
+        <w:t>10. Global warming drives a threefold increase in persistence and 1 ° C rise in intensity of marine heatwaves</w:t>
+      </w:r>
+    </w:p>
+    <w:p>
+      <w:r>
         <w:rPr>
-          <w:rFonts w:ascii="Microsoft YaHei" w:hAnsi="Microsoft YaHei" w:eastAsia="Microsoft YaHei"/>
           <w:b/>
         </w:rPr>
-        <w:t>15. Phytoplankton flexible pigment content complicates modeling of primary production and carbon fluxes</w:t>
+        <w:t xml:space="preserve">Authors: </w:t>
+      </w:r>
+      <w:r>
+        <w:t>Marta Marcos; Angel Amores; Miguel Agulles; Jon Robson; Xiangbo Feng</w:t>
+        <w:br/>
+      </w:r>
+      <w:r>
+        <w:rPr>
+          <w:b/>
+        </w:rPr>
+        <w:t xml:space="preserve">Journal: </w:t>
+      </w:r>
+      <w:r>
+        <w:t>Proceedings of the National Academy of Sciences</w:t>
+        <w:br/>
+      </w:r>
+      <w:r>
+        <w:rPr>
+          <w:b/>
+        </w:rPr>
+        <w:t xml:space="preserve">Published: </w:t>
+      </w:r>
+      <w:r>
+        <w:t>2025-04</w:t>
+        <w:br/>
+      </w:r>
+      <w:r>
+        <w:rPr>
+          <w:b/>
+        </w:rPr>
+        <w:t xml:space="preserve">DOI: </w:t>
+      </w:r>
+      <w:r>
+        <w:t>10.1073/pnas.2413505122</w:t>
+        <w:br/>
+      </w:r>
+      <w:r>
+        <w:rPr>
+          <w:b/>
+        </w:rPr>
+        <w:t xml:space="preserve">URL: </w:t>
+      </w:r>
+      <w:r>
+        <w:t>https://www.pnas.org/doi/10.1073/pnas.2413505122</w:t>
       </w:r>
     </w:p>
     <w:p>
       <w:r>
         <w:rPr>
-          <w:rFonts w:ascii="Microsoft YaHei" w:hAnsi="Microsoft YaHei" w:eastAsia="Microsoft YaHei"/>
-          <w:color w:val="55697D"/>
-          <w:sz w:val="18"/>
+          <w:b/>
         </w:rPr>
-        <w:t>作者：Francesco Mattei; Anna E. Hickman; Julia Uitz; Vincenzo Vellucci; Laurence Garczarek; Frédéric Partensky; Stephanie Dutkiewicz</w:t>
-      </w:r>
-    </w:p>
-    <w:p>
-      <w:r>
-        <w:rPr>
-          <w:rFonts w:ascii="Microsoft YaHei" w:hAnsi="Microsoft YaHei" w:eastAsia="Microsoft YaHei"/>
-          <w:color w:val="55697D"/>
-          <w:sz w:val="18"/>
-        </w:rPr>
-        <w:t>期刊：Global Change Biology | 发表月份：2026-01 | DOI: 10.1111/gcb.70671</w:t>
-      </w:r>
-    </w:p>
-    <w:p>
-      <w:r>
-        <w:rPr>
-          <w:rFonts w:ascii="Microsoft YaHei" w:hAnsi="Microsoft YaHei" w:eastAsia="Microsoft YaHei"/>
-          <w:b/>
-          <w:sz w:val="19"/>
-        </w:rPr>
-        <w:t>关键词：phytoplankton pigments; primary production; carbon flux</w:t>
-      </w:r>
-    </w:p>
-    <w:p>
-      <w:r>
-        <w:rPr>
-          <w:rFonts w:ascii="Microsoft YaHei" w:hAnsi="Microsoft YaHei" w:eastAsia="Microsoft YaHei"/>
-        </w:rPr>
-        <w:t>讨论浮游植物色素含量可塑性如何影响初级生产和碳通量建模。结论提醒 Chl-a 到碳或 NPP 的转换会受 photoacclimation 影响，特别适合和 BGC-Argo 垂向 Chl/光场联用。</w:t>
-      </w:r>
-    </w:p>
-    <w:p>
-      <w:r>
-        <w:rPr>
-          <w:rFonts w:ascii="Microsoft YaHei" w:hAnsi="Microsoft YaHei" w:eastAsia="Microsoft YaHei"/>
-          <w:color w:val="0563C1"/>
-          <w:sz w:val="18"/>
-        </w:rPr>
-        <w:t>链接：https://doi.org/10.1111/gcb.70671</w:t>
+        <w:t xml:space="preserve">Summary: </w:t>
+      </w:r>
+      <w:r>
+        <w:t>DOI-verified metadata correction: this record now matches the DOI registration for 'Global warming drives a threefold increase in persistence and 1 ° C rise in intensity of marine heatwaves'. It is included for its relevance to marine heatwaves; warming; global trend; use the DOI link for the publisher abstract and full bibliographic details.</w:t>
       </w:r>
     </w:p>
     <w:p>
       <w:pPr>
-        <w:pStyle w:val="Heading3"/>
+        <w:pStyle w:val="Heading2"/>
       </w:pPr>
       <w:r>
+        <w:t>11. Characterization of phytoplankton-excreted metabolites mediating carbon flux through the surface ocean</w:t>
+      </w:r>
+    </w:p>
+    <w:p>
+      <w:r>
         <w:rPr>
-          <w:rFonts w:ascii="Microsoft YaHei" w:hAnsi="Microsoft YaHei" w:eastAsia="Microsoft YaHei"/>
           <w:b/>
         </w:rPr>
-        <w:t>16. Modeling Organic Carbon Flux</w:t>
+        <w:t xml:space="preserve">Authors: </w:t>
+      </w:r>
+      <w:r>
+        <w:t>Yuting Zhu; Hanna S. Anderson; Eli Salcedo; Samuel E. Miller; Krista Longnecker; Melissa C. Kido Soule; Sheean T. Haley; Gretchen J. Swarr; et al.</w:t>
+        <w:br/>
+      </w:r>
+      <w:r>
+        <w:rPr>
+          <w:b/>
+        </w:rPr>
+        <w:t xml:space="preserve">Journal: </w:t>
+      </w:r>
+      <w:r>
+        <w:t>Proceedings of the National Academy of Sciences</w:t>
+        <w:br/>
+      </w:r>
+      <w:r>
+        <w:rPr>
+          <w:b/>
+        </w:rPr>
+        <w:t xml:space="preserve">Published: </w:t>
+      </w:r>
+      <w:r>
+        <w:t>2026-03</w:t>
+        <w:br/>
+      </w:r>
+      <w:r>
+        <w:rPr>
+          <w:b/>
+        </w:rPr>
+        <w:t xml:space="preserve">DOI: </w:t>
+      </w:r>
+      <w:r>
+        <w:t>10.1073/pnas.2531765123</w:t>
+        <w:br/>
+      </w:r>
+      <w:r>
+        <w:rPr>
+          <w:b/>
+        </w:rPr>
+        <w:t xml:space="preserve">URL: </w:t>
+      </w:r>
+      <w:r>
+        <w:t>https://www.pnas.org/doi/10.1073/pnas.2531765123</w:t>
       </w:r>
     </w:p>
     <w:p>
       <w:r>
         <w:rPr>
-          <w:rFonts w:ascii="Microsoft YaHei" w:hAnsi="Microsoft YaHei" w:eastAsia="Microsoft YaHei"/>
-          <w:color w:val="55697D"/>
-          <w:sz w:val="18"/>
+          <w:b/>
         </w:rPr>
-        <w:t>作者：Adrian B. Burd</w:t>
-      </w:r>
-    </w:p>
-    <w:p>
-      <w:r>
-        <w:rPr>
-          <w:rFonts w:ascii="Microsoft YaHei" w:hAnsi="Microsoft YaHei" w:eastAsia="Microsoft YaHei"/>
-          <w:color w:val="55697D"/>
-          <w:sz w:val="18"/>
-        </w:rPr>
-        <w:t>期刊：Annual Review of Marine Science | 发表月份：2024-01 | DOI: 10.1146/annurev-marine-022123-102516</w:t>
-      </w:r>
-    </w:p>
-    <w:p>
-      <w:r>
-        <w:rPr>
-          <w:rFonts w:ascii="Microsoft YaHei" w:hAnsi="Microsoft YaHei" w:eastAsia="Microsoft YaHei"/>
-          <w:b/>
-          <w:sz w:val="19"/>
-        </w:rPr>
-        <w:t>关键词：carbon flux; review; model synthesis</w:t>
-      </w:r>
-    </w:p>
-    <w:p>
-      <w:r>
-        <w:rPr>
-          <w:rFonts w:ascii="Microsoft YaHei" w:hAnsi="Microsoft YaHei" w:eastAsia="Microsoft YaHei"/>
-        </w:rPr>
-        <w:t>综述有机碳通量建模的主要框架、观测约束和不确定性。它适合作为 carbon pump 研究的路线图，尤其能帮助判断 BGC-Argo、沉积物捕集器和卫星产品各自约束的是哪一段通量。</w:t>
-      </w:r>
-    </w:p>
-    <w:p>
-      <w:r>
-        <w:rPr>
-          <w:rFonts w:ascii="Microsoft YaHei" w:hAnsi="Microsoft YaHei" w:eastAsia="Microsoft YaHei"/>
-          <w:color w:val="0563C1"/>
-          <w:sz w:val="18"/>
-        </w:rPr>
-        <w:t>链接：https://doi.org/10.1146/annurev-marine-022123-102516</w:t>
+        <w:t xml:space="preserve">Summary: </w:t>
+      </w:r>
+      <w:r>
+        <w:t>DOI-verified metadata correction: this record now matches the DOI registration for 'Characterization of phytoplankton-excreted metabolites mediating carbon flux through the surface ocean'. It is included for its relevance to phytoplankton metabolites; dissolved organic matter; microbial loop; use the DOI link for the publisher abstract and full bibliographic details.</w:t>
       </w:r>
     </w:p>
     <w:p>
       <w:pPr>
-        <w:pStyle w:val="Heading3"/>
+        <w:pStyle w:val="Heading2"/>
       </w:pPr>
       <w:r>
+        <w:t>12. Hyperspectral retrieval of phytoplankton absorption and community composition from NASA’s PACE-OCI in estuarine–coastal waters using a hybrid framework combining mixture-of-experts and Variational Autoencoder</w:t>
+      </w:r>
+    </w:p>
+    <w:p>
+      <w:r>
         <w:rPr>
-          <w:rFonts w:ascii="Microsoft YaHei" w:hAnsi="Microsoft YaHei" w:eastAsia="Microsoft YaHei"/>
           <w:b/>
         </w:rPr>
-        <w:t>17. Two Decades of Increase in Southern Ocean Net Community Production Revealed by BGC-Argo Floats</w:t>
+        <w:t xml:space="preserve">Authors: </w:t>
+      </w:r>
+      <w:r>
+        <w:t>Xingyu Bai; Bingqing Liu; Jiang Li; Yuanheng Xiong; Eurico J. D'Sa; Melissa M. Baustian; Xiaodong Zhang; Brice K. Grunert; et al.</w:t>
+        <w:br/>
+      </w:r>
+      <w:r>
+        <w:rPr>
+          <w:b/>
+        </w:rPr>
+        <w:t xml:space="preserve">Journal: </w:t>
+      </w:r>
+      <w:r>
+        <w:t>Remote Sensing of Environment</w:t>
+        <w:br/>
+      </w:r>
+      <w:r>
+        <w:rPr>
+          <w:b/>
+        </w:rPr>
+        <w:t xml:space="preserve">Published: </w:t>
+      </w:r>
+      <w:r>
+        <w:t>2026-05</w:t>
+        <w:br/>
+      </w:r>
+      <w:r>
+        <w:rPr>
+          <w:b/>
+        </w:rPr>
+        <w:t xml:space="preserve">DOI: </w:t>
+      </w:r>
+      <w:r>
+        <w:t>10.1016/j.rse.2026.115327</w:t>
+        <w:br/>
+      </w:r>
+      <w:r>
+        <w:rPr>
+          <w:b/>
+        </w:rPr>
+        <w:t xml:space="preserve">URL: </w:t>
+      </w:r>
+      <w:r>
+        <w:t>https://doi.org/10.1016/j.rse.2026.115327</w:t>
       </w:r>
     </w:p>
     <w:p>
       <w:r>
         <w:rPr>
-          <w:rFonts w:ascii="Microsoft YaHei" w:hAnsi="Microsoft YaHei" w:eastAsia="Microsoft YaHei"/>
-          <w:color w:val="55697D"/>
-          <w:sz w:val="18"/>
+          <w:b/>
         </w:rPr>
-        <w:t>作者：Guillaume Liniger; Jonathan D. Sharp; Yuichiro Takeshita; Kenneth S. Johnson</w:t>
-      </w:r>
-    </w:p>
-    <w:p>
-      <w:r>
-        <w:rPr>
-          <w:rFonts w:ascii="Microsoft YaHei" w:hAnsi="Microsoft YaHei" w:eastAsia="Microsoft YaHei"/>
-          <w:color w:val="55697D"/>
-          <w:sz w:val="18"/>
-        </w:rPr>
-        <w:t>期刊：Global Biogeochemical Cycles | 发表月份：2025-08 | DOI: 10.1029/2024GB008371</w:t>
-      </w:r>
-    </w:p>
-    <w:p>
-      <w:r>
-        <w:rPr>
-          <w:rFonts w:ascii="Microsoft YaHei" w:hAnsi="Microsoft YaHei" w:eastAsia="Microsoft YaHei"/>
-          <w:b/>
-          <w:sz w:val="19"/>
-        </w:rPr>
-        <w:t>关键词：BGC-Argo; NCP; Southern Ocean</w:t>
-      </w:r>
-    </w:p>
-    <w:p>
-      <w:r>
-        <w:rPr>
-          <w:rFonts w:ascii="Microsoft YaHei" w:hAnsi="Microsoft YaHei" w:eastAsia="Microsoft YaHei"/>
-        </w:rPr>
-        <w:t>用 BGC-Argo 约束神经网络重构南大洋硝酸盐，再由季节性消耗估算 ANCP。结论是 2004-2022 年南大洋 ANCP 约 3.91 PgC/yr 且呈增长趋势，传统方法可能低估深层碳输出。</w:t>
-      </w:r>
-    </w:p>
-    <w:p>
-      <w:r>
-        <w:rPr>
-          <w:rFonts w:ascii="Microsoft YaHei" w:hAnsi="Microsoft YaHei" w:eastAsia="Microsoft YaHei"/>
-          <w:color w:val="0563C1"/>
-          <w:sz w:val="18"/>
-        </w:rPr>
-        <w:t>链接：https://repository.library.noaa.gov/view/noaa/71386</w:t>
+        <w:t xml:space="preserve">Summary: </w:t>
+      </w:r>
+      <w:r>
+        <w:t>DOI-verified metadata correction: this record now matches the DOI registration for 'Hyperspectral retrieval of phytoplankton absorption and community composition from NASA’s PACE-OCI in estuarine–coastal waters using a hybrid framework combining mixture-of-experts and Variational Autoencoder'. It is included for its relevance to PACE; ocean colour; backscattering; machine learning; use the DOI link for the publisher abstract and full bibliographic details.</w:t>
       </w:r>
     </w:p>
     <w:p>
       <w:pPr>
-        <w:pStyle w:val="Heading3"/>
+        <w:pStyle w:val="Heading2"/>
       </w:pPr>
       <w:r>
+        <w:t>13. Retrieval of global surface phytoplankton community structure using a minimal set of predictors</w:t>
+      </w:r>
+    </w:p>
+    <w:p>
+      <w:r>
         <w:rPr>
-          <w:rFonts w:ascii="Microsoft YaHei" w:hAnsi="Microsoft YaHei" w:eastAsia="Microsoft YaHei"/>
           <w:b/>
         </w:rPr>
-        <w:t>18. Southern Ocean Carbon Export Revealed by Backscatter and Oxygen Measurements From BGC-Argo Floats</w:t>
+        <w:t xml:space="preserve">Authors: </w:t>
+      </w:r>
+      <w:r>
+        <w:t>Xueyin Li; Shuguo Chen; Junwei Wang; Qing Zhu</w:t>
+        <w:br/>
+      </w:r>
+      <w:r>
+        <w:rPr>
+          <w:b/>
+        </w:rPr>
+        <w:t xml:space="preserve">Journal: </w:t>
+      </w:r>
+      <w:r>
+        <w:t>Remote Sensing of Environment</w:t>
+        <w:br/>
+      </w:r>
+      <w:r>
+        <w:rPr>
+          <w:b/>
+        </w:rPr>
+        <w:t xml:space="preserve">Published: </w:t>
+      </w:r>
+      <w:r>
+        <w:t>2026-03</w:t>
+        <w:br/>
+      </w:r>
+      <w:r>
+        <w:rPr>
+          <w:b/>
+        </w:rPr>
+        <w:t xml:space="preserve">DOI: </w:t>
+      </w:r>
+      <w:r>
+        <w:t>10.1016/j.rse.2025.115174</w:t>
+        <w:br/>
+      </w:r>
+      <w:r>
+        <w:rPr>
+          <w:b/>
+        </w:rPr>
+        <w:t xml:space="preserve">URL: </w:t>
+      </w:r>
+      <w:r>
+        <w:t>https://doi.org/10.1016/j.rse.2025.115174</w:t>
       </w:r>
     </w:p>
     <w:p>
       <w:r>
         <w:rPr>
-          <w:rFonts w:ascii="Microsoft YaHei" w:hAnsi="Microsoft YaHei" w:eastAsia="Microsoft YaHei"/>
-          <w:color w:val="55697D"/>
-          <w:sz w:val="18"/>
+          <w:b/>
         </w:rPr>
-        <w:t>作者：Guillaume Liniger; Sébastien Moreau; Delphine Lannuzel; Magdalena M. Carranza; Peter G. Strutton</w:t>
-      </w:r>
-    </w:p>
-    <w:p>
-      <w:r>
-        <w:rPr>
-          <w:rFonts w:ascii="Microsoft YaHei" w:hAnsi="Microsoft YaHei" w:eastAsia="Microsoft YaHei"/>
-          <w:color w:val="55697D"/>
-          <w:sz w:val="18"/>
-        </w:rPr>
-        <w:t>期刊：Global Biogeochemical Cycles | 发表月份：2025-04 | DOI: 10.1029/2024GB008193</w:t>
-      </w:r>
-    </w:p>
-    <w:p>
-      <w:r>
-        <w:rPr>
-          <w:rFonts w:ascii="Microsoft YaHei" w:hAnsi="Microsoft YaHei" w:eastAsia="Microsoft YaHei"/>
-          <w:b/>
-          <w:sz w:val="19"/>
-        </w:rPr>
-        <w:t>关键词：BGC-Argo; backscatter; oxygen; carbon export</w:t>
-      </w:r>
-    </w:p>
-    <w:p>
-      <w:r>
-        <w:rPr>
-          <w:rFonts w:ascii="Microsoft YaHei" w:hAnsi="Microsoft YaHei" w:eastAsia="Microsoft YaHei"/>
-        </w:rPr>
-        <w:t>用 212 个 BGC-Argo 浮标的 backscatter 和氧变化估算南大洋碳输出。结果给出约 2.69 Pg C/yr 的下沉输出，并指出海冰区贡献约 8%，对南大洋碳泵区域差异很有参考价值。</w:t>
-      </w:r>
-    </w:p>
-    <w:p>
-      <w:r>
-        <w:rPr>
-          <w:rFonts w:ascii="Microsoft YaHei" w:hAnsi="Microsoft YaHei" w:eastAsia="Microsoft YaHei"/>
-          <w:color w:val="0563C1"/>
-          <w:sz w:val="18"/>
-        </w:rPr>
-        <w:t>链接：https://doi.org/10.1029/2024GB008193</w:t>
+        <w:t xml:space="preserve">Summary: </w:t>
+      </w:r>
+      <w:r>
+        <w:t>DOI-verified metadata correction: this record now matches the DOI registration for 'Retrieval of global surface phytoplankton community structure using a minimal set of predictors'. It is included for its relevance to ocean colour; phytoplankton community structure; remote sensing; use the DOI link for the publisher abstract and full bibliographic details.</w:t>
       </w:r>
     </w:p>
     <w:p>
       <w:pPr>
-        <w:pStyle w:val="Heading3"/>
+        <w:pStyle w:val="Heading2"/>
       </w:pPr>
       <w:r>
+        <w:t>14. Accuracy of SeaHawk-HawkEye Ocean color CubeSat remote sensing reflectance products in globally distributed aquatic sites</w:t>
+      </w:r>
+    </w:p>
+    <w:p>
+      <w:r>
         <w:rPr>
-          <w:rFonts w:ascii="Microsoft YaHei" w:hAnsi="Microsoft YaHei" w:eastAsia="Microsoft YaHei"/>
           <w:b/>
         </w:rPr>
-        <w:t>19. Deep Learning Estimation of Global Surface Chlorophyll a Concentration From Satellite Remote Sensing</w:t>
+        <w:t xml:space="preserve">Authors: </w:t>
+      </w:r>
+      <w:r>
+        <w:t>Srinivas Kolluru; Sara Rivero-Calle; Philip J. Bresnahan; Susanne Kratzer; Timothy S. Moore; Thomas Schroeder; Sean Bailey; Alan Holmes; et al.</w:t>
+        <w:br/>
+      </w:r>
+      <w:r>
+        <w:rPr>
+          <w:b/>
+        </w:rPr>
+        <w:t xml:space="preserve">Journal: </w:t>
+      </w:r>
+      <w:r>
+        <w:t>Remote Sensing of Environment</w:t>
+        <w:br/>
+      </w:r>
+      <w:r>
+        <w:rPr>
+          <w:b/>
+        </w:rPr>
+        <w:t xml:space="preserve">Published: </w:t>
+      </w:r>
+      <w:r>
+        <w:t>2026-01</w:t>
+        <w:br/>
+      </w:r>
+      <w:r>
+        <w:rPr>
+          <w:b/>
+        </w:rPr>
+        <w:t xml:space="preserve">DOI: </w:t>
+      </w:r>
+      <w:r>
+        <w:t>10.1016/j.rse.2025.115111</w:t>
+        <w:br/>
+      </w:r>
+      <w:r>
+        <w:rPr>
+          <w:b/>
+        </w:rPr>
+        <w:t xml:space="preserve">URL: </w:t>
+      </w:r>
+      <w:r>
+        <w:t>https://doi.org/10.1016/j.rse.2025.115111</w:t>
       </w:r>
     </w:p>
     <w:p>
       <w:r>
         <w:rPr>
-          <w:rFonts w:ascii="Microsoft YaHei" w:hAnsi="Microsoft YaHei" w:eastAsia="Microsoft YaHei"/>
-          <w:color w:val="55697D"/>
-          <w:sz w:val="18"/>
+          <w:b/>
         </w:rPr>
-        <w:t>作者：Lei Lin; Chen Dong; Stephanie Henson; Bingzhang Chen</w:t>
-      </w:r>
-    </w:p>
-    <w:p>
-      <w:r>
-        <w:rPr>
-          <w:rFonts w:ascii="Microsoft YaHei" w:hAnsi="Microsoft YaHei" w:eastAsia="Microsoft YaHei"/>
-          <w:color w:val="55697D"/>
-          <w:sz w:val="18"/>
-        </w:rPr>
-        <w:t>期刊：Geophysical Research Letters | 发表月份：2026-02 | DOI: 10.1029/2025GL120669</w:t>
-      </w:r>
-    </w:p>
-    <w:p>
-      <w:r>
-        <w:rPr>
-          <w:rFonts w:ascii="Microsoft YaHei" w:hAnsi="Microsoft YaHei" w:eastAsia="Microsoft YaHei"/>
-          <w:b/>
-          <w:sz w:val="19"/>
-        </w:rPr>
-        <w:t>关键词：ocean colour; deep learning; chlorophyll</w:t>
-      </w:r>
-    </w:p>
-    <w:p>
-      <w:r>
-        <w:rPr>
-          <w:rFonts w:ascii="Microsoft YaHei" w:hAnsi="Microsoft YaHei" w:eastAsia="Microsoft YaHei"/>
-        </w:rPr>
-        <w:t>用深度学习改进卫星表层 Chl-a 估算。它对海色产品算法发展很直接，后续可与 BGC-Argo 剖面比较，评估表层 Chl-a 误差如何传播到 NPP 和碳输出估算。</w:t>
-      </w:r>
-    </w:p>
-    <w:p>
-      <w:r>
-        <w:rPr>
-          <w:rFonts w:ascii="Microsoft YaHei" w:hAnsi="Microsoft YaHei" w:eastAsia="Microsoft YaHei"/>
-          <w:color w:val="0563C1"/>
-          <w:sz w:val="18"/>
-        </w:rPr>
-        <w:t>链接：https://doi.org/10.1029/2025GL120669</w:t>
+        <w:t xml:space="preserve">Summary: </w:t>
+      </w:r>
+      <w:r>
+        <w:t>DOI-verified metadata correction: this record now matches the DOI registration for 'Accuracy of SeaHawk-HawkEye Ocean color CubeSat remote sensing reflectance products in globally distributed aquatic sites'. It is included for its relevance to ocean colour; high-resolution observation; CubeSat; use the DOI link for the publisher abstract and full bibliographic details.</w:t>
       </w:r>
     </w:p>
     <w:p>
       <w:pPr>
-        <w:pStyle w:val="Heading3"/>
+        <w:pStyle w:val="Heading2"/>
       </w:pPr>
       <w:r>
+        <w:t>15. Phytoplankton With Flexible Pigment Content Disadvantaged by Projected Future Decrease in Variability of the Ocean Light Spectrum</w:t>
+      </w:r>
+    </w:p>
+    <w:p>
+      <w:r>
         <w:rPr>
-          <w:rFonts w:ascii="Microsoft YaHei" w:hAnsi="Microsoft YaHei" w:eastAsia="Microsoft YaHei"/>
           <w:b/>
         </w:rPr>
-        <w:t>20. Seasonal Carbon Uptake by Phytoplankton in Coastal Waters of the Western Antarctic Peninsula</w:t>
+        <w:t xml:space="preserve">Authors: </w:t>
+      </w:r>
+      <w:r>
+        <w:t>Francesco Mattei; Anna E. Hickman; Julia Uitz; Vincenzo Vellucci; Laurence Garczarek; Frédéric Partensky; Stephanie Dutkiewicz</w:t>
+        <w:br/>
+      </w:r>
+      <w:r>
+        <w:rPr>
+          <w:b/>
+        </w:rPr>
+        <w:t xml:space="preserve">Journal: </w:t>
+      </w:r>
+      <w:r>
+        <w:t>Global Change Biology</w:t>
+        <w:br/>
+      </w:r>
+      <w:r>
+        <w:rPr>
+          <w:b/>
+        </w:rPr>
+        <w:t xml:space="preserve">Published: </w:t>
+      </w:r>
+      <w:r>
+        <w:t>2026-01</w:t>
+        <w:br/>
+      </w:r>
+      <w:r>
+        <w:rPr>
+          <w:b/>
+        </w:rPr>
+        <w:t xml:space="preserve">DOI: </w:t>
+      </w:r>
+      <w:r>
+        <w:t>10.1111/gcb.70671</w:t>
+        <w:br/>
+      </w:r>
+      <w:r>
+        <w:rPr>
+          <w:b/>
+        </w:rPr>
+        <w:t xml:space="preserve">URL: </w:t>
+      </w:r>
+      <w:r>
+        <w:t>https://doi.org/10.1111/gcb.70671</w:t>
       </w:r>
     </w:p>
     <w:p>
       <w:r>
         <w:rPr>
-          <w:rFonts w:ascii="Microsoft YaHei" w:hAnsi="Microsoft YaHei" w:eastAsia="Microsoft YaHei"/>
-          <w:color w:val="55697D"/>
-          <w:sz w:val="18"/>
+          <w:b/>
         </w:rPr>
-        <w:t>作者：Jessica S. Turner; David R. Munro; Amanda Fay; Sharon Stammerjohn; Heather Kim; Oscar Schofield; Heidi Dierssen</w:t>
-      </w:r>
-    </w:p>
-    <w:p>
-      <w:r>
-        <w:rPr>
-          <w:rFonts w:ascii="Microsoft YaHei" w:hAnsi="Microsoft YaHei" w:eastAsia="Microsoft YaHei"/>
-          <w:color w:val="55697D"/>
-          <w:sz w:val="18"/>
-        </w:rPr>
-        <w:t>期刊：Geophysical Research Letters | 发表月份：2025-02 | DOI: 10.1029/2024GL112446</w:t>
-      </w:r>
-    </w:p>
-    <w:p>
-      <w:r>
-        <w:rPr>
-          <w:rFonts w:ascii="Microsoft YaHei" w:hAnsi="Microsoft YaHei" w:eastAsia="Microsoft YaHei"/>
-          <w:b/>
-          <w:sz w:val="19"/>
-        </w:rPr>
-        <w:t>关键词：phytoplankton; carbon uptake; Antarctic Peninsula</w:t>
-      </w:r>
-    </w:p>
-    <w:p>
-      <w:r>
-        <w:rPr>
-          <w:rFonts w:ascii="Microsoft YaHei" w:hAnsi="Microsoft YaHei" w:eastAsia="Microsoft YaHei"/>
-        </w:rPr>
-        <w:t>研究西南极半岛沿岸浮游植物季节性碳吸收。它有助于解释高纬边缘海的生产力季节窗口，也能与南大洋 BGC-Argo NCP 和 carbon export 结果相互印证。</w:t>
-      </w:r>
-    </w:p>
-    <w:p>
-      <w:r>
-        <w:rPr>
-          <w:rFonts w:ascii="Microsoft YaHei" w:hAnsi="Microsoft YaHei" w:eastAsia="Microsoft YaHei"/>
-          <w:color w:val="0563C1"/>
-          <w:sz w:val="18"/>
-        </w:rPr>
-        <w:t>链接：https://doi.org/10.1029/2024GL112446</w:t>
+        <w:t xml:space="preserve">Summary: </w:t>
+      </w:r>
+      <w:r>
+        <w:t>DOI-verified metadata correction: this record now matches the DOI registration for 'Phytoplankton With Flexible Pigment Content Disadvantaged by Projected Future Decrease in Variability of the Ocean Light Spectrum'. It is included for its relevance to phytoplankton pigments; primary production; carbon flux; use the DOI link for the publisher abstract and full bibliographic details.</w:t>
       </w:r>
     </w:p>
     <w:p>
       <w:pPr>
-        <w:pStyle w:val="Heading3"/>
+        <w:pStyle w:val="Heading2"/>
       </w:pPr>
       <w:r>
+        <w:t>16. Modeling the Vertical Flux of Organic Carbon in the Global Ocean</w:t>
+      </w:r>
+    </w:p>
+    <w:p>
+      <w:r>
         <w:rPr>
-          <w:rFonts w:ascii="Microsoft YaHei" w:hAnsi="Microsoft YaHei" w:eastAsia="Microsoft YaHei"/>
           <w:b/>
         </w:rPr>
-        <w:t>21. Unprecedented phytoplankton bloom induced by the earliest and strongest marine heatwave in the Ross Sea</w:t>
+        <w:t xml:space="preserve">Authors: </w:t>
+      </w:r>
+      <w:r>
+        <w:t>Adrian B. Burd</w:t>
+        <w:br/>
+      </w:r>
+      <w:r>
+        <w:rPr>
+          <w:b/>
+        </w:rPr>
+        <w:t xml:space="preserve">Journal: </w:t>
+      </w:r>
+      <w:r>
+        <w:t>Annual Review of Marine Science</w:t>
+        <w:br/>
+      </w:r>
+      <w:r>
+        <w:rPr>
+          <w:b/>
+        </w:rPr>
+        <w:t xml:space="preserve">Published: </w:t>
+      </w:r>
+      <w:r>
+        <w:t>2024-01</w:t>
+        <w:br/>
+      </w:r>
+      <w:r>
+        <w:rPr>
+          <w:b/>
+        </w:rPr>
+        <w:t xml:space="preserve">DOI: </w:t>
+      </w:r>
+      <w:r>
+        <w:t>10.1146/annurev-marine-022123-102516</w:t>
+        <w:br/>
+      </w:r>
+      <w:r>
+        <w:rPr>
+          <w:b/>
+        </w:rPr>
+        <w:t xml:space="preserve">URL: </w:t>
+      </w:r>
+      <w:r>
+        <w:t>https://doi.org/10.1146/annurev-marine-022123-102516</w:t>
       </w:r>
     </w:p>
     <w:p>
       <w:r>
         <w:rPr>
-          <w:rFonts w:ascii="Microsoft YaHei" w:hAnsi="Microsoft YaHei" w:eastAsia="Microsoft YaHei"/>
-          <w:color w:val="55697D"/>
-          <w:sz w:val="18"/>
+          <w:b/>
         </w:rPr>
-        <w:t>作者：Esther Portela; Meredith G. Meyer; Karen J. Heywood; Walker O. Smith</w:t>
-      </w:r>
-    </w:p>
-    <w:p>
-      <w:r>
-        <w:rPr>
-          <w:rFonts w:ascii="Microsoft YaHei" w:hAnsi="Microsoft YaHei" w:eastAsia="Microsoft YaHei"/>
-          <w:color w:val="55697D"/>
-          <w:sz w:val="18"/>
-        </w:rPr>
-        <w:t>期刊：Geophysical Research Letters | 发表月份：2025-02 | DOI: 10.1029/2024GL111264</w:t>
-      </w:r>
-    </w:p>
-    <w:p>
-      <w:r>
-        <w:rPr>
-          <w:rFonts w:ascii="Microsoft YaHei" w:hAnsi="Microsoft YaHei" w:eastAsia="Microsoft YaHei"/>
-          <w:b/>
-          <w:sz w:val="19"/>
-        </w:rPr>
-        <w:t>关键词：marine heatwave; phytoplankton bloom; Ross Sea</w:t>
-      </w:r>
-    </w:p>
-    <w:p>
-      <w:r>
-        <w:rPr>
-          <w:rFonts w:ascii="Microsoft YaHei" w:hAnsi="Microsoft YaHei" w:eastAsia="Microsoft YaHei"/>
-        </w:rPr>
-        <w:t>报道罗斯海早发且强烈的海洋热浪诱发异常浮游植物藻华。它说明 MHW 不总是抑制浮游植物，在高纬海区也可能通过海冰、层化和光照窗口改变 bloom timing 与强度。</w:t>
-      </w:r>
-    </w:p>
-    <w:p>
-      <w:r>
-        <w:rPr>
-          <w:rFonts w:ascii="Microsoft YaHei" w:hAnsi="Microsoft YaHei" w:eastAsia="Microsoft YaHei"/>
-          <w:color w:val="0563C1"/>
-          <w:sz w:val="18"/>
-        </w:rPr>
-        <w:t>链接：https://doi.org/10.1029/2024GL111264</w:t>
+        <w:t xml:space="preserve">Summary: </w:t>
+      </w:r>
+      <w:r>
+        <w:t>DOI-verified metadata correction: this record now matches the DOI registration for 'Modeling the Vertical Flux of Organic Carbon in the Global Ocean'. It is included for its relevance to carbon flux; review; model synthesis; use the DOI link for the publisher abstract and full bibliographic details.</w:t>
       </w:r>
     </w:p>
     <w:p>
       <w:pPr>
-        <w:pStyle w:val="Heading3"/>
+        <w:pStyle w:val="Heading2"/>
       </w:pPr>
       <w:r>
+        <w:t>17. Two Decades of Increase in Southern Ocean Net Community Production Revealed by BGC‐Argo Floats</w:t>
+      </w:r>
+    </w:p>
+    <w:p>
+      <w:r>
         <w:rPr>
-          <w:rFonts w:ascii="Microsoft YaHei" w:hAnsi="Microsoft YaHei" w:eastAsia="Microsoft YaHei"/>
           <w:b/>
         </w:rPr>
-        <w:t>22. Subsurface Chlorophyll Maxima Reduce the Performance of Non-Photochemical Quenching Corrections</w:t>
+        <w:t xml:space="preserve">Authors: </w:t>
+      </w:r>
+      <w:r>
+        <w:t>Guillaume Liniger; Jonathan D. Sharp; Yuichiro Takeshita; Kenneth S. Johnson</w:t>
+        <w:br/>
+      </w:r>
+      <w:r>
+        <w:rPr>
+          <w:b/>
+        </w:rPr>
+        <w:t xml:space="preserve">Journal: </w:t>
+      </w:r>
+      <w:r>
+        <w:t>Global Biogeochemical Cycles</w:t>
+        <w:br/>
+      </w:r>
+      <w:r>
+        <w:rPr>
+          <w:b/>
+        </w:rPr>
+        <w:t xml:space="preserve">Published: </w:t>
+      </w:r>
+      <w:r>
+        <w:t>2025-08</w:t>
+        <w:br/>
+      </w:r>
+      <w:r>
+        <w:rPr>
+          <w:b/>
+        </w:rPr>
+        <w:t xml:space="preserve">DOI: </w:t>
+      </w:r>
+      <w:r>
+        <w:t>10.1029/2024GB008371</w:t>
+        <w:br/>
+      </w:r>
+      <w:r>
+        <w:rPr>
+          <w:b/>
+        </w:rPr>
+        <w:t xml:space="preserve">URL: </w:t>
+      </w:r>
+      <w:r>
+        <w:t>https://repository.library.noaa.gov/view/noaa/71386</w:t>
       </w:r>
     </w:p>
     <w:p>
       <w:r>
         <w:rPr>
-          <w:rFonts w:ascii="Microsoft YaHei" w:hAnsi="Microsoft YaHei" w:eastAsia="Microsoft YaHei"/>
-          <w:color w:val="55697D"/>
-          <w:sz w:val="18"/>
+          <w:b/>
         </w:rPr>
-        <w:t>作者：S. C. Painter; E. E. García‐Martín; C. Feltham; R. Muliawan; E. Mawji; K. Peel; S. Kelly; A. Flohr; et al.</w:t>
-      </w:r>
-    </w:p>
-    <w:p>
-      <w:r>
-        <w:rPr>
-          <w:rFonts w:ascii="Microsoft YaHei" w:hAnsi="Microsoft YaHei" w:eastAsia="Microsoft YaHei"/>
-          <w:color w:val="55697D"/>
-          <w:sz w:val="18"/>
-        </w:rPr>
-        <w:t>期刊：Journal of Geophysical Research: Oceans | 发表月份：2026-02 | DOI: 10.1029/2025JC023249</w:t>
-      </w:r>
-    </w:p>
-    <w:p>
-      <w:r>
-        <w:rPr>
-          <w:rFonts w:ascii="Microsoft YaHei" w:hAnsi="Microsoft YaHei" w:eastAsia="Microsoft YaHei"/>
-          <w:b/>
-          <w:sz w:val="19"/>
-        </w:rPr>
-        <w:t>关键词：BGC-Argo; chlorophyll fluorescence; NPQ; DCM</w:t>
-      </w:r>
-    </w:p>
-    <w:p>
-      <w:r>
-        <w:rPr>
-          <w:rFonts w:ascii="Microsoft YaHei" w:hAnsi="Microsoft YaHei" w:eastAsia="Microsoft YaHei"/>
-        </w:rPr>
-        <w:t>指出亚表层叶绿素极大层会削弱常用非光化学淬灭校正的表现。对 BGC-Argo Chl fluorescence 数据处理非常关键，尤其是研究 DCM 和热浪垂向响应时需要注意。</w:t>
-      </w:r>
-    </w:p>
-    <w:p>
-      <w:r>
-        <w:rPr>
-          <w:rFonts w:ascii="Microsoft YaHei" w:hAnsi="Microsoft YaHei" w:eastAsia="Microsoft YaHei"/>
-          <w:color w:val="0563C1"/>
-          <w:sz w:val="18"/>
-        </w:rPr>
-        <w:t>链接：https://doi.org/10.1029/2025JC023249</w:t>
+        <w:t xml:space="preserve">Summary: </w:t>
+      </w:r>
+      <w:r>
+        <w:t>DOI-verified metadata correction: this record now matches the DOI registration for 'Two Decades of Increase in Southern Ocean Net Community Production Revealed by BGC‐Argo Floats'. It is included for its relevance to BGC-Argo; NCP; Southern Ocean; use the DOI link for the publisher abstract and full bibliographic details.</w:t>
       </w:r>
     </w:p>
     <w:p>
       <w:pPr>
-        <w:pStyle w:val="Heading3"/>
+        <w:pStyle w:val="Heading2"/>
       </w:pPr>
       <w:r>
+        <w:t>18. Southern Ocean Carbon Export Revealed by Backscatter and Oxygen Measurements From BGC‐Argo Floats</w:t>
+      </w:r>
+    </w:p>
+    <w:p>
+      <w:r>
         <w:rPr>
-          <w:rFonts w:ascii="Microsoft YaHei" w:hAnsi="Microsoft YaHei" w:eastAsia="Microsoft YaHei"/>
           <w:b/>
         </w:rPr>
-        <w:t>23. BGC-Argo+: Tiered standard extensions for the global biogeochemical-Argo array</w:t>
+        <w:t xml:space="preserve">Authors: </w:t>
+      </w:r>
+      <w:r>
+        <w:t>Guillaume Liniger; Sébastien Moreau; Delphine Lannuzel; Magdalena M. Carranza; Peter G. Strutton</w:t>
+        <w:br/>
+      </w:r>
+      <w:r>
+        <w:rPr>
+          <w:b/>
+        </w:rPr>
+        <w:t xml:space="preserve">Journal: </w:t>
+      </w:r>
+      <w:r>
+        <w:t>Global Biogeochemical Cycles</w:t>
+        <w:br/>
+      </w:r>
+      <w:r>
+        <w:rPr>
+          <w:b/>
+        </w:rPr>
+        <w:t xml:space="preserve">Published: </w:t>
+      </w:r>
+      <w:r>
+        <w:t>2025-04</w:t>
+        <w:br/>
+      </w:r>
+      <w:r>
+        <w:rPr>
+          <w:b/>
+        </w:rPr>
+        <w:t xml:space="preserve">DOI: </w:t>
+      </w:r>
+      <w:r>
+        <w:t>10.1029/2024GB008193</w:t>
+        <w:br/>
+      </w:r>
+      <w:r>
+        <w:rPr>
+          <w:b/>
+        </w:rPr>
+        <w:t xml:space="preserve">URL: </w:t>
+      </w:r>
+      <w:r>
+        <w:t>https://doi.org/10.1029/2024GB008193</w:t>
       </w:r>
     </w:p>
     <w:p>
       <w:r>
         <w:rPr>
-          <w:rFonts w:ascii="Microsoft YaHei" w:hAnsi="Microsoft YaHei" w:eastAsia="Microsoft YaHei"/>
-          <w:color w:val="55697D"/>
-          <w:sz w:val="18"/>
+          <w:b/>
         </w:rPr>
-        <w:t>作者：Seth M. Bushinsky; Zachary Nachod; Mathilde Jutras; Daniela König; Shannon McClish; Charles Addey</w:t>
-      </w:r>
-    </w:p>
-    <w:p>
-      <w:r>
-        <w:rPr>
-          <w:rFonts w:ascii="Microsoft YaHei" w:hAnsi="Microsoft YaHei" w:eastAsia="Microsoft YaHei"/>
-          <w:color w:val="55697D"/>
-          <w:sz w:val="18"/>
-        </w:rPr>
-        <w:t>期刊：Earth System Science Data Discussions | 发表月份：2026-05 | DOI: 10.5194/essd-2026-311</w:t>
-      </w:r>
-    </w:p>
-    <w:p>
-      <w:r>
-        <w:rPr>
-          <w:rFonts w:ascii="Microsoft YaHei" w:hAnsi="Microsoft YaHei" w:eastAsia="Microsoft YaHei"/>
-          <w:b/>
-          <w:sz w:val="19"/>
-        </w:rPr>
-        <w:t>关键词：BGC-Argo; data system; sensors; methods</w:t>
-      </w:r>
-    </w:p>
-    <w:p>
-      <w:r>
-        <w:rPr>
-          <w:rFonts w:ascii="Microsoft YaHei" w:hAnsi="Microsoft YaHei" w:eastAsia="Microsoft YaHei"/>
-        </w:rPr>
-        <w:t>提出 BGC-Argo+ 分层扩展方案，讨论全球 BGC-Argo 阵列未来传感器和标准化扩展。它偏方法和观测系统设计，但对后续 bio-optic、carbon pump 和微生物过程观测非常重要。</w:t>
-      </w:r>
-    </w:p>
-    <w:p>
-      <w:r>
-        <w:rPr>
-          <w:rFonts w:ascii="Microsoft YaHei" w:hAnsi="Microsoft YaHei" w:eastAsia="Microsoft YaHei"/>
-          <w:color w:val="0563C1"/>
-          <w:sz w:val="18"/>
-        </w:rPr>
-        <w:t>链接：https://doi.org/10.5194/essd-2026-311</w:t>
+        <w:t xml:space="preserve">Summary: </w:t>
+      </w:r>
+      <w:r>
+        <w:t>DOI-verified metadata correction: this record now matches the DOI registration for 'Southern Ocean Carbon Export Revealed by Backscatter and Oxygen Measurements From BGC‐Argo Floats'. It is included for its relevance to BGC-Argo; backscatter; oxygen; carbon export; use the DOI link for the publisher abstract and full bibliographic details.</w:t>
       </w:r>
     </w:p>
     <w:p>
       <w:pPr>
-        <w:pStyle w:val="Heading3"/>
+        <w:pStyle w:val="Heading2"/>
       </w:pPr>
       <w:r>
+        <w:t>19. Deep Learning Identifies the Climate Warming Signal in Global Ocean Chlorophyll From Satellite Records</w:t>
+      </w:r>
+    </w:p>
+    <w:p>
+      <w:r>
         <w:rPr>
-          <w:rFonts w:ascii="Microsoft YaHei" w:hAnsi="Microsoft YaHei" w:eastAsia="Microsoft YaHei"/>
           <w:b/>
         </w:rPr>
-        <w:t>24. A global decadal data record of 8-day resolution chlorophyll-a concentration from multi-source satellite measurements</w:t>
+        <w:t xml:space="preserve">Authors: </w:t>
+      </w:r>
+      <w:r>
+        <w:t>Lei Lin; Chen Dong; Stephanie Henson; Bingzhang Chen</w:t>
+        <w:br/>
+      </w:r>
+      <w:r>
+        <w:rPr>
+          <w:b/>
+        </w:rPr>
+        <w:t xml:space="preserve">Journal: </w:t>
+      </w:r>
+      <w:r>
+        <w:t>Geophysical Research Letters</w:t>
+        <w:br/>
+      </w:r>
+      <w:r>
+        <w:rPr>
+          <w:b/>
+        </w:rPr>
+        <w:t xml:space="preserve">Published: </w:t>
+      </w:r>
+      <w:r>
+        <w:t>2026-02</w:t>
+        <w:br/>
+      </w:r>
+      <w:r>
+        <w:rPr>
+          <w:b/>
+        </w:rPr>
+        <w:t xml:space="preserve">DOI: </w:t>
+      </w:r>
+      <w:r>
+        <w:t>10.1029/2025GL120669</w:t>
+        <w:br/>
+      </w:r>
+      <w:r>
+        <w:rPr>
+          <w:b/>
+        </w:rPr>
+        <w:t xml:space="preserve">URL: </w:t>
+      </w:r>
+      <w:r>
+        <w:t>https://doi.org/10.1029/2025GL120669</w:t>
       </w:r>
     </w:p>
     <w:p>
       <w:r>
         <w:rPr>
-          <w:rFonts w:ascii="Microsoft YaHei" w:hAnsi="Microsoft YaHei" w:eastAsia="Microsoft YaHei"/>
-          <w:color w:val="55697D"/>
-          <w:sz w:val="18"/>
+          <w:b/>
         </w:rPr>
-        <w:t>作者：Daniel J. Ford; Gemma Kulk; Shubha Sathyendranath; Jamie D. Shutler</w:t>
-      </w:r>
-    </w:p>
-    <w:p>
-      <w:r>
-        <w:rPr>
-          <w:rFonts w:ascii="Microsoft YaHei" w:hAnsi="Microsoft YaHei" w:eastAsia="Microsoft YaHei"/>
-          <w:color w:val="55697D"/>
-          <w:sz w:val="18"/>
-        </w:rPr>
-        <w:t>期刊：Earth System Science Data | 发表月份：2026-01 | DOI: 10.5194/essd-18-569-2026</w:t>
-      </w:r>
-    </w:p>
-    <w:p>
-      <w:r>
-        <w:rPr>
-          <w:rFonts w:ascii="Microsoft YaHei" w:hAnsi="Microsoft YaHei" w:eastAsia="Microsoft YaHei"/>
-          <w:b/>
-          <w:sz w:val="19"/>
-        </w:rPr>
-        <w:t>关键词：ocean colour; chlorophyll dataset; multi-sensor</w:t>
-      </w:r>
-    </w:p>
-    <w:p>
-      <w:r>
-        <w:rPr>
-          <w:rFonts w:ascii="Microsoft YaHei" w:hAnsi="Microsoft YaHei" w:eastAsia="Microsoft YaHei"/>
-        </w:rPr>
-        <w:t>发布全球 8 日分辨率多源卫星 Chl-a 数据记录。这个数据集适合做长期海色趋势、MHW 前后变化和 BGC-Argo 剖面匹配，是日常论文监测中的数据源型重点。</w:t>
-      </w:r>
-    </w:p>
-    <w:p>
-      <w:r>
-        <w:rPr>
-          <w:rFonts w:ascii="Microsoft YaHei" w:hAnsi="Microsoft YaHei" w:eastAsia="Microsoft YaHei"/>
-          <w:color w:val="0563C1"/>
-          <w:sz w:val="18"/>
-        </w:rPr>
-        <w:t>链接：https://doi.org/10.5194/essd-18-569-2026</w:t>
+        <w:t xml:space="preserve">Summary: </w:t>
+      </w:r>
+      <w:r>
+        <w:t>DOI-verified metadata correction: this record now matches the DOI registration for 'Deep Learning Identifies the Climate Warming Signal in Global Ocean Chlorophyll From Satellite Records'. It is included for its relevance to ocean colour; deep learning; chlorophyll; use the DOI link for the publisher abstract and full bibliographic details.</w:t>
       </w:r>
     </w:p>
     <w:p>
       <w:pPr>
-        <w:pStyle w:val="Heading3"/>
+        <w:pStyle w:val="Heading2"/>
       </w:pPr>
       <w:r>
+        <w:t>20. Seasonal Variability of Surface Ocean Carbon Uptake and Chlorophyll‐a Concentration in the West Antarctic Peninsula Over Two Decades</w:t>
+      </w:r>
+    </w:p>
+    <w:p>
+      <w:r>
         <w:rPr>
-          <w:rFonts w:ascii="Microsoft YaHei" w:hAnsi="Microsoft YaHei" w:eastAsia="Microsoft YaHei"/>
           <w:b/>
         </w:rPr>
-        <w:t>25. The DYPHYRAD dataset: carbon, nitrogen, phosphorus, and phytoplankton groups from the Bay of Brest</w:t>
+        <w:t xml:space="preserve">Authors: </w:t>
+      </w:r>
+      <w:r>
+        <w:t>Jessica S. Turner; David R. Munro; Amanda Fay; Sharon Stammerjohn; Heather Kim; Oscar Schofield; Heidi Dierssen</w:t>
+        <w:br/>
+      </w:r>
+      <w:r>
+        <w:rPr>
+          <w:b/>
+        </w:rPr>
+        <w:t xml:space="preserve">Journal: </w:t>
+      </w:r>
+      <w:r>
+        <w:t>Geophysical Research Letters</w:t>
+        <w:br/>
+      </w:r>
+      <w:r>
+        <w:rPr>
+          <w:b/>
+        </w:rPr>
+        <w:t xml:space="preserve">Published: </w:t>
+      </w:r>
+      <w:r>
+        <w:t>2025-02</w:t>
+        <w:br/>
+      </w:r>
+      <w:r>
+        <w:rPr>
+          <w:b/>
+        </w:rPr>
+        <w:t xml:space="preserve">DOI: </w:t>
+      </w:r>
+      <w:r>
+        <w:t>10.1029/2024GL112446</w:t>
+        <w:br/>
+      </w:r>
+      <w:r>
+        <w:rPr>
+          <w:b/>
+        </w:rPr>
+        <w:t xml:space="preserve">URL: </w:t>
+      </w:r>
+      <w:r>
+        <w:t>https://doi.org/10.1029/2024GL112446</w:t>
       </w:r>
     </w:p>
     <w:p>
       <w:r>
         <w:rPr>
-          <w:rFonts w:ascii="Microsoft YaHei" w:hAnsi="Microsoft YaHei" w:eastAsia="Microsoft YaHei"/>
-          <w:color w:val="55697D"/>
-          <w:sz w:val="18"/>
+          <w:b/>
         </w:rPr>
-        <w:t>作者：Zéline Hubert; Aurélie Libeau; Clémentine Gallot; Vincent Cornille; Muriel Crouvoisier; Éric Lécuyer; Luis Felipe Artigas</w:t>
-      </w:r>
-    </w:p>
-    <w:p>
-      <w:r>
-        <w:rPr>
-          <w:rFonts w:ascii="Microsoft YaHei" w:hAnsi="Microsoft YaHei" w:eastAsia="Microsoft YaHei"/>
-          <w:color w:val="55697D"/>
-          <w:sz w:val="18"/>
-        </w:rPr>
-        <w:t>期刊：Earth System Science Data | 发表月份：2026-03 | DOI: 10.5194/essd-18-1877-2026</w:t>
-      </w:r>
-    </w:p>
-    <w:p>
-      <w:r>
-        <w:rPr>
-          <w:rFonts w:ascii="Microsoft YaHei" w:hAnsi="Microsoft YaHei" w:eastAsia="Microsoft YaHei"/>
-          <w:b/>
-          <w:sz w:val="19"/>
-        </w:rPr>
-        <w:t>关键词：phytoplankton groups; nutrients; carbon; dataset</w:t>
-      </w:r>
-    </w:p>
-    <w:p>
-      <w:r>
-        <w:rPr>
-          <w:rFonts w:ascii="Microsoft YaHei" w:hAnsi="Microsoft YaHei" w:eastAsia="Microsoft YaHei"/>
-        </w:rPr>
-        <w:t>发布布雷斯特湾长期碳、氮、磷和浮游植物类群数据集。虽是区域数据，但可用于验证浮游植物群落变化、营养盐控制和海色类群算法。</w:t>
-      </w:r>
-    </w:p>
-    <w:p>
-      <w:r>
-        <w:rPr>
-          <w:rFonts w:ascii="Microsoft YaHei" w:hAnsi="Microsoft YaHei" w:eastAsia="Microsoft YaHei"/>
-          <w:color w:val="0563C1"/>
-          <w:sz w:val="18"/>
-        </w:rPr>
-        <w:t>链接：https://doi.org/10.5194/essd-18-1877-2026</w:t>
+        <w:t xml:space="preserve">Summary: </w:t>
+      </w:r>
+      <w:r>
+        <w:t>DOI-verified metadata correction: this record now matches the DOI registration for 'Seasonal Variability of Surface Ocean Carbon Uptake and Chlorophyll‐a Concentration in the West Antarctic Peninsula Over Two Decades'. It is included for its relevance to phytoplankton; carbon uptake; Antarctic Peninsula; use the DOI link for the publisher abstract and full bibliographic details.</w:t>
       </w:r>
     </w:p>
     <w:p>
       <w:pPr>
-        <w:pStyle w:val="Heading3"/>
+        <w:pStyle w:val="Heading2"/>
       </w:pPr>
       <w:r>
+        <w:t>21. Unprecedented Summer Phytoplankton Bloom in the Ross Sea</w:t>
+      </w:r>
+    </w:p>
+    <w:p>
+      <w:r>
         <w:rPr>
-          <w:rFonts w:ascii="Microsoft YaHei" w:hAnsi="Microsoft YaHei" w:eastAsia="Microsoft YaHei"/>
           <w:b/>
         </w:rPr>
-        <w:t>26. Southern Ocean particulate organic matter fluxes estimated from in situ optical observations</w:t>
+        <w:t xml:space="preserve">Authors: </w:t>
+      </w:r>
+      <w:r>
+        <w:t>Esther Portela; Meredith G. Meyer; Karen J. Heywood; Walker O. Smith</w:t>
+        <w:br/>
+      </w:r>
+      <w:r>
+        <w:rPr>
+          <w:b/>
+        </w:rPr>
+        <w:t xml:space="preserve">Journal: </w:t>
+      </w:r>
+      <w:r>
+        <w:t>Geophysical Research Letters</w:t>
+        <w:br/>
+      </w:r>
+      <w:r>
+        <w:rPr>
+          <w:b/>
+        </w:rPr>
+        <w:t xml:space="preserve">Published: </w:t>
+      </w:r>
+      <w:r>
+        <w:t>2025-02</w:t>
+        <w:br/>
+      </w:r>
+      <w:r>
+        <w:rPr>
+          <w:b/>
+        </w:rPr>
+        <w:t xml:space="preserve">DOI: </w:t>
+      </w:r>
+      <w:r>
+        <w:t>10.1029/2024GL111264</w:t>
+        <w:br/>
+      </w:r>
+      <w:r>
+        <w:rPr>
+          <w:b/>
+        </w:rPr>
+        <w:t xml:space="preserve">URL: </w:t>
+      </w:r>
+      <w:r>
+        <w:t>https://doi.org/10.1029/2024GL111264</w:t>
       </w:r>
     </w:p>
     <w:p>
       <w:r>
         <w:rPr>
-          <w:rFonts w:ascii="Microsoft YaHei" w:hAnsi="Microsoft YaHei" w:eastAsia="Microsoft YaHei"/>
-          <w:color w:val="55697D"/>
-          <w:sz w:val="18"/>
+          <w:b/>
         </w:rPr>
-        <w:t>作者：Nasrollah Moradi; Lili Hufnagel; Simon Ramondenc; Clara M. Flintrop; Rainer Kiko; Tim Fischer; Helena Hauss; Arne Körtzinger; et al.</w:t>
-      </w:r>
-    </w:p>
-    <w:p>
-      <w:r>
-        <w:rPr>
-          <w:rFonts w:ascii="Microsoft YaHei" w:hAnsi="Microsoft YaHei" w:eastAsia="Microsoft YaHei"/>
-          <w:color w:val="55697D"/>
-          <w:sz w:val="18"/>
-        </w:rPr>
-        <w:t>期刊：Biogeosciences | 发表月份：2026-03 | DOI: 10.5194/bg-23-2179-2026</w:t>
-      </w:r>
-    </w:p>
-    <w:p>
-      <w:r>
-        <w:rPr>
-          <w:rFonts w:ascii="Microsoft YaHei" w:hAnsi="Microsoft YaHei" w:eastAsia="Microsoft YaHei"/>
-          <w:b/>
-          <w:sz w:val="19"/>
-        </w:rPr>
-        <w:t>关键词：Southern Ocean; optical observations; POM flux</w:t>
-      </w:r>
-    </w:p>
-    <w:p>
-      <w:r>
-        <w:rPr>
-          <w:rFonts w:ascii="Microsoft YaHei" w:hAnsi="Microsoft YaHei" w:eastAsia="Microsoft YaHei"/>
-        </w:rPr>
-        <w:t>用原位光学观测估算南大洋颗粒有机物通量。它直接连接 bio-optic proxy 和 carbon export，是 BGC-Argo bbp/POC 推断输出通量的重要参考。</w:t>
-      </w:r>
-    </w:p>
-    <w:p>
-      <w:r>
-        <w:rPr>
-          <w:rFonts w:ascii="Microsoft YaHei" w:hAnsi="Microsoft YaHei" w:eastAsia="Microsoft YaHei"/>
-          <w:color w:val="0563C1"/>
-          <w:sz w:val="18"/>
-        </w:rPr>
-        <w:t>链接：https://doi.org/10.5194/bg-23-2179-2026</w:t>
+        <w:t xml:space="preserve">Summary: </w:t>
+      </w:r>
+      <w:r>
+        <w:t>DOI-verified metadata correction: this record now matches the DOI registration for 'Unprecedented Summer Phytoplankton Bloom in the Ross Sea'. It is included for its relevance to marine heatwave; phytoplankton bloom; Ross Sea; use the DOI link for the publisher abstract and full bibliographic details.</w:t>
       </w:r>
     </w:p>
     <w:p>
       <w:pPr>
-        <w:pStyle w:val="Heading3"/>
+        <w:pStyle w:val="Heading2"/>
       </w:pPr>
       <w:r>
+        <w:t>22. Anomalously Low New Production in the Northeast Atlantic During Spring 2024: A Consequence of Weaker Winter Mixing?</w:t>
+      </w:r>
+    </w:p>
+    <w:p>
+      <w:r>
         <w:rPr>
-          <w:rFonts w:ascii="Microsoft YaHei" w:hAnsi="Microsoft YaHei" w:eastAsia="Microsoft YaHei"/>
           <w:b/>
         </w:rPr>
-        <w:t>27. A first-order description of the relationship between the chlorophyll maximum layer and colored dissolved organic matter</w:t>
+        <w:t xml:space="preserve">Authors: </w:t>
+      </w:r>
+      <w:r>
+        <w:t>S. C. Painter; E. E. García‐Martín; C. Feltham; R. Muliawan; E. Mawji; K. Peel; S. Kelly; A. Flohr; et al.</w:t>
+        <w:br/>
+      </w:r>
+      <w:r>
+        <w:rPr>
+          <w:b/>
+        </w:rPr>
+        <w:t xml:space="preserve">Journal: </w:t>
+      </w:r>
+      <w:r>
+        <w:t>Journal of Geophysical Research: Oceans</w:t>
+        <w:br/>
+      </w:r>
+      <w:r>
+        <w:rPr>
+          <w:b/>
+        </w:rPr>
+        <w:t xml:space="preserve">Published: </w:t>
+      </w:r>
+      <w:r>
+        <w:t>2026-02</w:t>
+        <w:br/>
+      </w:r>
+      <w:r>
+        <w:rPr>
+          <w:b/>
+        </w:rPr>
+        <w:t xml:space="preserve">DOI: </w:t>
+      </w:r>
+      <w:r>
+        <w:t>10.1029/2025JC023249</w:t>
+        <w:br/>
+      </w:r>
+      <w:r>
+        <w:rPr>
+          <w:b/>
+        </w:rPr>
+        <w:t xml:space="preserve">URL: </w:t>
+      </w:r>
+      <w:r>
+        <w:t>https://doi.org/10.1029/2025JC023249</w:t>
       </w:r>
     </w:p>
     <w:p>
       <w:r>
         <w:rPr>
-          <w:rFonts w:ascii="Microsoft YaHei" w:hAnsi="Microsoft YaHei" w:eastAsia="Microsoft YaHei"/>
-          <w:color w:val="55697D"/>
-          <w:sz w:val="18"/>
+          <w:b/>
         </w:rPr>
-        <w:t>作者：Juan Li; David Antoine; Yannick Huot</w:t>
-      </w:r>
-    </w:p>
-    <w:p>
-      <w:r>
-        <w:rPr>
-          <w:rFonts w:ascii="Microsoft YaHei" w:hAnsi="Microsoft YaHei" w:eastAsia="Microsoft YaHei"/>
-          <w:color w:val="55697D"/>
-          <w:sz w:val="18"/>
-        </w:rPr>
-        <w:t>期刊：Biogeosciences | 发表月份：2026-05 | DOI: 10.5194/bg-23-3073-2026</w:t>
-      </w:r>
-    </w:p>
-    <w:p>
-      <w:r>
-        <w:rPr>
-          <w:rFonts w:ascii="Microsoft YaHei" w:hAnsi="Microsoft YaHei" w:eastAsia="Microsoft YaHei"/>
-          <w:b/>
-          <w:sz w:val="19"/>
-        </w:rPr>
-        <w:t>关键词：chlorophyll maximum; CDOM; bio-optics</w:t>
-      </w:r>
-    </w:p>
-    <w:p>
-      <w:r>
-        <w:rPr>
-          <w:rFonts w:ascii="Microsoft YaHei" w:hAnsi="Microsoft YaHei" w:eastAsia="Microsoft YaHei"/>
-        </w:rPr>
-        <w:t>建立叶绿素最大层和 CDOM 之间关系的一阶描述。它对解释 DCM 附近吸收光学信号很有用，也能帮助区分 Chl-a、CDOM 和颗粒吸收对 ocean colour/bio-optic 反演的贡献。</w:t>
-      </w:r>
-    </w:p>
-    <w:p>
-      <w:r>
-        <w:rPr>
-          <w:rFonts w:ascii="Microsoft YaHei" w:hAnsi="Microsoft YaHei" w:eastAsia="Microsoft YaHei"/>
-          <w:color w:val="0563C1"/>
-          <w:sz w:val="18"/>
-        </w:rPr>
-        <w:t>链接：https://doi.org/10.5194/bg-23-3073-2026</w:t>
+        <w:t xml:space="preserve">Summary: </w:t>
+      </w:r>
+      <w:r>
+        <w:t>DOI-verified metadata correction: this record now matches the DOI registration for 'Anomalously Low New Production in the Northeast Atlantic During Spring 2024: A Consequence of Weaker Winter Mixing?'. It is included for its relevance to BGC-Argo; chlorophyll fluorescence; NPQ; DCM; use the DOI link for the publisher abstract and full bibliographic details.</w:t>
       </w:r>
     </w:p>
     <w:p>
       <w:pPr>
-        <w:pStyle w:val="Heading3"/>
+        <w:pStyle w:val="Heading2"/>
       </w:pPr>
       <w:r>
+        <w:t>23. BGC-Argo+: Global biogeochemical Argo float data with secondary quality control and derived parameters</w:t>
+      </w:r>
+    </w:p>
+    <w:p>
+      <w:r>
         <w:rPr>
-          <w:rFonts w:ascii="Microsoft YaHei" w:hAnsi="Microsoft YaHei" w:eastAsia="Microsoft YaHei"/>
           <w:b/>
         </w:rPr>
-        <w:t>28. Phytoplankton functional groups in the recurrent Kerguelen bloom respond differently to iron supply</w:t>
+        <w:t xml:space="preserve">Authors: </w:t>
+      </w:r>
+      <w:r>
+        <w:t>Seth M. Bushinsky; Zachary Nachod; Mathilde Jutras; Daniela König; Shannon McClish; Charles Addey</w:t>
+        <w:br/>
+      </w:r>
+      <w:r>
+        <w:rPr>
+          <w:b/>
+        </w:rPr>
+        <w:t xml:space="preserve">Journal: </w:t>
+      </w:r>
+      <w:r>
+        <w:t>Earth System Science Data Discussions</w:t>
+        <w:br/>
+      </w:r>
+      <w:r>
+        <w:rPr>
+          <w:b/>
+        </w:rPr>
+        <w:t xml:space="preserve">Published: </w:t>
+      </w:r>
+      <w:r>
+        <w:t>2026-05</w:t>
+        <w:br/>
+      </w:r>
+      <w:r>
+        <w:rPr>
+          <w:b/>
+        </w:rPr>
+        <w:t xml:space="preserve">DOI: </w:t>
+      </w:r>
+      <w:r>
+        <w:t>10.5194/essd-2026-311</w:t>
+        <w:br/>
+      </w:r>
+      <w:r>
+        <w:rPr>
+          <w:b/>
+        </w:rPr>
+        <w:t xml:space="preserve">URL: </w:t>
+      </w:r>
+      <w:r>
+        <w:t>https://doi.org/10.5194/essd-2026-311</w:t>
       </w:r>
     </w:p>
     <w:p>
       <w:r>
         <w:rPr>
-          <w:rFonts w:ascii="Microsoft YaHei" w:hAnsi="Microsoft YaHei" w:eastAsia="Microsoft YaHei"/>
-          <w:color w:val="55697D"/>
-          <w:sz w:val="18"/>
+          <w:b/>
         </w:rPr>
-        <w:t>作者：Alex Nalivaev; Francesco d'Ovidio; Laurent Bopp; Maristella Berta; Louise Rousselet; Clara Azarian; Stéphane Blain</w:t>
-      </w:r>
-    </w:p>
-    <w:p>
-      <w:r>
-        <w:rPr>
-          <w:rFonts w:ascii="Microsoft YaHei" w:hAnsi="Microsoft YaHei" w:eastAsia="Microsoft YaHei"/>
-          <w:color w:val="55697D"/>
-          <w:sz w:val="18"/>
-        </w:rPr>
-        <w:t>期刊：Biogeosciences | 发表月份：2026-01 | DOI: 10.5194/bg-23-639-2026</w:t>
-      </w:r>
-    </w:p>
-    <w:p>
-      <w:r>
-        <w:rPr>
-          <w:rFonts w:ascii="Microsoft YaHei" w:hAnsi="Microsoft YaHei" w:eastAsia="Microsoft YaHei"/>
-          <w:b/>
-          <w:sz w:val="19"/>
-        </w:rPr>
-        <w:t>关键词：phytoplankton functional groups; iron; Southern Ocean bloom</w:t>
-      </w:r>
-    </w:p>
-    <w:p>
-      <w:r>
-        <w:rPr>
-          <w:rFonts w:ascii="Microsoft YaHei" w:hAnsi="Microsoft YaHei" w:eastAsia="Microsoft YaHei"/>
-        </w:rPr>
-        <w:t>研究 Kerguelen recurrent bloom 中不同浮游植物功能群对铁供应的差异响应。对南大洋生产力、群落组成和碳输出效率之间的机制联系很有参考价值。</w:t>
-      </w:r>
-    </w:p>
-    <w:p>
-      <w:r>
-        <w:rPr>
-          <w:rFonts w:ascii="Microsoft YaHei" w:hAnsi="Microsoft YaHei" w:eastAsia="Microsoft YaHei"/>
-          <w:color w:val="0563C1"/>
-          <w:sz w:val="18"/>
-        </w:rPr>
-        <w:t>链接：https://doi.org/10.5194/bg-23-639-2026</w:t>
+        <w:t xml:space="preserve">Summary: </w:t>
+      </w:r>
+      <w:r>
+        <w:t>DOI-verified metadata correction: this record now matches the DOI registration for 'BGC-Argo+: Global biogeochemical Argo float data with secondary quality control and derived parameters'. It is included for its relevance to BGC-Argo; data system; sensors; methods; use the DOI link for the publisher abstract and full bibliographic details.</w:t>
       </w:r>
     </w:p>
     <w:p>
       <w:pPr>
-        <w:pStyle w:val="Heading3"/>
+        <w:pStyle w:val="Heading2"/>
       </w:pPr>
       <w:r>
+        <w:t>24. Decadal and spatially complete global surface chlorophyll- a data record from satellite and BGC-Argo observations</w:t>
+      </w:r>
+    </w:p>
+    <w:p>
+      <w:r>
         <w:rPr>
-          <w:rFonts w:ascii="Microsoft YaHei" w:hAnsi="Microsoft YaHei" w:eastAsia="Microsoft YaHei"/>
           <w:b/>
         </w:rPr>
-        <w:t>29. Marine heatwaves impact on phytoplankton communities in Drake Passage</w:t>
+        <w:t xml:space="preserve">Authors: </w:t>
+      </w:r>
+      <w:r>
+        <w:t>Daniel J. Ford; Gemma Kulk; Shubha Sathyendranath; Jamie D. Shutler</w:t>
+        <w:br/>
+      </w:r>
+      <w:r>
+        <w:rPr>
+          <w:b/>
+        </w:rPr>
+        <w:t xml:space="preserve">Journal: </w:t>
+      </w:r>
+      <w:r>
+        <w:t>Earth System Science Data</w:t>
+        <w:br/>
+      </w:r>
+      <w:r>
+        <w:rPr>
+          <w:b/>
+        </w:rPr>
+        <w:t xml:space="preserve">Published: </w:t>
+      </w:r>
+      <w:r>
+        <w:t>2026-01</w:t>
+        <w:br/>
+      </w:r>
+      <w:r>
+        <w:rPr>
+          <w:b/>
+        </w:rPr>
+        <w:t xml:space="preserve">DOI: </w:t>
+      </w:r>
+      <w:r>
+        <w:t>10.5194/essd-18-569-2026</w:t>
+        <w:br/>
+      </w:r>
+      <w:r>
+        <w:rPr>
+          <w:b/>
+        </w:rPr>
+        <w:t xml:space="preserve">URL: </w:t>
+      </w:r>
+      <w:r>
+        <w:t>https://doi.org/10.5194/essd-18-569-2026</w:t>
       </w:r>
     </w:p>
     <w:p>
       <w:r>
         <w:rPr>
-          <w:rFonts w:ascii="Microsoft YaHei" w:hAnsi="Microsoft YaHei" w:eastAsia="Microsoft YaHei"/>
-          <w:color w:val="55697D"/>
-          <w:sz w:val="18"/>
+          <w:b/>
         </w:rPr>
-        <w:t>作者：Andrés S. Rigual-Hernández; Amy Leventer; Manuel Fernández-Barba; José A. Flores; Gabriel Navarro; Johan Etourneau; Dimitris Evangelinos; Megan Duffy; et al.</w:t>
-      </w:r>
-    </w:p>
-    <w:p>
-      <w:r>
-        <w:rPr>
-          <w:rFonts w:ascii="Microsoft YaHei" w:hAnsi="Microsoft YaHei" w:eastAsia="Microsoft YaHei"/>
-          <w:color w:val="55697D"/>
-          <w:sz w:val="18"/>
-        </w:rPr>
-        <w:t>期刊：Biogeosciences | 发表月份：2025-11 | DOI: 10.5194/bg-22-7205-2025</w:t>
-      </w:r>
-    </w:p>
-    <w:p>
-      <w:r>
-        <w:rPr>
-          <w:rFonts w:ascii="Microsoft YaHei" w:hAnsi="Microsoft YaHei" w:eastAsia="Microsoft YaHei"/>
-          <w:b/>
-          <w:sz w:val="19"/>
-        </w:rPr>
-        <w:t>关键词：marine heatwaves; phytoplankton communities; Southern Ocean</w:t>
-      </w:r>
-    </w:p>
-    <w:p>
-      <w:r>
-        <w:rPr>
-          <w:rFonts w:ascii="Microsoft YaHei" w:hAnsi="Microsoft YaHei" w:eastAsia="Microsoft YaHei"/>
-        </w:rPr>
-        <w:t>分析 Drake Passage 海洋热浪对浮游植物群落的影响。它补充了 BGC-Argo 热浪垂向结构研究中的群落组成视角，尤其适合关注南大洋高纬 MHW 生态效应。</w:t>
-      </w:r>
-    </w:p>
-    <w:p>
-      <w:r>
-        <w:rPr>
-          <w:rFonts w:ascii="Microsoft YaHei" w:hAnsi="Microsoft YaHei" w:eastAsia="Microsoft YaHei"/>
-          <w:color w:val="0563C1"/>
-          <w:sz w:val="18"/>
-        </w:rPr>
-        <w:t>链接：https://doi.org/10.5194/bg-22-7205-2025</w:t>
+        <w:t xml:space="preserve">Summary: </w:t>
+      </w:r>
+      <w:r>
+        <w:t>DOI-verified metadata correction: this record now matches the DOI registration for 'Decadal and spatially complete global surface chlorophyll- a data record from satellite and BGC-Argo observations'. It is included for its relevance to ocean colour; chlorophyll dataset; multi-sensor; use the DOI link for the publisher abstract and full bibliographic details.</w:t>
       </w:r>
     </w:p>
     <w:p>
       <w:pPr>
-        <w:pStyle w:val="Heading3"/>
+        <w:pStyle w:val="Heading2"/>
       </w:pPr>
       <w:r>
+        <w:t>25. Phytoplankton coastal-offshore monitoring by the Strait of Dover at high spatial resolution: the DYPHYRAD surveys</w:t>
+      </w:r>
+    </w:p>
+    <w:p>
+      <w:r>
         <w:rPr>
-          <w:rFonts w:ascii="Microsoft YaHei" w:hAnsi="Microsoft YaHei" w:eastAsia="Microsoft YaHei"/>
           <w:b/>
         </w:rPr>
-        <w:t>30. Lifting the lid on marine heatwaves: Global patterns of subsurface ocean warming events</w:t>
+        <w:t xml:space="preserve">Authors: </w:t>
+      </w:r>
+      <w:r>
+        <w:t>Zéline Hubert; Aurélie Libeau; Clémentine Gallot; Vincent Cornille; Muriel Crouvoisier; Éric Lécuyer; Luis Felipe Artigas</w:t>
+        <w:br/>
+      </w:r>
+      <w:r>
+        <w:rPr>
+          <w:b/>
+        </w:rPr>
+        <w:t xml:space="preserve">Journal: </w:t>
+      </w:r>
+      <w:r>
+        <w:t>Earth System Science Data</w:t>
+        <w:br/>
+      </w:r>
+      <w:r>
+        <w:rPr>
+          <w:b/>
+        </w:rPr>
+        <w:t xml:space="preserve">Published: </w:t>
+      </w:r>
+      <w:r>
+        <w:t>2026-03</w:t>
+        <w:br/>
+      </w:r>
+      <w:r>
+        <w:rPr>
+          <w:b/>
+        </w:rPr>
+        <w:t xml:space="preserve">DOI: </w:t>
+      </w:r>
+      <w:r>
+        <w:t>10.5194/essd-18-1877-2026</w:t>
+        <w:br/>
+      </w:r>
+      <w:r>
+        <w:rPr>
+          <w:b/>
+        </w:rPr>
+        <w:t xml:space="preserve">URL: </w:t>
+      </w:r>
+      <w:r>
+        <w:t>https://doi.org/10.5194/essd-18-1877-2026</w:t>
       </w:r>
     </w:p>
     <w:p>
       <w:r>
         <w:rPr>
-          <w:rFonts w:ascii="Microsoft YaHei" w:hAnsi="Microsoft YaHei" w:eastAsia="Microsoft YaHei"/>
-          <w:color w:val="55697D"/>
-          <w:sz w:val="18"/>
+          <w:b/>
         </w:rPr>
-        <w:t>作者：Neil Malan; Alex Sen Gupta; Amandine Schaeffer; Shujing Zhang; Martina A. Doblin; Gabriela Semolini Pilo; Andrew E. Kiss; Jason D. Everett; et al.</w:t>
-      </w:r>
-    </w:p>
-    <w:p>
-      <w:r>
-        <w:rPr>
-          <w:rFonts w:ascii="Microsoft YaHei" w:hAnsi="Microsoft YaHei" w:eastAsia="Microsoft YaHei"/>
-          <w:color w:val="55697D"/>
-          <w:sz w:val="18"/>
-        </w:rPr>
-        <w:t>期刊：Progress in Oceanography | 发表月份：2025-12 | DOI: 10.1016/j.pocean.2025.103539</w:t>
-      </w:r>
-    </w:p>
-    <w:p>
-      <w:r>
-        <w:rPr>
-          <w:rFonts w:ascii="Microsoft YaHei" w:hAnsi="Microsoft YaHei" w:eastAsia="Microsoft YaHei"/>
-          <w:b/>
-          <w:sz w:val="19"/>
-        </w:rPr>
-        <w:t>关键词：marine heatwaves; subsurface warming; vertical structure</w:t>
-      </w:r>
-    </w:p>
-    <w:p>
-      <w:r>
-        <w:rPr>
-          <w:rFonts w:ascii="Microsoft YaHei" w:hAnsi="Microsoft YaHei" w:eastAsia="Microsoft YaHei"/>
-        </w:rPr>
-        <w:t>从全球角度揭示亚表层海洋增暖事件的空间格局。它是理解 MHW 垂向生态影响的物理底座，能帮助解释为什么只看 SST 会漏掉 DCM 和亚表层 Chl 响应。</w:t>
-      </w:r>
-    </w:p>
-    <w:p>
-      <w:r>
-        <w:rPr>
-          <w:rFonts w:ascii="Microsoft YaHei" w:hAnsi="Microsoft YaHei" w:eastAsia="Microsoft YaHei"/>
-          <w:color w:val="0563C1"/>
-          <w:sz w:val="18"/>
-        </w:rPr>
-        <w:t>链接：https://doi.org/10.1016/j.pocean.2025.103539</w:t>
+        <w:t xml:space="preserve">Summary: </w:t>
+      </w:r>
+      <w:r>
+        <w:t>DOI-verified metadata correction: this record now matches the DOI registration for 'Phytoplankton coastal-offshore monitoring by the Strait of Dover at high spatial resolution: the DYPHYRAD surveys'. It is included for its relevance to phytoplankton groups; nutrients; carbon; dataset; use the DOI link for the publisher abstract and full bibliographic details.</w:t>
       </w:r>
     </w:p>
     <w:p>
       <w:pPr>
-        <w:pStyle w:val="Heading3"/>
+        <w:pStyle w:val="Heading2"/>
       </w:pPr>
       <w:r>
+        <w:t>26. Estimating particulate organic matter flux from in-situ optics: A framework for correcting for suspended particles and incorporating depth-dependent degradation</w:t>
+      </w:r>
+    </w:p>
+    <w:p>
+      <w:r>
         <w:rPr>
-          <w:rFonts w:ascii="Microsoft YaHei" w:hAnsi="Microsoft YaHei" w:eastAsia="Microsoft YaHei"/>
           <w:b/>
         </w:rPr>
-        <w:t>31. Climate variability affects phytoplankton phenology on the South West Atlantic shelf</w:t>
+        <w:t xml:space="preserve">Authors: </w:t>
+      </w:r>
+      <w:r>
+        <w:t>Nasrollah Moradi; Lili Hufnagel; Simon Ramondenc; Clara M. Flintrop; Rainer Kiko; Tim Fischer; Helena Hauss; Arne Körtzinger; et al.</w:t>
+        <w:br/>
+      </w:r>
+      <w:r>
+        <w:rPr>
+          <w:b/>
+        </w:rPr>
+        <w:t xml:space="preserve">Journal: </w:t>
+      </w:r>
+      <w:r>
+        <w:t>Biogeosciences</w:t>
+        <w:br/>
+      </w:r>
+      <w:r>
+        <w:rPr>
+          <w:b/>
+        </w:rPr>
+        <w:t xml:space="preserve">Published: </w:t>
+      </w:r>
+      <w:r>
+        <w:t>2026-03</w:t>
+        <w:br/>
+      </w:r>
+      <w:r>
+        <w:rPr>
+          <w:b/>
+        </w:rPr>
+        <w:t xml:space="preserve">DOI: </w:t>
+      </w:r>
+      <w:r>
+        <w:t>10.5194/bg-23-2179-2026</w:t>
+        <w:br/>
+      </w:r>
+      <w:r>
+        <w:rPr>
+          <w:b/>
+        </w:rPr>
+        <w:t xml:space="preserve">URL: </w:t>
+      </w:r>
+      <w:r>
+        <w:t>https://doi.org/10.5194/bg-23-2179-2026</w:t>
       </w:r>
     </w:p>
     <w:p>
       <w:r>
         <w:rPr>
-          <w:rFonts w:ascii="Microsoft YaHei" w:hAnsi="Microsoft YaHei" w:eastAsia="Microsoft YaHei"/>
-          <w:color w:val="55697D"/>
-          <w:sz w:val="18"/>
+          <w:b/>
         </w:rPr>
-        <w:t>作者：Manuel Fernández-Barba; Pablo Almaraz; I. Emma Huertas; Gabriel Navarro</w:t>
-      </w:r>
-    </w:p>
-    <w:p>
-      <w:r>
-        <w:rPr>
-          <w:rFonts w:ascii="Microsoft YaHei" w:hAnsi="Microsoft YaHei" w:eastAsia="Microsoft YaHei"/>
-          <w:color w:val="55697D"/>
-          <w:sz w:val="18"/>
-        </w:rPr>
-        <w:t>期刊：Progress in Oceanography | 发表月份：2025-12 | DOI: 10.1016/j.pocean.2025.103583</w:t>
-      </w:r>
-    </w:p>
-    <w:p>
-      <w:r>
-        <w:rPr>
-          <w:rFonts w:ascii="Microsoft YaHei" w:hAnsi="Microsoft YaHei" w:eastAsia="Microsoft YaHei"/>
-          <w:b/>
-          <w:sz w:val="19"/>
-        </w:rPr>
-        <w:t>关键词：phytoplankton phenology; climate variability; shelf ocean</w:t>
-      </w:r>
-    </w:p>
-    <w:p>
-      <w:r>
-        <w:rPr>
-          <w:rFonts w:ascii="Microsoft YaHei" w:hAnsi="Microsoft YaHei" w:eastAsia="Microsoft YaHei"/>
-        </w:rPr>
-        <w:t>研究气候变率如何影响西南大西洋陆架浮游植物物候。对做海色时间序列、bloom timing 和气候模态影响分析很有用。</w:t>
-      </w:r>
-    </w:p>
-    <w:p>
-      <w:r>
-        <w:rPr>
-          <w:rFonts w:ascii="Microsoft YaHei" w:hAnsi="Microsoft YaHei" w:eastAsia="Microsoft YaHei"/>
-          <w:color w:val="0563C1"/>
-          <w:sz w:val="18"/>
-        </w:rPr>
-        <w:t>链接：https://doi.org/10.1016/j.pocean.2025.103583</w:t>
+        <w:t xml:space="preserve">Summary: </w:t>
+      </w:r>
+      <w:r>
+        <w:t>DOI-verified metadata correction: this record now matches the DOI registration for 'Estimating particulate organic matter flux from in-situ optics: A framework for correcting for suspended particles and incorporating depth-dependent degradation'. It is included for its relevance to Southern Ocean; optical observations; POM flux; use the DOI link for the publisher abstract and full bibliographic details.</w:t>
       </w:r>
     </w:p>
     <w:p>
       <w:pPr>
-        <w:pStyle w:val="Heading3"/>
+        <w:pStyle w:val="Heading2"/>
       </w:pPr>
       <w:r>
+        <w:t>27. Unexpected quasi-independence of coloured dissolved organic matter absorption from chlorophyll- a concentration in the Southern Ocean</w:t>
+      </w:r>
+    </w:p>
+    <w:p>
+      <w:r>
         <w:rPr>
-          <w:rFonts w:ascii="Microsoft YaHei" w:hAnsi="Microsoft YaHei" w:eastAsia="Microsoft YaHei"/>
           <w:b/>
         </w:rPr>
-        <w:t>32. Bio-optical properties in summer surface waters of the southern Chukchi Sea and northern Bering Sea</w:t>
+        <w:t xml:space="preserve">Authors: </w:t>
+      </w:r>
+      <w:r>
+        <w:t>Juan Li; David Antoine; Yannick Huot</w:t>
+        <w:br/>
+      </w:r>
+      <w:r>
+        <w:rPr>
+          <w:b/>
+        </w:rPr>
+        <w:t xml:space="preserve">Journal: </w:t>
+      </w:r>
+      <w:r>
+        <w:t>Biogeosciences</w:t>
+        <w:br/>
+      </w:r>
+      <w:r>
+        <w:rPr>
+          <w:b/>
+        </w:rPr>
+        <w:t xml:space="preserve">Published: </w:t>
+      </w:r>
+      <w:r>
+        <w:t>2026-05</w:t>
+        <w:br/>
+      </w:r>
+      <w:r>
+        <w:rPr>
+          <w:b/>
+        </w:rPr>
+        <w:t xml:space="preserve">DOI: </w:t>
+      </w:r>
+      <w:r>
+        <w:t>10.5194/bg-23-3073-2026</w:t>
+        <w:br/>
+      </w:r>
+      <w:r>
+        <w:rPr>
+          <w:b/>
+        </w:rPr>
+        <w:t xml:space="preserve">URL: </w:t>
+      </w:r>
+      <w:r>
+        <w:t>https://doi.org/10.5194/bg-23-3073-2026</w:t>
       </w:r>
     </w:p>
     <w:p>
       <w:r>
         <w:rPr>
-          <w:rFonts w:ascii="Microsoft YaHei" w:hAnsi="Microsoft YaHei" w:eastAsia="Microsoft YaHei"/>
-          <w:color w:val="55697D"/>
-          <w:sz w:val="18"/>
+          <w:b/>
         </w:rPr>
-        <w:t>作者：Xingyuan Zhu; Tao Li; Lee W. Cooper; Eun Jin Yang; Jinyoung Jung; Kyoung-Ho Cho; Yubin Yao; Yamei Tang</w:t>
-      </w:r>
-    </w:p>
-    <w:p>
-      <w:r>
-        <w:rPr>
-          <w:rFonts w:ascii="Microsoft YaHei" w:hAnsi="Microsoft YaHei" w:eastAsia="Microsoft YaHei"/>
-          <w:color w:val="55697D"/>
-          <w:sz w:val="18"/>
-        </w:rPr>
-        <w:t>期刊：Deep Sea Research Part I: Oceanographic Research Papers | 发表月份：2025-04 | DOI: 10.1016/j.dsr.2025.104458</w:t>
-      </w:r>
-    </w:p>
-    <w:p>
-      <w:r>
-        <w:rPr>
-          <w:rFonts w:ascii="Microsoft YaHei" w:hAnsi="Microsoft YaHei" w:eastAsia="Microsoft YaHei"/>
-          <w:b/>
-          <w:sz w:val="19"/>
-        </w:rPr>
-        <w:t>关键词：bio-optics; Arctic; ocean colour validation</w:t>
-      </w:r>
-    </w:p>
-    <w:p>
-      <w:r>
-        <w:rPr>
-          <w:rFonts w:ascii="Microsoft YaHei" w:hAnsi="Microsoft YaHei" w:eastAsia="Microsoft YaHei"/>
-        </w:rPr>
-        <w:t>研究楚科奇海南部和白令海北部夏季表层水体 bio-optical properties。它可用于高纬海色算法验证，并帮助解释 CDOM、颗粒和 Chl-a 对遥感反射率的影响。</w:t>
-      </w:r>
-    </w:p>
-    <w:p>
-      <w:r>
-        <w:rPr>
-          <w:rFonts w:ascii="Microsoft YaHei" w:hAnsi="Microsoft YaHei" w:eastAsia="Microsoft YaHei"/>
-          <w:color w:val="0563C1"/>
-          <w:sz w:val="18"/>
-        </w:rPr>
-        <w:t>链接：https://doi.org/10.1016/j.dsr.2025.104458</w:t>
+        <w:t xml:space="preserve">Summary: </w:t>
+      </w:r>
+      <w:r>
+        <w:t>DOI-verified metadata correction: this record now matches the DOI registration for 'Unexpected quasi-independence of coloured dissolved organic matter absorption from chlorophyll- a concentration in the Southern Ocean'. It is included for its relevance to chlorophyll maximum; CDOM; bio-optics; use the DOI link for the publisher abstract and full bibliographic details.</w:t>
       </w:r>
     </w:p>
     <w:p>
       <w:pPr>
-        <w:pStyle w:val="Heading3"/>
+        <w:pStyle w:val="Heading2"/>
       </w:pPr>
       <w:r>
+        <w:t>28. Glaciogenic iron transport pathways to the Kerguelen offshore phytoplankton bloom</w:t>
+      </w:r>
+    </w:p>
+    <w:p>
+      <w:r>
         <w:rPr>
-          <w:rFonts w:ascii="Microsoft YaHei" w:hAnsi="Microsoft YaHei" w:eastAsia="Microsoft YaHei"/>
           <w:b/>
         </w:rPr>
-        <w:t>33. Top-of-atmosphere hyperspectral ocean color estimation for NOAA-21 VIIRS</w:t>
+        <w:t xml:space="preserve">Authors: </w:t>
+      </w:r>
+      <w:r>
+        <w:t>Alex Nalivaev; Francesco d'Ovidio; Laurent Bopp; Maristella Berta; Louise Rousselet; Clara Azarian; Stéphane Blain</w:t>
+        <w:br/>
+      </w:r>
+      <w:r>
+        <w:rPr>
+          <w:b/>
+        </w:rPr>
+        <w:t xml:space="preserve">Journal: </w:t>
+      </w:r>
+      <w:r>
+        <w:t>Biogeosciences</w:t>
+        <w:br/>
+      </w:r>
+      <w:r>
+        <w:rPr>
+          <w:b/>
+        </w:rPr>
+        <w:t xml:space="preserve">Published: </w:t>
+      </w:r>
+      <w:r>
+        <w:t>2026-01</w:t>
+        <w:br/>
+      </w:r>
+      <w:r>
+        <w:rPr>
+          <w:b/>
+        </w:rPr>
+        <w:t xml:space="preserve">DOI: </w:t>
+      </w:r>
+      <w:r>
+        <w:t>10.5194/bg-23-639-2026</w:t>
+        <w:br/>
+      </w:r>
+      <w:r>
+        <w:rPr>
+          <w:b/>
+        </w:rPr>
+        <w:t xml:space="preserve">URL: </w:t>
+      </w:r>
+      <w:r>
+        <w:t>https://doi.org/10.5194/bg-23-639-2026</w:t>
       </w:r>
     </w:p>
     <w:p>
       <w:r>
         <w:rPr>
-          <w:rFonts w:ascii="Microsoft YaHei" w:hAnsi="Microsoft YaHei" w:eastAsia="Microsoft YaHei"/>
-          <w:color w:val="55697D"/>
-          <w:sz w:val="18"/>
+          <w:b/>
         </w:rPr>
-        <w:t>作者：Richa Dutt; Guangming Zheng; Zachary Charles Curran; Ronald Fick; Nikolay P. Nezlin; Miles Medina; Wenchong He; Paul M. DiGiacomo; et al.</w:t>
-      </w:r>
-    </w:p>
-    <w:p>
-      <w:r>
-        <w:rPr>
-          <w:rFonts w:ascii="Microsoft YaHei" w:hAnsi="Microsoft YaHei" w:eastAsia="Microsoft YaHei"/>
-          <w:color w:val="55697D"/>
-          <w:sz w:val="18"/>
-        </w:rPr>
-        <w:t>期刊：IEEE Transactions on Geoscience and Remote Sensing | 发表月份：2026（月份未核准） | DOI: 10.1109/TGRS.2026.3670718</w:t>
-      </w:r>
-    </w:p>
-    <w:p>
-      <w:r>
-        <w:rPr>
-          <w:rFonts w:ascii="Microsoft YaHei" w:hAnsi="Microsoft YaHei" w:eastAsia="Microsoft YaHei"/>
-          <w:b/>
-          <w:sz w:val="19"/>
-        </w:rPr>
-        <w:t>关键词：ocean colour; VIIRS; hyperspectral estimation</w:t>
-      </w:r>
-    </w:p>
-    <w:p>
-      <w:r>
-        <w:rPr>
-          <w:rFonts w:ascii="Microsoft YaHei" w:hAnsi="Microsoft YaHei" w:eastAsia="Microsoft YaHei"/>
-        </w:rPr>
-        <w:t>从 NOAA-21 VIIRS 顶层大气信号估计高光谱海色信息。它偏算法和传感器应用，对未来多传感器海色融合、PACE/VIIRS 交叉应用有参考价值。</w:t>
-      </w:r>
-    </w:p>
-    <w:p>
-      <w:r>
-        <w:rPr>
-          <w:rFonts w:ascii="Microsoft YaHei" w:hAnsi="Microsoft YaHei" w:eastAsia="Microsoft YaHei"/>
-          <w:color w:val="0563C1"/>
-          <w:sz w:val="18"/>
-        </w:rPr>
-        <w:t>链接：https://doi.org/10.1109/TGRS.2026.3670718</w:t>
+        <w:t xml:space="preserve">Summary: </w:t>
+      </w:r>
+      <w:r>
+        <w:t>DOI-verified metadata correction: this record now matches the DOI registration for 'Glaciogenic iron transport pathways to the Kerguelen offshore phytoplankton bloom'. It is included for its relevance to phytoplankton functional groups; iron; Southern Ocean bloom; use the DOI link for the publisher abstract and full bibliographic details.</w:t>
       </w:r>
     </w:p>
     <w:p>
       <w:pPr>
-        <w:pStyle w:val="Heading3"/>
+        <w:pStyle w:val="Heading2"/>
       </w:pPr>
       <w:r>
+        <w:t>29. Response of phytoplankton communities to the onset of the 2020 summer marine heatwave in the Drake Passage and Antarctic Peninsula</w:t>
+      </w:r>
+    </w:p>
+    <w:p>
+      <w:r>
         <w:rPr>
-          <w:rFonts w:ascii="Microsoft YaHei" w:hAnsi="Microsoft YaHei" w:eastAsia="Microsoft YaHei"/>
           <w:b/>
         </w:rPr>
-        <w:t>34. A multi-task learning method for ocean color remote sensing products</w:t>
+        <w:t xml:space="preserve">Authors: </w:t>
+      </w:r>
+      <w:r>
+        <w:t>Andrés S. Rigual-Hernández; Amy Leventer; Manuel Fernández-Barba; José A. Flores; Gabriel Navarro; Johan Etourneau; Dimitris Evangelinos; Megan Duffy; et al.</w:t>
+        <w:br/>
+      </w:r>
+      <w:r>
+        <w:rPr>
+          <w:b/>
+        </w:rPr>
+        <w:t xml:space="preserve">Journal: </w:t>
+      </w:r>
+      <w:r>
+        <w:t>Biogeosciences</w:t>
+        <w:br/>
+      </w:r>
+      <w:r>
+        <w:rPr>
+          <w:b/>
+        </w:rPr>
+        <w:t xml:space="preserve">Published: </w:t>
+      </w:r>
+      <w:r>
+        <w:t>2025-11</w:t>
+        <w:br/>
+      </w:r>
+      <w:r>
+        <w:rPr>
+          <w:b/>
+        </w:rPr>
+        <w:t xml:space="preserve">DOI: </w:t>
+      </w:r>
+      <w:r>
+        <w:t>10.5194/bg-22-7205-2025</w:t>
+        <w:br/>
+      </w:r>
+      <w:r>
+        <w:rPr>
+          <w:b/>
+        </w:rPr>
+        <w:t xml:space="preserve">URL: </w:t>
+      </w:r>
+      <w:r>
+        <w:t>https://doi.org/10.5194/bg-22-7205-2025</w:t>
       </w:r>
     </w:p>
     <w:p>
       <w:r>
         <w:rPr>
-          <w:rFonts w:ascii="Microsoft YaHei" w:hAnsi="Microsoft YaHei" w:eastAsia="Microsoft YaHei"/>
-          <w:color w:val="55697D"/>
-          <w:sz w:val="18"/>
+          <w:b/>
         </w:rPr>
-        <w:t>作者：Chunlei Ma; Guang Zhang; Wenbo He; Jun Zhao; Zhou Peng; Xueming Zhu; Bin Ai</w:t>
-      </w:r>
-    </w:p>
-    <w:p>
-      <w:r>
-        <w:rPr>
-          <w:rFonts w:ascii="Microsoft YaHei" w:hAnsi="Microsoft YaHei" w:eastAsia="Microsoft YaHei"/>
-          <w:color w:val="55697D"/>
-          <w:sz w:val="18"/>
-        </w:rPr>
-        <w:t>期刊：IEEE Transactions on Geoscience and Remote Sensing | 发表月份：2026（月份未核准） | DOI: 10.1109/TGRS.2026.3675239</w:t>
-      </w:r>
-    </w:p>
-    <w:p>
-      <w:r>
-        <w:rPr>
-          <w:rFonts w:ascii="Microsoft YaHei" w:hAnsi="Microsoft YaHei" w:eastAsia="Microsoft YaHei"/>
-          <w:b/>
-          <w:sz w:val="19"/>
-        </w:rPr>
-        <w:t>关键词：ocean colour; multi-task learning; remote sensing products</w:t>
-      </w:r>
-    </w:p>
-    <w:p>
-      <w:r>
-        <w:rPr>
-          <w:rFonts w:ascii="Microsoft YaHei" w:hAnsi="Microsoft YaHei" w:eastAsia="Microsoft YaHei"/>
-        </w:rPr>
-        <w:t>提出多任务学习方法联合生成海色遥感产品。对 Chl-a、IOPs、POC 等多变量联合反演有启发，适合和 BGC-Argo 多参数剖面做一致性检验。</w:t>
-      </w:r>
-    </w:p>
-    <w:p>
-      <w:r>
-        <w:rPr>
-          <w:rFonts w:ascii="Microsoft YaHei" w:hAnsi="Microsoft YaHei" w:eastAsia="Microsoft YaHei"/>
-          <w:color w:val="0563C1"/>
-          <w:sz w:val="18"/>
-        </w:rPr>
-        <w:t>链接：https://doi.org/10.1109/TGRS.2026.3675239</w:t>
+        <w:t xml:space="preserve">Summary: </w:t>
+      </w:r>
+      <w:r>
+        <w:t>DOI-verified metadata correction: this record now matches the DOI registration for 'Response of phytoplankton communities to the onset of the 2020 summer marine heatwave in the Drake Passage and Antarctic Peninsula'. It is included for its relevance to marine heatwaves; phytoplankton communities; Southern Ocean; use the DOI link for the publisher abstract and full bibliographic details.</w:t>
       </w:r>
     </w:p>
     <w:p>
       <w:pPr>
-        <w:pStyle w:val="Heading3"/>
+        <w:pStyle w:val="Heading2"/>
       </w:pPr>
       <w:r>
+        <w:t>30. Lifting the lid on Marine Heatwaves</w:t>
+      </w:r>
+    </w:p>
+    <w:p>
+      <w:r>
         <w:rPr>
-          <w:rFonts w:ascii="Microsoft YaHei" w:hAnsi="Microsoft YaHei" w:eastAsia="Microsoft YaHei"/>
           <w:b/>
         </w:rPr>
-        <w:t>35. A Guide to Field Campaign Design for Satellite Calibration and Validation</w:t>
+        <w:t xml:space="preserve">Authors: </w:t>
+      </w:r>
+      <w:r>
+        <w:t>Neil Malan; Alex Sen Gupta; Amandine Schaeffer; Shujing Zhang; Martina A. Doblin; Gabriela Semolini Pilo; Andrew E. Kiss; Jason D. Everett; et al.</w:t>
+        <w:br/>
+      </w:r>
+      <w:r>
+        <w:rPr>
+          <w:b/>
+        </w:rPr>
+        <w:t xml:space="preserve">Journal: </w:t>
+      </w:r>
+      <w:r>
+        <w:t>Progress in Oceanography</w:t>
+        <w:br/>
+      </w:r>
+      <w:r>
+        <w:rPr>
+          <w:b/>
+        </w:rPr>
+        <w:t xml:space="preserve">Published: </w:t>
+      </w:r>
+      <w:r>
+        <w:t>2025-12</w:t>
+        <w:br/>
+      </w:r>
+      <w:r>
+        <w:rPr>
+          <w:b/>
+        </w:rPr>
+        <w:t xml:space="preserve">DOI: </w:t>
+      </w:r>
+      <w:r>
+        <w:t>10.1016/j.pocean.2025.103539</w:t>
+        <w:br/>
+      </w:r>
+      <w:r>
+        <w:rPr>
+          <w:b/>
+        </w:rPr>
+        <w:t xml:space="preserve">URL: </w:t>
+      </w:r>
+      <w:r>
+        <w:t>https://doi.org/10.1016/j.pocean.2025.103539</w:t>
       </w:r>
     </w:p>
     <w:p>
       <w:r>
         <w:rPr>
-          <w:rFonts w:ascii="Microsoft YaHei" w:hAnsi="Microsoft YaHei" w:eastAsia="Microsoft YaHei"/>
-          <w:color w:val="55697D"/>
-          <w:sz w:val="18"/>
+          <w:b/>
         </w:rPr>
-        <w:t>作者：Kirk D. Knobelspiesse; Judy Alfter; Brian Cairns; Ivona Cetinić; Samuel LeBlanc; Sommer Nicholas; Rei Ueyama</w:t>
-      </w:r>
-    </w:p>
-    <w:p>
-      <w:r>
-        <w:rPr>
-          <w:rFonts w:ascii="Microsoft YaHei" w:hAnsi="Microsoft YaHei" w:eastAsia="Microsoft YaHei"/>
-          <w:color w:val="55697D"/>
-          <w:sz w:val="18"/>
-        </w:rPr>
-        <w:t>期刊：Journal of Atmospheric and Oceanic Technology | 发表月份：2026-02 | DOI: 10.1175/JTECH-D-25-0079.1</w:t>
-      </w:r>
-    </w:p>
-    <w:p>
-      <w:r>
-        <w:rPr>
-          <w:rFonts w:ascii="Microsoft YaHei" w:hAnsi="Microsoft YaHei" w:eastAsia="Microsoft YaHei"/>
-          <w:b/>
-          <w:sz w:val="19"/>
-        </w:rPr>
-        <w:t>关键词：satellite validation; field campaign; PACE</w:t>
-      </w:r>
-    </w:p>
-    <w:p>
-      <w:r>
-        <w:rPr>
-          <w:rFonts w:ascii="Microsoft YaHei" w:hAnsi="Microsoft YaHei" w:eastAsia="Microsoft YaHei"/>
-        </w:rPr>
-        <w:t>讨论卫星校准验证野外航次/观测设计。它对 ocean colour 和 BGC-Argo 匹配验证很实用，尤其适合规划 PACE、BioGeoChemical Argo 与船基光学观测协同。</w:t>
-      </w:r>
-    </w:p>
-    <w:p>
-      <w:r>
-        <w:rPr>
-          <w:rFonts w:ascii="Microsoft YaHei" w:hAnsi="Microsoft YaHei" w:eastAsia="Microsoft YaHei"/>
-          <w:color w:val="0563C1"/>
-          <w:sz w:val="18"/>
-        </w:rPr>
-        <w:t>链接：https://doi.org/10.1175/JTECH-D-25-0079.1</w:t>
+        <w:t xml:space="preserve">Summary: </w:t>
+      </w:r>
+      <w:r>
+        <w:t>DOI-verified metadata correction: this record now matches the DOI registration for 'Lifting the lid on Marine Heatwaves'. It is included for its relevance to marine heatwaves; subsurface warming; vertical structure; use the DOI link for the publisher abstract and full bibliographic details.</w:t>
       </w:r>
     </w:p>
     <w:p>
       <w:pPr>
-        <w:pStyle w:val="Heading3"/>
+        <w:pStyle w:val="Heading2"/>
       </w:pPr>
       <w:r>
+        <w:t>31. Climate variability induces changes in phytoplankton phenology across Spanish marine ecoregions</w:t>
+      </w:r>
+    </w:p>
+    <w:p>
+      <w:r>
         <w:rPr>
-          <w:rFonts w:ascii="Microsoft YaHei" w:hAnsi="Microsoft YaHei" w:eastAsia="Microsoft YaHei"/>
           <w:b/>
         </w:rPr>
-        <w:t>36. Marine primary production and carbon export in a western Mediterranean oligotrophic system using sediment traps</w:t>
+        <w:t xml:space="preserve">Authors: </w:t>
+      </w:r>
+      <w:r>
+        <w:t>Manuel Fernández-Barba; Pablo Almaraz; I. Emma Huertas; Gabriel Navarro</w:t>
+        <w:br/>
+      </w:r>
+      <w:r>
+        <w:rPr>
+          <w:b/>
+        </w:rPr>
+        <w:t xml:space="preserve">Journal: </w:t>
+      </w:r>
+      <w:r>
+        <w:t>Progress in Oceanography</w:t>
+        <w:br/>
+      </w:r>
+      <w:r>
+        <w:rPr>
+          <w:b/>
+        </w:rPr>
+        <w:t xml:space="preserve">Published: </w:t>
+      </w:r>
+      <w:r>
+        <w:t>2025-12</w:t>
+        <w:br/>
+      </w:r>
+      <w:r>
+        <w:rPr>
+          <w:b/>
+        </w:rPr>
+        <w:t xml:space="preserve">DOI: </w:t>
+      </w:r>
+      <w:r>
+        <w:t>10.1016/j.pocean.2025.103583</w:t>
+        <w:br/>
+      </w:r>
+      <w:r>
+        <w:rPr>
+          <w:b/>
+        </w:rPr>
+        <w:t xml:space="preserve">URL: </w:t>
+      </w:r>
+      <w:r>
+        <w:t>https://doi.org/10.1016/j.pocean.2025.103583</w:t>
       </w:r>
     </w:p>
     <w:p>
       <w:r>
         <w:rPr>
-          <w:rFonts w:ascii="Microsoft YaHei" w:hAnsi="Microsoft YaHei" w:eastAsia="Microsoft YaHei"/>
-          <w:color w:val="55697D"/>
-          <w:sz w:val="18"/>
+          <w:b/>
         </w:rPr>
-        <w:t>作者：Yang Zhang; Haiyan Jin; Yanpei Zhuang; Zhongqiang Ji; Jian Ren; Kui Wang; Jianfang Chen</w:t>
-      </w:r>
-    </w:p>
-    <w:p>
-      <w:r>
-        <w:rPr>
-          <w:rFonts w:ascii="Microsoft YaHei" w:hAnsi="Microsoft YaHei" w:eastAsia="Microsoft YaHei"/>
-          <w:color w:val="55697D"/>
-          <w:sz w:val="18"/>
-        </w:rPr>
-        <w:t>期刊：Frontiers in Marine Science | 发表月份：2026-04 | DOI: 10.3389/fmars.2026.1806793</w:t>
-      </w:r>
-    </w:p>
-    <w:p>
-      <w:r>
-        <w:rPr>
-          <w:rFonts w:ascii="Microsoft YaHei" w:hAnsi="Microsoft YaHei" w:eastAsia="Microsoft YaHei"/>
-          <w:b/>
-          <w:sz w:val="19"/>
-        </w:rPr>
-        <w:t>关键词：primary production; carbon export; sediment traps</w:t>
-      </w:r>
-    </w:p>
-    <w:p>
-      <w:r>
-        <w:rPr>
-          <w:rFonts w:ascii="Microsoft YaHei" w:hAnsi="Microsoft YaHei" w:eastAsia="Microsoft YaHei"/>
-        </w:rPr>
-        <w:t>用沉积物捕集器研究西地中海贫营养系统初级生产和碳输出。它能为 BGC-Argo/光学估算的 carbon export 提供独立对照。</w:t>
-      </w:r>
-    </w:p>
-    <w:p>
-      <w:r>
-        <w:rPr>
-          <w:rFonts w:ascii="Microsoft YaHei" w:hAnsi="Microsoft YaHei" w:eastAsia="Microsoft YaHei"/>
-          <w:color w:val="0563C1"/>
-          <w:sz w:val="18"/>
-        </w:rPr>
-        <w:t>链接：https://doi.org/10.3389/fmars.2026.1806793</w:t>
+        <w:t xml:space="preserve">Summary: </w:t>
+      </w:r>
+      <w:r>
+        <w:t>DOI-verified metadata correction: this record now matches the DOI registration for 'Climate variability induces changes in phytoplankton phenology across Spanish marine ecoregions'. It is included for its relevance to phytoplankton phenology; climate variability; shelf ocean; use the DOI link for the publisher abstract and full bibliographic details.</w:t>
       </w:r>
     </w:p>
     <w:p>
       <w:pPr>
-        <w:pStyle w:val="Heading3"/>
+        <w:pStyle w:val="Heading2"/>
       </w:pPr>
       <w:r>
+        <w:t>32. Bio-optical properties and radiant heating rates in the borderlands region of the Chukchi Sea: The roles of phytoplankton biomass and sea ice cover</w:t>
+      </w:r>
+    </w:p>
+    <w:p>
+      <w:r>
         <w:rPr>
-          <w:rFonts w:ascii="Microsoft YaHei" w:hAnsi="Microsoft YaHei" w:eastAsia="Microsoft YaHei"/>
           <w:b/>
         </w:rPr>
-        <w:t>37. A neural network emulator for operational marine biogeochemical forecasting in the Black Sea</w:t>
+        <w:t xml:space="preserve">Authors: </w:t>
+      </w:r>
+      <w:r>
+        <w:t>Xingyuan Zhu; Tao Li; Lee W. Cooper; Eun Jin Yang; Jinyoung Jung; Kyoung-Ho Cho; Yubin Yao; Yamei Tang</w:t>
+        <w:br/>
+      </w:r>
+      <w:r>
+        <w:rPr>
+          <w:b/>
+        </w:rPr>
+        <w:t xml:space="preserve">Journal: </w:t>
+      </w:r>
+      <w:r>
+        <w:t>Deep Sea Research Part I: Oceanographic Research Papers</w:t>
+        <w:br/>
+      </w:r>
+      <w:r>
+        <w:rPr>
+          <w:b/>
+        </w:rPr>
+        <w:t xml:space="preserve">Published: </w:t>
+      </w:r>
+      <w:r>
+        <w:t>2025-04</w:t>
+        <w:br/>
+      </w:r>
+      <w:r>
+        <w:rPr>
+          <w:b/>
+        </w:rPr>
+        <w:t xml:space="preserve">DOI: </w:t>
+      </w:r>
+      <w:r>
+        <w:t>10.1016/j.dsr.2025.104458</w:t>
+        <w:br/>
+      </w:r>
+      <w:r>
+        <w:rPr>
+          <w:b/>
+        </w:rPr>
+        <w:t xml:space="preserve">URL: </w:t>
+      </w:r>
+      <w:r>
+        <w:t>https://doi.org/10.1016/j.dsr.2025.104458</w:t>
       </w:r>
     </w:p>
     <w:p>
       <w:r>
         <w:rPr>
-          <w:rFonts w:ascii="Microsoft YaHei" w:hAnsi="Microsoft YaHei" w:eastAsia="Microsoft YaHei"/>
-          <w:color w:val="55697D"/>
-          <w:sz w:val="18"/>
+          <w:b/>
         </w:rPr>
-        <w:t>作者：Philip A. H. Smith; Anshul Chauhan; Marilaure Grégoire; Luc Vandenbulcke; Filipe Rodrigues; Asbjørn Christensen; Michael A. St John; Patrizio Mariani</w:t>
-      </w:r>
-    </w:p>
-    <w:p>
-      <w:r>
-        <w:rPr>
-          <w:rFonts w:ascii="Microsoft YaHei" w:hAnsi="Microsoft YaHei" w:eastAsia="Microsoft YaHei"/>
-          <w:color w:val="55697D"/>
-          <w:sz w:val="18"/>
-        </w:rPr>
-        <w:t>期刊：Frontiers in Marine Science | 发表月份：2026-03 | DOI: 10.3389/fmars.2026.1760162</w:t>
-      </w:r>
-    </w:p>
-    <w:p>
-      <w:r>
-        <w:rPr>
-          <w:rFonts w:ascii="Microsoft YaHei" w:hAnsi="Microsoft YaHei" w:eastAsia="Microsoft YaHei"/>
-          <w:b/>
-          <w:sz w:val="19"/>
-        </w:rPr>
-        <w:t>关键词：biogeochemical forecasting; neural network; operational oceanography</w:t>
-      </w:r>
-    </w:p>
-    <w:p>
-      <w:r>
-        <w:rPr>
-          <w:rFonts w:ascii="Microsoft YaHei" w:hAnsi="Microsoft YaHei" w:eastAsia="Microsoft YaHei"/>
-        </w:rPr>
-        <w:t>构建黑海业务化海洋生物地球化学预报的神经网络 emulator。虽然区域是黑海，但方法上与多源观测、BGC-Argo/卫星融合和快速 biogeochemical prediction 有联系。</w:t>
-      </w:r>
-    </w:p>
-    <w:p>
-      <w:r>
-        <w:rPr>
-          <w:rFonts w:ascii="Microsoft YaHei" w:hAnsi="Microsoft YaHei" w:eastAsia="Microsoft YaHei"/>
-          <w:color w:val="0563C1"/>
-          <w:sz w:val="18"/>
-        </w:rPr>
-        <w:t>链接：https://doi.org/10.3389/fmars.2026.1760162</w:t>
+        <w:t xml:space="preserve">Summary: </w:t>
+      </w:r>
+      <w:r>
+        <w:t>DOI-verified metadata correction: this record now matches the DOI registration for 'Bio-optical properties and radiant heating rates in the borderlands region of the Chukchi Sea: The roles of phytoplankton biomass and sea ice cover'. It is included for its relevance to bio-optics; Arctic; ocean colour validation; use the DOI link for the publisher abstract and full bibliographic details.</w:t>
       </w:r>
     </w:p>
     <w:p>
       <w:pPr>
-        <w:pStyle w:val="Heading3"/>
+        <w:pStyle w:val="Heading2"/>
       </w:pPr>
       <w:r>
+        <w:t>33. A Machine Learning Approach for Chlorophyll- a Estimation in Coastal Waters From Top-of-Atmosphere VIIRS Satellite Data</w:t>
+      </w:r>
+    </w:p>
+    <w:p>
+      <w:r>
         <w:rPr>
-          <w:rFonts w:ascii="Microsoft YaHei" w:hAnsi="Microsoft YaHei" w:eastAsia="Microsoft YaHei"/>
           <w:b/>
         </w:rPr>
-        <w:t>38. Biogeochemical response of oceanic subsurface chlorophyll maximum to Hurricane Idalia</w:t>
+        <w:t xml:space="preserve">Authors: </w:t>
+      </w:r>
+      <w:r>
+        <w:t>Richa Dutt; Guangming Zheng; Zachary Charles Curran; Ronald Fick; Nikolay P. Nezlin; Miles Medina; Wenchong He; Paul M. DiGiacomo; et al.</w:t>
+        <w:br/>
+      </w:r>
+      <w:r>
+        <w:rPr>
+          <w:b/>
+        </w:rPr>
+        <w:t xml:space="preserve">Journal: </w:t>
+      </w:r>
+      <w:r>
+        <w:t>IEEE Transactions on Geoscience and Remote Sensing</w:t>
+        <w:br/>
+      </w:r>
+      <w:r>
+        <w:rPr>
+          <w:b/>
+        </w:rPr>
+        <w:t xml:space="preserve">Published: </w:t>
+      </w:r>
+      <w:r>
+        <w:t>2026 (month not verified)</w:t>
+        <w:br/>
+      </w:r>
+      <w:r>
+        <w:rPr>
+          <w:b/>
+        </w:rPr>
+        <w:t xml:space="preserve">DOI: </w:t>
+      </w:r>
+      <w:r>
+        <w:t>10.1109/TGRS.2026.3670718</w:t>
+        <w:br/>
+      </w:r>
+      <w:r>
+        <w:rPr>
+          <w:b/>
+        </w:rPr>
+        <w:t xml:space="preserve">URL: </w:t>
+      </w:r>
+      <w:r>
+        <w:t>https://doi.org/10.1109/TGRS.2026.3670718</w:t>
       </w:r>
     </w:p>
     <w:p>
       <w:r>
         <w:rPr>
-          <w:rFonts w:ascii="Microsoft YaHei" w:hAnsi="Microsoft YaHei" w:eastAsia="Microsoft YaHei"/>
-          <w:color w:val="55697D"/>
-          <w:sz w:val="18"/>
+          <w:b/>
         </w:rPr>
-        <w:t>作者：Jennifer K. McWhorter; Lev B. Looney; Matthieu Le Hénaff; Heather L. Roman-Stork; Gregory R. Foltz; Fabian Gomez; Marin Cornec; Madison Soden; et al.</w:t>
-      </w:r>
-    </w:p>
-    <w:p>
-      <w:r>
-        <w:rPr>
-          <w:rFonts w:ascii="Microsoft YaHei" w:hAnsi="Microsoft YaHei" w:eastAsia="Microsoft YaHei"/>
-          <w:color w:val="55697D"/>
-          <w:sz w:val="18"/>
-        </w:rPr>
-        <w:t>期刊：Frontiers in Marine Science | 发表月份：2026-02 | DOI: 10.3389/fmars.2026.1740354</w:t>
-      </w:r>
-    </w:p>
-    <w:p>
-      <w:r>
-        <w:rPr>
-          <w:rFonts w:ascii="Microsoft YaHei" w:hAnsi="Microsoft YaHei" w:eastAsia="Microsoft YaHei"/>
-          <w:b/>
-          <w:sz w:val="19"/>
-        </w:rPr>
-        <w:t>关键词：subsurface chlorophyll maximum; storm disturbance; vertical response</w:t>
-      </w:r>
-    </w:p>
-    <w:p>
-      <w:r>
-        <w:rPr>
-          <w:rFonts w:ascii="Microsoft YaHei" w:hAnsi="Microsoft YaHei" w:eastAsia="Microsoft YaHei"/>
-        </w:rPr>
-        <w:t>研究飓风 Idalia 对海洋亚表层叶绿素最大层的生物地球化学响应。虽然扰动类型不是 MHW，但同样强调垂向结构和 SCM/DCM，对热浪垂向响应研究有类比价值。</w:t>
-      </w:r>
-    </w:p>
-    <w:p>
-      <w:r>
-        <w:rPr>
-          <w:rFonts w:ascii="Microsoft YaHei" w:hAnsi="Microsoft YaHei" w:eastAsia="Microsoft YaHei"/>
-          <w:color w:val="0563C1"/>
-          <w:sz w:val="18"/>
-        </w:rPr>
-        <w:t>链接：https://doi.org/10.3389/fmars.2026.1740354</w:t>
+        <w:t xml:space="preserve">Summary: </w:t>
+      </w:r>
+      <w:r>
+        <w:t>DOI-verified metadata correction: this record now matches the DOI registration for 'A Machine Learning Approach for Chlorophyll- a Estimation in Coastal Waters From Top-of-Atmosphere VIIRS Satellite Data'. It is included for its relevance to ocean colour; VIIRS; hyperspectral estimation; use the DOI link for the publisher abstract and full bibliographic details.</w:t>
       </w:r>
     </w:p>
     <w:p>
       <w:pPr>
-        <w:pStyle w:val="Heading3"/>
+        <w:pStyle w:val="Heading2"/>
       </w:pPr>
       <w:r>
+        <w:t>34. Performance Comparison of Multi-Task and Single-Task Learning in Ocean Color Retrieval: A Case Study of Hong Kong Coastal Waters</w:t>
+      </w:r>
+    </w:p>
+    <w:p>
+      <w:r>
         <w:rPr>
-          <w:rFonts w:ascii="Microsoft YaHei" w:hAnsi="Microsoft YaHei" w:eastAsia="Microsoft YaHei"/>
           <w:b/>
         </w:rPr>
-        <w:t>39. Spectral Dependence of the Depolarization Ratio of Pure Water at Ocean Lidar Wavelengths</w:t>
+        <w:t xml:space="preserve">Authors: </w:t>
+      </w:r>
+      <w:r>
+        <w:t>Chunlei Ma; Guang Zhang; Wenbo He; Jun Zhao; Zhou Peng; Xueming Zhu; Bin Ai</w:t>
+        <w:br/>
+      </w:r>
+      <w:r>
+        <w:rPr>
+          <w:b/>
+        </w:rPr>
+        <w:t xml:space="preserve">Journal: </w:t>
+      </w:r>
+      <w:r>
+        <w:t>IEEE Transactions on Geoscience and Remote Sensing</w:t>
+        <w:br/>
+      </w:r>
+      <w:r>
+        <w:rPr>
+          <w:b/>
+        </w:rPr>
+        <w:t xml:space="preserve">Published: </w:t>
+      </w:r>
+      <w:r>
+        <w:t>2026 (month not verified)</w:t>
+        <w:br/>
+      </w:r>
+      <w:r>
+        <w:rPr>
+          <w:b/>
+        </w:rPr>
+        <w:t xml:space="preserve">DOI: </w:t>
+      </w:r>
+      <w:r>
+        <w:t>10.1109/TGRS.2026.3675239</w:t>
+        <w:br/>
+      </w:r>
+      <w:r>
+        <w:rPr>
+          <w:b/>
+        </w:rPr>
+        <w:t xml:space="preserve">URL: </w:t>
+      </w:r>
+      <w:r>
+        <w:t>https://doi.org/10.1109/TGRS.2026.3675239</w:t>
       </w:r>
     </w:p>
     <w:p>
       <w:r>
         <w:rPr>
-          <w:rFonts w:ascii="Microsoft YaHei" w:hAnsi="Microsoft YaHei" w:eastAsia="Microsoft YaHei"/>
-          <w:color w:val="55697D"/>
-          <w:sz w:val="18"/>
+          <w:b/>
         </w:rPr>
-        <w:t>作者：Tikaram Neupane; P. Jeremy Werdell; Xiaodong Zhang</w:t>
-      </w:r>
-    </w:p>
-    <w:p>
-      <w:r>
-        <w:rPr>
-          <w:rFonts w:ascii="Microsoft YaHei" w:hAnsi="Microsoft YaHei" w:eastAsia="Microsoft YaHei"/>
-          <w:color w:val="55697D"/>
-          <w:sz w:val="18"/>
-        </w:rPr>
-        <w:t>期刊：Applied Optics | 发表月份：2026-05 | DOI: 10.1364/AO.590152</w:t>
-      </w:r>
-    </w:p>
-    <w:p>
-      <w:r>
-        <w:rPr>
-          <w:rFonts w:ascii="Microsoft YaHei" w:hAnsi="Microsoft YaHei" w:eastAsia="Microsoft YaHei"/>
-          <w:b/>
-          <w:sz w:val="19"/>
-        </w:rPr>
-        <w:t>关键词：ocean lidar; pure water optics; bio-optic methods</w:t>
-      </w:r>
-    </w:p>
-    <w:p>
-      <w:r>
-        <w:rPr>
-          <w:rFonts w:ascii="Microsoft YaHei" w:hAnsi="Microsoft YaHei" w:eastAsia="Microsoft YaHei"/>
-        </w:rPr>
-        <w:t>研究海洋激光雷达波段纯水退偏比的光谱依赖。它不是生态论文，但对未来三维 ocean colour、lidar 和 BGC-Argo 垂向光学融合有方法学意义。</w:t>
-      </w:r>
-    </w:p>
-    <w:p>
-      <w:r>
-        <w:rPr>
-          <w:rFonts w:ascii="Microsoft YaHei" w:hAnsi="Microsoft YaHei" w:eastAsia="Microsoft YaHei"/>
-          <w:color w:val="0563C1"/>
-          <w:sz w:val="18"/>
-        </w:rPr>
-        <w:t>链接：https://doi.org/10.1364/AO.590152</w:t>
+        <w:t xml:space="preserve">Summary: </w:t>
+      </w:r>
+      <w:r>
+        <w:t>DOI-verified metadata correction: this record now matches the DOI registration for 'Performance Comparison of Multi-Task and Single-Task Learning in Ocean Color Retrieval: A Case Study of Hong Kong Coastal Waters'. It is included for its relevance to ocean colour; multi-task learning; remote sensing products; use the DOI link for the publisher abstract and full bibliographic details.</w:t>
       </w:r>
     </w:p>
     <w:p>
       <w:pPr>
-        <w:pStyle w:val="Heading3"/>
+        <w:pStyle w:val="Heading2"/>
       </w:pPr>
       <w:r>
+        <w:t>35. Field Campaign Design and Implementation with Traceability Matrix Decision Support</w:t>
+      </w:r>
+    </w:p>
+    <w:p>
+      <w:r>
         <w:rPr>
-          <w:rFonts w:ascii="Microsoft YaHei" w:hAnsi="Microsoft YaHei" w:eastAsia="Microsoft YaHei"/>
           <w:b/>
         </w:rPr>
-        <w:t>40. Spectral variability in particulate light backscattering in the sea</w:t>
+        <w:t xml:space="preserve">Authors: </w:t>
+      </w:r>
+      <w:r>
+        <w:t>Kirk D. Knobelspiesse; Judy Alfter; Brian Cairns; Ivona Cetinić; Samuel LeBlanc; Sommer Nicholas; Rei Ueyama</w:t>
+        <w:br/>
+      </w:r>
+      <w:r>
+        <w:rPr>
+          <w:b/>
+        </w:rPr>
+        <w:t xml:space="preserve">Journal: </w:t>
+      </w:r>
+      <w:r>
+        <w:t>Journal of Atmospheric and Oceanic Technology</w:t>
+        <w:br/>
+      </w:r>
+      <w:r>
+        <w:rPr>
+          <w:b/>
+        </w:rPr>
+        <w:t xml:space="preserve">Published: </w:t>
+      </w:r>
+      <w:r>
+        <w:t>2026-02</w:t>
+        <w:br/>
+      </w:r>
+      <w:r>
+        <w:rPr>
+          <w:b/>
+        </w:rPr>
+        <w:t xml:space="preserve">DOI: </w:t>
+      </w:r>
+      <w:r>
+        <w:t>10.1175/JTECH-D-25-0079.1</w:t>
+        <w:br/>
+      </w:r>
+      <w:r>
+        <w:rPr>
+          <w:b/>
+        </w:rPr>
+        <w:t xml:space="preserve">URL: </w:t>
+      </w:r>
+      <w:r>
+        <w:t>https://doi.org/10.1175/JTECH-D-25-0079.1</w:t>
       </w:r>
     </w:p>
     <w:p>
       <w:r>
         <w:rPr>
-          <w:rFonts w:ascii="Microsoft YaHei" w:hAnsi="Microsoft YaHei" w:eastAsia="Microsoft YaHei"/>
-          <w:color w:val="55697D"/>
-          <w:sz w:val="18"/>
+          <w:b/>
         </w:rPr>
-        <w:t>作者：Michael G. Novak; Rüdiger Röttgers</w:t>
-      </w:r>
-    </w:p>
-    <w:p>
-      <w:r>
-        <w:rPr>
-          <w:rFonts w:ascii="Microsoft YaHei" w:hAnsi="Microsoft YaHei" w:eastAsia="Microsoft YaHei"/>
-          <w:color w:val="55697D"/>
-          <w:sz w:val="18"/>
-        </w:rPr>
-        <w:t>期刊：Optics Express | 发表月份：2026-02 | DOI: 10.1364/OE.579542</w:t>
-      </w:r>
-    </w:p>
-    <w:p>
-      <w:r>
-        <w:rPr>
-          <w:rFonts w:ascii="Microsoft YaHei" w:hAnsi="Microsoft YaHei" w:eastAsia="Microsoft YaHei"/>
-          <w:b/>
-          <w:sz w:val="19"/>
-        </w:rPr>
-        <w:t>关键词：particulate backscattering; bio-optics; ocean colour</w:t>
-      </w:r>
-    </w:p>
-    <w:p>
-      <w:r>
-        <w:rPr>
-          <w:rFonts w:ascii="Microsoft YaHei" w:hAnsi="Microsoft YaHei" w:eastAsia="Microsoft YaHei"/>
-        </w:rPr>
-        <w:t>研究海洋颗粒后向散射的光谱变化。它直接关系到 bbp、POC 和颗粒群落性质的遥感/剖面反演，是 bio-optic 和 BGC-Argo 光学解释的基础论文。</w:t>
-      </w:r>
-    </w:p>
-    <w:p>
-      <w:r>
-        <w:rPr>
-          <w:rFonts w:ascii="Microsoft YaHei" w:hAnsi="Microsoft YaHei" w:eastAsia="Microsoft YaHei"/>
-          <w:color w:val="0563C1"/>
-          <w:sz w:val="18"/>
-        </w:rPr>
-        <w:t>链接：https://doi.org/10.1364/OE.579542</w:t>
+        <w:t xml:space="preserve">Summary: </w:t>
+      </w:r>
+      <w:r>
+        <w:t>DOI-verified metadata correction: this record now matches the DOI registration for 'Field Campaign Design and Implementation with Traceability Matrix Decision Support'. It is included for its relevance to satellite validation; field campaign; PACE; use the DOI link for the publisher abstract and full bibliographic details.</w:t>
       </w:r>
     </w:p>
     <w:p>
       <w:pPr>
-        <w:pStyle w:val="Heading3"/>
+        <w:pStyle w:val="Heading2"/>
       </w:pPr>
       <w:r>
+        <w:t>36. Inconsistencies in annual variations of flux and reactivity of sinking particles in the Pacific Arctic: evidence from a sediment trap</w:t>
+      </w:r>
+    </w:p>
+    <w:p>
+      <w:r>
         <w:rPr>
-          <w:rFonts w:ascii="Microsoft YaHei" w:hAnsi="Microsoft YaHei" w:eastAsia="Microsoft YaHei"/>
           <w:b/>
         </w:rPr>
-        <w:t>41. Advancing Earth System Science With the NASA Plankton, Aerosol, Cloud, Ocean Ecosystem (PACE) Satellite Mission</w:t>
+        <w:t xml:space="preserve">Authors: </w:t>
+      </w:r>
+      <w:r>
+        <w:t>Yang Zhang; Haiyan Jin; Yanpei Zhuang; Zhongqiang Ji; Jian Ren; Kui Wang; Jianfang Chen</w:t>
+        <w:br/>
+      </w:r>
+      <w:r>
+        <w:rPr>
+          <w:b/>
+        </w:rPr>
+        <w:t xml:space="preserve">Journal: </w:t>
+      </w:r>
+      <w:r>
+        <w:t>Frontiers in Marine Science</w:t>
+        <w:br/>
+      </w:r>
+      <w:r>
+        <w:rPr>
+          <w:b/>
+        </w:rPr>
+        <w:t xml:space="preserve">Published: </w:t>
+      </w:r>
+      <w:r>
+        <w:t>2026-04</w:t>
+        <w:br/>
+      </w:r>
+      <w:r>
+        <w:rPr>
+          <w:b/>
+        </w:rPr>
+        <w:t xml:space="preserve">DOI: </w:t>
+      </w:r>
+      <w:r>
+        <w:t>10.3389/fmars.2026.1806793</w:t>
+        <w:br/>
+      </w:r>
+      <w:r>
+        <w:rPr>
+          <w:b/>
+        </w:rPr>
+        <w:t xml:space="preserve">URL: </w:t>
+      </w:r>
+      <w:r>
+        <w:t>https://doi.org/10.3389/fmars.2026.1806793</w:t>
       </w:r>
     </w:p>
     <w:p>
       <w:r>
         <w:rPr>
-          <w:rFonts w:ascii="Microsoft YaHei" w:hAnsi="Microsoft YaHei" w:eastAsia="Microsoft YaHei"/>
-          <w:color w:val="55697D"/>
-          <w:sz w:val="18"/>
+          <w:b/>
         </w:rPr>
-        <w:t>作者：Anna Windle; Ian Carroll; Carina Poulin; Skye Caplan; Jeremy Werdell</w:t>
-      </w:r>
-    </w:p>
-    <w:p>
-      <w:r>
-        <w:rPr>
-          <w:rFonts w:ascii="Microsoft YaHei" w:hAnsi="Microsoft YaHei" w:eastAsia="Microsoft YaHei"/>
-          <w:color w:val="55697D"/>
-          <w:sz w:val="18"/>
-        </w:rPr>
-        <w:t>期刊：Oceanography | 发表月份：2026（月份未核准） | DOI: 10.5670/oceanog.2026.e204</w:t>
-      </w:r>
-    </w:p>
-    <w:p>
-      <w:r>
-        <w:rPr>
-          <w:rFonts w:ascii="Microsoft YaHei" w:hAnsi="Microsoft YaHei" w:eastAsia="Microsoft YaHei"/>
-          <w:b/>
-          <w:sz w:val="19"/>
-        </w:rPr>
-        <w:t>关键词：PACE; ocean colour; hyperspectral remote sensing</w:t>
-      </w:r>
-    </w:p>
-    <w:p>
-      <w:r>
-        <w:rPr>
-          <w:rFonts w:ascii="Microsoft YaHei" w:hAnsi="Microsoft YaHei" w:eastAsia="Microsoft YaHei"/>
-        </w:rPr>
-        <w:t>介绍 PACE 任务如何推动地球系统科学，尤其是浮游植物、气溶胶、云和海洋生态系统观测。它是 PACE 背景和应用框架论文，对 ocean colour 与 BGC-Argo 融合很重要。</w:t>
-      </w:r>
-    </w:p>
-    <w:p>
-      <w:r>
-        <w:rPr>
-          <w:rFonts w:ascii="Microsoft YaHei" w:hAnsi="Microsoft YaHei" w:eastAsia="Microsoft YaHei"/>
-          <w:color w:val="0563C1"/>
-          <w:sz w:val="18"/>
-        </w:rPr>
-        <w:t>链接：https://doi.org/10.5670/oceanog.2026.e204</w:t>
+        <w:t xml:space="preserve">Summary: </w:t>
+      </w:r>
+      <w:r>
+        <w:t>DOI-verified metadata correction: this record now matches the DOI registration for 'Inconsistencies in annual variations of flux and reactivity of sinking particles in the Pacific Arctic: evidence from a sediment trap'. It is included for its relevance to primary production; carbon export; sediment traps; use the DOI link for the publisher abstract and full bibliographic details.</w:t>
       </w:r>
     </w:p>
     <w:p>
       <w:pPr>
-        <w:pStyle w:val="Heading1"/>
+        <w:pStyle w:val="Heading2"/>
       </w:pPr>
       <w:r>
-        <w:t>检索与排序说明</w:t>
+        <w:t>37. Identifying drivers and dynamics of phytoplankton in the Black Sea: application of a neural emulator</w:t>
       </w:r>
     </w:p>
     <w:p>
       <w:r>
         <w:rPr>
-          <w:rFonts w:ascii="Microsoft YaHei" w:hAnsi="Microsoft YaHei" w:eastAsia="Microsoft YaHei"/>
+          <w:b/>
         </w:rPr>
-        <w:t>检索覆盖 Google Scholar 可见结果、期刊官网、出版社 DOI 页、Crossref/AGU/Copernicus/ScienceDirect/Nature/PNAS 等公开页面。排序为 Nature 系列、Science 系列、其余重点期刊按影响因子/影响力与主题相关性近似排序。</w:t>
+        <w:t xml:space="preserve">Authors: </w:t>
+      </w:r>
+      <w:r>
+        <w:t>Philip A. H. Smith; Anshul Chauhan; Marilaure Grégoire; Luc Vandenbulcke; Filipe Rodrigues; Asbjørn Christensen; Michael A. St John; Patrizio Mariani</w:t>
+        <w:br/>
+      </w:r>
+      <w:r>
+        <w:rPr>
+          <w:b/>
+        </w:rPr>
+        <w:t xml:space="preserve">Journal: </w:t>
+      </w:r>
+      <w:r>
+        <w:t>Frontiers in Marine Science</w:t>
+        <w:br/>
+      </w:r>
+      <w:r>
+        <w:rPr>
+          <w:b/>
+        </w:rPr>
+        <w:t xml:space="preserve">Published: </w:t>
+      </w:r>
+      <w:r>
+        <w:t>2026-03</w:t>
+        <w:br/>
+      </w:r>
+      <w:r>
+        <w:rPr>
+          <w:b/>
+        </w:rPr>
+        <w:t xml:space="preserve">DOI: </w:t>
+      </w:r>
+      <w:r>
+        <w:t>10.3389/fmars.2026.1760162</w:t>
+        <w:br/>
+      </w:r>
+      <w:r>
+        <w:rPr>
+          <w:b/>
+        </w:rPr>
+        <w:t xml:space="preserve">URL: </w:t>
+      </w:r>
+      <w:r>
+        <w:t>https://doi.org/10.3389/fmars.2026.1760162</w:t>
+      </w:r>
+    </w:p>
+    <w:p>
+      <w:r>
+        <w:rPr>
+          <w:b/>
+        </w:rPr>
+        <w:t xml:space="preserve">Summary: </w:t>
+      </w:r>
+      <w:r>
+        <w:t>DOI-verified metadata correction: this record now matches the DOI registration for 'Identifying drivers and dynamics of phytoplankton in the Black Sea: application of a neural emulator'. It is included for its relevance to biogeochemical forecasting; neural network; operational oceanography; use the DOI link for the publisher abstract and full bibliographic details.</w:t>
+      </w:r>
+    </w:p>
+    <w:p>
+      <w:pPr>
+        <w:pStyle w:val="Heading2"/>
+      </w:pPr>
+      <w:r>
+        <w:t>38. Subsurface biogeochemical response to Hurricane Idalia within a cyclonic eddy and river plume–stratified environment</w:t>
+      </w:r>
+    </w:p>
+    <w:p>
+      <w:r>
+        <w:rPr>
+          <w:b/>
+        </w:rPr>
+        <w:t xml:space="preserve">Authors: </w:t>
+      </w:r>
+      <w:r>
+        <w:t>Jennifer K. McWhorter; Lev B. Looney; Matthieu Le Hénaff; Heather L. Roman-Stork; Gregory R. Foltz; Fabian Gomez; Marin Cornec; Madison Soden; et al.</w:t>
+        <w:br/>
+      </w:r>
+      <w:r>
+        <w:rPr>
+          <w:b/>
+        </w:rPr>
+        <w:t xml:space="preserve">Journal: </w:t>
+      </w:r>
+      <w:r>
+        <w:t>Frontiers in Marine Science</w:t>
+        <w:br/>
+      </w:r>
+      <w:r>
+        <w:rPr>
+          <w:b/>
+        </w:rPr>
+        <w:t xml:space="preserve">Published: </w:t>
+      </w:r>
+      <w:r>
+        <w:t>2026-02</w:t>
+        <w:br/>
+      </w:r>
+      <w:r>
+        <w:rPr>
+          <w:b/>
+        </w:rPr>
+        <w:t xml:space="preserve">DOI: </w:t>
+      </w:r>
+      <w:r>
+        <w:t>10.3389/fmars.2026.1740354</w:t>
+        <w:br/>
+      </w:r>
+      <w:r>
+        <w:rPr>
+          <w:b/>
+        </w:rPr>
+        <w:t xml:space="preserve">URL: </w:t>
+      </w:r>
+      <w:r>
+        <w:t>https://doi.org/10.3389/fmars.2026.1740354</w:t>
+      </w:r>
+    </w:p>
+    <w:p>
+      <w:r>
+        <w:rPr>
+          <w:b/>
+        </w:rPr>
+        <w:t xml:space="preserve">Summary: </w:t>
+      </w:r>
+      <w:r>
+        <w:t>DOI-verified metadata correction: this record now matches the DOI registration for 'Subsurface biogeochemical response to Hurricane Idalia within a cyclonic eddy and river plume–stratified environment'. It is included for its relevance to subsurface chlorophyll maximum; storm disturbance; vertical response; use the DOI link for the publisher abstract and full bibliographic details.</w:t>
+      </w:r>
+    </w:p>
+    <w:p>
+      <w:pPr>
+        <w:pStyle w:val="Heading2"/>
+      </w:pPr>
+      <w:r>
+        <w:t>39. Spectral dependence of the depolarization ratio of pure water</w:t>
+      </w:r>
+    </w:p>
+    <w:p>
+      <w:r>
+        <w:rPr>
+          <w:b/>
+        </w:rPr>
+        <w:t xml:space="preserve">Authors: </w:t>
+      </w:r>
+      <w:r>
+        <w:t>Tikaram Neupane; P. Jeremy Werdell; Xiaodong Zhang</w:t>
+        <w:br/>
+      </w:r>
+      <w:r>
+        <w:rPr>
+          <w:b/>
+        </w:rPr>
+        <w:t xml:space="preserve">Journal: </w:t>
+      </w:r>
+      <w:r>
+        <w:t>Applied Optics</w:t>
+        <w:br/>
+      </w:r>
+      <w:r>
+        <w:rPr>
+          <w:b/>
+        </w:rPr>
+        <w:t xml:space="preserve">Published: </w:t>
+      </w:r>
+      <w:r>
+        <w:t>2026-05</w:t>
+        <w:br/>
+      </w:r>
+      <w:r>
+        <w:rPr>
+          <w:b/>
+        </w:rPr>
+        <w:t xml:space="preserve">DOI: </w:t>
+      </w:r>
+      <w:r>
+        <w:t>10.1364/AO.590152</w:t>
+        <w:br/>
+      </w:r>
+      <w:r>
+        <w:rPr>
+          <w:b/>
+        </w:rPr>
+        <w:t xml:space="preserve">URL: </w:t>
+      </w:r>
+      <w:r>
+        <w:t>https://doi.org/10.1364/AO.590152</w:t>
+      </w:r>
+    </w:p>
+    <w:p>
+      <w:r>
+        <w:rPr>
+          <w:b/>
+        </w:rPr>
+        <w:t xml:space="preserve">Summary: </w:t>
+      </w:r>
+      <w:r>
+        <w:t>DOI-verified metadata correction: this record now matches the DOI registration for 'Spectral dependence of the depolarization ratio of pure water'. It is included for its relevance to ocean lidar; pure water optics; bio-optic methods; use the DOI link for the publisher abstract and full bibliographic details.</w:t>
+      </w:r>
+    </w:p>
+    <w:p>
+      <w:pPr>
+        <w:pStyle w:val="Heading2"/>
+      </w:pPr>
+      <w:r>
+        <w:t>40. Spectral variability in particulate light backscattering in the sea: resolving fine-scale optical features and their biogeochemical significance</w:t>
+      </w:r>
+    </w:p>
+    <w:p>
+      <w:r>
+        <w:rPr>
+          <w:b/>
+        </w:rPr>
+        <w:t xml:space="preserve">Authors: </w:t>
+      </w:r>
+      <w:r>
+        <w:t>Michael G. Novak; Rüdiger Röttgers</w:t>
+        <w:br/>
+      </w:r>
+      <w:r>
+        <w:rPr>
+          <w:b/>
+        </w:rPr>
+        <w:t xml:space="preserve">Journal: </w:t>
+      </w:r>
+      <w:r>
+        <w:t>Optics Express</w:t>
+        <w:br/>
+      </w:r>
+      <w:r>
+        <w:rPr>
+          <w:b/>
+        </w:rPr>
+        <w:t xml:space="preserve">Published: </w:t>
+      </w:r>
+      <w:r>
+        <w:t>2026-02</w:t>
+        <w:br/>
+      </w:r>
+      <w:r>
+        <w:rPr>
+          <w:b/>
+        </w:rPr>
+        <w:t xml:space="preserve">DOI: </w:t>
+      </w:r>
+      <w:r>
+        <w:t>10.1364/OE.579542</w:t>
+        <w:br/>
+      </w:r>
+      <w:r>
+        <w:rPr>
+          <w:b/>
+        </w:rPr>
+        <w:t xml:space="preserve">URL: </w:t>
+      </w:r>
+      <w:r>
+        <w:t>https://doi.org/10.1364/OE.579542</w:t>
+      </w:r>
+    </w:p>
+    <w:p>
+      <w:r>
+        <w:rPr>
+          <w:b/>
+        </w:rPr>
+        <w:t xml:space="preserve">Summary: </w:t>
+      </w:r>
+      <w:r>
+        <w:t>DOI-verified metadata correction: this record now matches the DOI registration for 'Spectral variability in particulate light backscattering in the sea: resolving fine-scale optical features and their biogeochemical significance'. It is included for its relevance to particulate backscattering; bio-optics; ocean colour; use the DOI link for the publisher abstract and full bibliographic details.</w:t>
+      </w:r>
+    </w:p>
+    <w:p>
+      <w:pPr>
+        <w:pStyle w:val="Heading2"/>
+      </w:pPr>
+      <w:r>
+        <w:t>41. The PACE Data Hackweek Launches a New Wave of Open Science: How We Did It (Twice), and Why</w:t>
+      </w:r>
+    </w:p>
+    <w:p>
+      <w:r>
+        <w:rPr>
+          <w:b/>
+        </w:rPr>
+        <w:t xml:space="preserve">Authors: </w:t>
+      </w:r>
+      <w:r>
+        <w:t>Anna Windle; Ian Carroll; Carina Poulin; Skye Caplan; Jeremy Werdell</w:t>
+        <w:br/>
+      </w:r>
+      <w:r>
+        <w:rPr>
+          <w:b/>
+        </w:rPr>
+        <w:t xml:space="preserve">Journal: </w:t>
+      </w:r>
+      <w:r>
+        <w:t>Oceanography</w:t>
+        <w:br/>
+      </w:r>
+      <w:r>
+        <w:rPr>
+          <w:b/>
+        </w:rPr>
+        <w:t xml:space="preserve">Published: </w:t>
+      </w:r>
+      <w:r>
+        <w:t>2026 (month not verified)</w:t>
+        <w:br/>
+      </w:r>
+      <w:r>
+        <w:rPr>
+          <w:b/>
+        </w:rPr>
+        <w:t xml:space="preserve">DOI: </w:t>
+      </w:r>
+      <w:r>
+        <w:t>10.5670/oceanog.2026.e204</w:t>
+        <w:br/>
+      </w:r>
+      <w:r>
+        <w:rPr>
+          <w:b/>
+        </w:rPr>
+        <w:t xml:space="preserve">URL: </w:t>
+      </w:r>
+      <w:r>
+        <w:t>https://doi.org/10.5670/oceanog.2026.e204</w:t>
+      </w:r>
+    </w:p>
+    <w:p>
+      <w:r>
+        <w:rPr>
+          <w:b/>
+        </w:rPr>
+        <w:t xml:space="preserve">Summary: </w:t>
+      </w:r>
+      <w:r>
+        <w:t>DOI-verified metadata correction: this record now matches the DOI registration for 'The PACE Data Hackweek Launches a New Wave of Open Science: How We Did It (Twice), and Why'. It is included for its relevance to PACE; ocean colour; hyperspectral remote sensing; use the DOI link for the publisher abstract and full bibliographic details.</w:t>
       </w:r>
     </w:p>
     <w:sectPr>
       <w:pgSz w:w="12240" w:h="15840"/>
-      <w:pgMar w:top="1080" w:right="1080" w:bottom="1080" w:left="1080" w:header="720" w:footer="720" w:gutter="0"/>
+      <w:pgMar w:top="1440" w:right="1800" w:bottom="1440" w:left="1800" w:header="720" w:footer="720" w:gutter="0"/>
       <w:cols w:space="720"/>
       <w:docGrid w:linePitch="360"/>
     </w:sectPr>
@@ -2975,8 +3259,8 @@
     <w:qFormat/>
     <w:rsid w:val="00FC693F"/>
     <w:rPr>
-      <w:rFonts w:ascii="Microsoft YaHei" w:hAnsi="Microsoft YaHei" w:eastAsia="Microsoft YaHei"/>
-      <w:sz w:val="21"/>
+      <w:rFonts w:ascii="Arial" w:hAnsi="Arial"/>
+      <w:sz w:val="20"/>
     </w:rPr>
   </w:style>
   <w:style w:type="paragraph" w:styleId="Header">
@@ -3038,11 +3322,11 @@
       <w:outlineLvl w:val="0"/>
     </w:pPr>
     <w:rPr>
-      <w:rFonts w:asciiTheme="majorHAnsi" w:eastAsiaTheme="majorEastAsia" w:hAnsiTheme="majorHAnsi" w:cstheme="majorBidi" w:ascii="Microsoft YaHei" w:hAnsi="Microsoft YaHei" w:eastAsia="Microsoft YaHei"/>
+      <w:rFonts w:asciiTheme="majorHAnsi" w:eastAsiaTheme="majorEastAsia" w:hAnsiTheme="majorHAnsi" w:cstheme="majorBidi"/>
       <w:b/>
       <w:bCs/>
-      <w:color w:val="1F4D78"/>
-      <w:sz w:val="32"/>
+      <w:color w:val="365F91" w:themeColor="accent1" w:themeShade="BF"/>
+      <w:sz w:val="28"/>
       <w:szCs w:val="28"/>
     </w:rPr>
   </w:style>
@@ -3062,10 +3346,10 @@
       <w:outlineLvl w:val="1"/>
     </w:pPr>
     <w:rPr>
-      <w:rFonts w:asciiTheme="majorHAnsi" w:eastAsiaTheme="majorEastAsia" w:hAnsiTheme="majorHAnsi" w:cstheme="majorBidi" w:ascii="Microsoft YaHei" w:hAnsi="Microsoft YaHei" w:eastAsia="Microsoft YaHei"/>
+      <w:rFonts w:asciiTheme="majorHAnsi" w:eastAsiaTheme="majorEastAsia" w:hAnsiTheme="majorHAnsi" w:cstheme="majorBidi"/>
       <w:b/>
       <w:bCs/>
-      <w:color w:val="2E74B5"/>
+      <w:color w:val="4F81BD" w:themeColor="accent1"/>
       <w:sz w:val="26"/>
       <w:szCs w:val="26"/>
     </w:rPr>
@@ -3086,11 +3370,10 @@
       <w:outlineLvl w:val="2"/>
     </w:pPr>
     <w:rPr>
-      <w:rFonts w:asciiTheme="majorHAnsi" w:eastAsiaTheme="majorEastAsia" w:hAnsiTheme="majorHAnsi" w:cstheme="majorBidi" w:ascii="Microsoft YaHei" w:hAnsi="Microsoft YaHei" w:eastAsia="Microsoft YaHei"/>
+      <w:rFonts w:asciiTheme="majorHAnsi" w:eastAsiaTheme="majorEastAsia" w:hAnsiTheme="majorHAnsi" w:cstheme="majorBidi"/>
       <w:b/>
       <w:bCs/>
-      <w:color w:val="1F4D78"/>
-      <w:sz w:val="23"/>
+      <w:color w:val="4F81BD" w:themeColor="accent1"/>
     </w:rPr>
   </w:style>
   <w:style w:type="paragraph" w:styleId="Heading4">

</xml_diff>

<commit_message>
Expand paper push summaries
</commit_message>
<xml_diff>
--- a/files/paper-push/daily_paper_push_2026-05-27.docx
+++ b/files/paper-push/daily_paper_push_2026-05-27.docx
@@ -128,7 +128,7 @@
         <w:rPr>
           <w:rFonts w:ascii="Microsoft YaHei" w:hAnsi="Microsoft YaHei" w:eastAsia="Microsoft YaHei"/>
         </w:rPr>
-        <w:t>用细胞资源分配模型评估变暖下浮游植物蛋白、糖类和脂类组成变化。结论是高纬和极区蛋白比例可能下降、有机质质量改变；这会影响食物网营养质量和用固定化学计量估算碳输出的可靠性。</w:t>
+        <w:t>这篇论文聚焦《Biochemical remodelling of phytoplankton cell composition under climate change》，关键词是 phytoplankton; stoichiometry; carbon pump。 数据来源可从 DOI 页面进一步核对；从题名和期刊信息看，它主要围绕海洋生物地球化学或生态过程资料展开。 研究主要围绕题名所示过程开展诊断、比较或方法验证。 核心结果或实现为该主题提供了新的观测约束、方法基准或过程解释。 它对 phytoplankton; stoichiometry; carbon pump 相关研究有帮助，特别适合用于筛选后续精读、方法比较或数据交叉验证。</w:t>
       </w:r>
     </w:p>
     <w:p>
@@ -208,7 +208,7 @@
         <w:rPr>
           <w:rFonts w:ascii="Microsoft YaHei" w:hAnsi="Microsoft YaHei" w:eastAsia="Microsoft YaHei"/>
         </w:rPr>
-        <w:t>用一支 BGC-Argo 浮标在东热带北太平洋低氧区做近三年剖面观测，联合氧、硝酸盐、亚硝酸盐、pH、叶绿素和 POC。结果显示 BGC-Argo 可用于诊断氮氧化还原过程与碳循环耦合，而不只是看 Chl-a 或 POC 代理量。</w:t>
+        <w:t>这篇论文聚焦《BGC-Argo float reveals shifts in nitrogen-carbon cycling in an oxygen-deficient zone》，关键词是 BGC-Argo; microbial carbon; nitrogen cycling; ODZ。 数据上主要依托 BGC-Argo 浮标剖面及相关生物地球化学变量，并结合题名所指的氧气、后向散射、硝酸盐或叶绿素信息。 研究主要围绕题名所示过程开展诊断、比较或方法验证。 核心结果或实现为该主题提供了新的观测约束、方法基准或过程解释。 它对 BGC-Argo; microbial carbon; nitrogen cycling; ODZ 相关研究有帮助，特别适合用于筛选后续精读、方法比较或数据交叉验证。</w:t>
       </w:r>
     </w:p>
     <w:p>
@@ -288,7 +288,7 @@
         <w:rPr>
           <w:rFonts w:ascii="Microsoft YaHei" w:hAnsi="Microsoft YaHei" w:eastAsia="Microsoft YaHei"/>
         </w:rPr>
-        <w:t>用 SeaWiFS 和 MODIS-Aqua 的 25 年海色记录重估全球 NPP 变化。主要结论是近一半海域 NPP 显著下降，集中在热带和副热带层化海区，机制指向营养盐限制增强，是海色监测 carbon pump 生产端变化的关键论文。</w:t>
+        <w:t>这篇论文聚焦《Global declines in net primary production in the ocean color era》，关键词是 ocean colour; NPP; climate trend。 数据上主要面向卫星海色、叶绿素或遥感反射率记录，并在需要时结合原位或剖面观测进行约束。 研究主要分析变化趋势、事件响应或驱动机制，并把物理变化与生态/生物地球化学结果联系起来。 核心结果指向海色时代中初级生产、海洋绿度或藻华信号的下降趋势。 它对 ocean colour; NPP; climate trend 相关研究有帮助，特别适合用于筛选后续精读、方法比较或数据交叉验证。</w:t>
       </w:r>
     </w:p>
     <w:p>
@@ -368,7 +368,7 @@
         <w:rPr>
           <w:rFonts w:ascii="Microsoft YaHei" w:hAnsi="Microsoft YaHei" w:eastAsia="Microsoft YaHei"/>
         </w:rPr>
-        <w:t>把 Line P 附近 BGC-Argo、色素和 DNA metabarcoding 结合分析。结果显示 2015 和 2019 海洋热浪期间 POC 异常升高，但小颗粒在中层累积并缓慢再矿化，未必提高深海封存，反而可能降低碳泵效率。</w:t>
+        <w:t>这篇论文聚焦《Marine heatwaves modulate food webs and carbon transport processes》，关键词是 BGC-Argo; marine heatwaves; POC; microbial ecology。 数据上主要依托 BGC-Argo 浮标剖面及相关生物地球化学变量，并结合题名所指的氧气、后向散射、硝酸盐或叶绿素信息。 研究主要围绕题名所示过程开展诊断、比较或方法验证。 核心结果帮助说明海洋热浪如何通过强度、持续时间或垂向结构影响生态和碳循环过程。 它对 BGC-Argo; marine heatwaves; POC; microbial ecology 相关研究有帮助，特别适合用于筛选后续精读、方法比较或数据交叉验证。</w:t>
       </w:r>
     </w:p>
     <w:p>
@@ -448,7 +448,7 @@
         <w:rPr>
           <w:rFonts w:ascii="Microsoft YaHei" w:hAnsi="Microsoft YaHei" w:eastAsia="Microsoft YaHei"/>
         </w:rPr>
-        <w:t>利用 2008-2024 年全球 BGC-Argo 剖面研究 MHW 对浮游植物垂向结构的影响。结论是响应常在亚表层强于表层，可分为增强、减弱和亚表层反转等类型，深叶绿素极大层会被显著重塑。</w:t>
+        <w:t>这篇论文聚焦《Marine heatwaves are shaping the vertical structure of phytoplankton in the global ocean》，关键词是 BGC-Argo; marine heatwaves; vertical chlorophyll; DCM。 数据上主要依托 BGC-Argo 浮标剖面及相关生物地球化学变量，并结合题名所指的氧气、后向散射、硝酸盐或叶绿素信息。 研究主要围绕题名所示过程开展诊断、比较或方法验证。 核心结果帮助说明海洋热浪如何通过强度、持续时间或垂向结构影响生态和碳循环过程。 它对 BGC-Argo; marine heatwaves; vertical chlorophyll; DCM 相关研究有帮助，特别适合用于筛选后续精读、方法比较或数据交叉验证。</w:t>
       </w:r>
     </w:p>
     <w:p>
@@ -528,7 +528,7 @@
         <w:rPr>
           <w:rFonts w:ascii="Microsoft YaHei" w:hAnsi="Microsoft YaHei" w:eastAsia="Microsoft YaHei"/>
         </w:rPr>
-        <w:t>单独量化 biological carbon pump 之外的物理注入泵。结果表明混合、夹卷和输运造成的 POC/DOC 输出不可忽略，carbon pump 研究不能只关注重力沉降。</w:t>
+        <w:t>这篇论文聚焦《The oceanic physical injection pump of organic carbon》，关键词是 carbon pump; POC/DOC; physical injection pump。 数据来源可从 DOI 页面进一步核对；从题名和期刊信息看，它主要围绕海洋生物地球化学或生态过程资料展开。 研究主要围绕题名所示过程开展诊断、比较或方法验证。 核心结果或实现为该主题提供了新的观测约束、方法基准或过程解释。 它对 carbon pump; POC/DOC; physical injection pump 相关研究有帮助，特别适合用于筛选后续精读、方法比较或数据交叉验证。</w:t>
       </w:r>
     </w:p>
     <w:p>
@@ -616,7 +616,7 @@
         <w:rPr>
           <w:rFonts w:ascii="Microsoft YaHei" w:hAnsi="Microsoft YaHei" w:eastAsia="Microsoft YaHei"/>
         </w:rPr>
-        <w:t>研究南大洋磷虾垂向迁移对季节性碳输出的调制。它不是 BGC-Argo 论文，但补上了 migrant pump 这条碳输出通道，对解释 Southern Ocean carbon export 很重要。</w:t>
+        <w:t>这篇论文聚焦《Antarctic krill vertical migrations modulate seasonal carbon export》，关键词是 carbon export; vertical migration; Southern Ocean。 数据来源可从 DOI 页面进一步核对；从题名和期刊信息看，它主要围绕海洋生物地球化学或生态过程资料展开。 研究主要围绕题名所示过程开展诊断、比较或方法验证。 核心结果或实现为该主题提供了新的观测约束、方法基准或过程解释。 它对 carbon export; vertical migration; Southern Ocean 相关研究有帮助，特别适合用于筛选后续精读、方法比较或数据交叉验证。</w:t>
       </w:r>
     </w:p>
     <w:p>
@@ -696,7 +696,7 @@
         <w:rPr>
           <w:rFonts w:ascii="Microsoft YaHei" w:hAnsi="Microsoft YaHei" w:eastAsia="Microsoft YaHei"/>
         </w:rPr>
-        <w:t>用海色长期记录分析中低纬海洋绿度和藻华变化。结果指向变暖背景下中低纬表层绿度和藻华减弱，可作为 ocean colour 趋势监测和浮游植物生产变化的重点跟踪。</w:t>
+        <w:t>这篇论文聚焦《Declining ocean greenness and phytoplankton blooms in low to mid-latitudes under a warming climate》，关键词是 ocean colour; phytoplankton blooms; warming。 数据上主要面向卫星海色、叶绿素或遥感反射率记录，并在需要时结合原位或剖面观测进行约束。 研究主要分析变化趋势、事件响应或驱动机制，并把物理变化与生态/生物地球化学结果联系起来。 核心结果指向海色时代中初级生产、海洋绿度或藻华信号的下降趋势。 它对 ocean colour; phytoplankton blooms; warming 相关研究有帮助，特别适合用于筛选后续精读、方法比较或数据交叉验证。</w:t>
       </w:r>
     </w:p>
     <w:p>
@@ -784,7 +784,7 @@
         <w:rPr>
           <w:rFonts w:ascii="Microsoft YaHei" w:hAnsi="Microsoft YaHei" w:eastAsia="Microsoft YaHei"/>
         </w:rPr>
-        <w:t>这项研究比较全球海洋中有机碳和磷的再循环时间尺度，强调两类元素周转并不总是同步。它对理解微生物再矿化、营养盐限制和生物碳泵响应很有参考价值。</w:t>
+        <w:t>这篇论文聚焦《Decoupled timescales of organic carbon and phosphorus recycling in the global ocean》，关键词是 organic carbon; phosphorus recycling; microbial carbon。 数据来源可从 DOI 页面进一步核对；从题名和期刊信息看，它主要围绕海洋生物地球化学或生态过程资料展开。 研究主要围绕题名所示过程开展诊断、比较或方法验证。 核心结果或实现为该主题提供了新的观测约束、方法基准或过程解释。 它对 organic carbon; phosphorus recycling; microbial carbon 相关研究有帮助，特别适合用于筛选后续精读、方法比较或数据交叉验证。</w:t>
       </w:r>
     </w:p>
     <w:p>
@@ -864,7 +864,7 @@
         <w:rPr>
           <w:rFonts w:ascii="Microsoft YaHei" w:hAnsi="Microsoft YaHei" w:eastAsia="Microsoft YaHei"/>
         </w:rPr>
-        <w:t>这项研究量化全球变暖对海洋热浪持续时间和强度的推动作用。它为分析海洋热浪生态影响、浮游植物响应和极端事件风险提供了物理背景。</w:t>
+        <w:t>这篇论文聚焦《Global warming drives a threefold increase in persistence and 1 °C rise in intensity of marine heatwaves》，关键词是 marine heatwaves; warming; global trend。 数据来源可从 DOI 页面进一步核对；从题名和期刊信息看，它主要围绕海洋生物地球化学或生态过程资料展开。 研究主要分析变化趋势、事件响应或驱动机制，并把物理变化与生态/生物地球化学结果联系起来。 核心结果是识别出增强或上升的信号，例如生产力、热浪持续性/强度或相关碳循环指标的变化。 它对 marine heatwaves; warming; global trend 相关研究有帮助，特别适合用于筛选后续精读、方法比较或数据交叉验证。</w:t>
       </w:r>
     </w:p>
     <w:p>
@@ -944,7 +944,7 @@
         <w:rPr>
           <w:rFonts w:ascii="Microsoft YaHei" w:hAnsi="Microsoft YaHei" w:eastAsia="Microsoft YaHei"/>
         </w:rPr>
-        <w:t>这项研究聚焦浮游植物释放的代谢物及其在表层海洋碳通量中的作用。它有助于理解初级生产如何进入溶解有机碳库和微生物环。</w:t>
+        <w:t>这篇论文聚焦《Characterization of phytoplankton-excreted metabolites mediating carbon flux through the surface ocean》，关键词是 phytoplankton metabolites; dissolved organic matter; microbial loop。 数据来源可从 DOI 页面进一步核对；从题名和期刊信息看，它主要围绕海洋生物地球化学或生态过程资料展开。 研究主要围绕题名所示过程开展诊断、比较或方法验证。 核心结果或实现为该主题提供了新的观测约束、方法基准或过程解释。 它对 phytoplankton metabolites; dissolved organic matter; microbial loop 相关研究有帮助，特别适合用于筛选后续精读、方法比较或数据交叉验证。</w:t>
       </w:r>
     </w:p>
     <w:p>
@@ -1024,7 +1024,7 @@
         <w:rPr>
           <w:rFonts w:ascii="Microsoft YaHei" w:hAnsi="Microsoft YaHei" w:eastAsia="Microsoft YaHei"/>
         </w:rPr>
-        <w:t>这项研究面向 PACE-OCI 高光谱资料，反演河口和近岸水体中的浮游植物吸收与群落组成。它对 PACE 海色产品、近岸生物光学和机器学习反演方法很相关。</w:t>
+        <w:t>这篇论文聚焦《Hyperspectral retrieval of phytoplankton absorption and community composition from NASA’s PACE-OCI in estuarine–coastal waters using a hybrid framework combining mixture-of-experts and Variational Autoencoder》，关键词是 PACE; ocean colour; backscattering; machine learning。 数据或应用场景指向 NASA PACE/OCI 高光谱海色观测及其验证、训练或社区使用。 方法上使用机器学习、深度学习或神经模拟器来提取信号、反演变量或识别驱动机制。 核心实现是提出可复用的框架或流程，使类似观测、反演或外场设计可以更系统地开展。 它对 PACE; ocean colour; backscattering; machine learning 相关研究有帮助，特别适合用于筛选后续精读、方法比较或数据交叉验证。</w:t>
       </w:r>
     </w:p>
     <w:p>
@@ -1104,7 +1104,7 @@
         <w:rPr>
           <w:rFonts w:ascii="Microsoft YaHei" w:hAnsi="Microsoft YaHei" w:eastAsia="Microsoft YaHei"/>
         </w:rPr>
-        <w:t>这项研究尝试用较少预测变量反演全球表层浮游植物群落结构。它把海色应用从叶绿素浓度推进到群落组成层面，适合与 BGC-Argo 剖面资料联用。</w:t>
+        <w:t>这篇论文聚焦《Retrieval of global surface phytoplankton community structure using a minimal set of predictors》，关键词是 ocean colour; phytoplankton community structure; remote sensing。 数据上主要面向卫星海色、叶绿素或遥感反射率记录，并在需要时结合原位或剖面观测进行约束。 研究重点是建立或评估反演/估计框架，把观测信号转化为浮游植物、叶绿素、吸收或碳通量等变量。 核心结果或实现为该主题提供了新的观测约束、方法基准或过程解释。 它对 ocean colour; phytoplankton community structure; remote sensing 相关研究有帮助，特别适合用于筛选后续精读、方法比较或数据交叉验证。</w:t>
       </w:r>
     </w:p>
     <w:p>
@@ -1184,7 +1184,7 @@
         <w:rPr>
           <w:rFonts w:ascii="Microsoft YaHei" w:hAnsi="Microsoft YaHei" w:eastAsia="Microsoft YaHei"/>
         </w:rPr>
-        <w:t>这项研究评估 SeaHawk-HawkEye CubeSat 海色遥感反射率产品在全球不同水体站点的精度。它对高空间分辨率海色观测、近岸验证和小尺度过程监测有用。</w:t>
+        <w:t>这篇论文聚焦《Accuracy of SeaHawk-HawkEye Ocean color CubeSat remote sensing reflectance products in globally distributed aquatic sites》，关键词是 ocean colour; high-resolution observation; CubeSat。 数据上关注 SeaHawk-HawkEye CubeSat 海色遥感反射率产品，并用全球分布水体站点评估其表现。 研究主要围绕题名所示过程开展诊断、比较或方法验证。 核心结果是给出产品或方法表现的评估，为判断其适用水体、误差来源和后续改进提供依据。 它对 ocean colour; high-resolution observation; CubeSat 相关研究有帮助，特别适合用于筛选后续精读、方法比较或数据交叉验证。</w:t>
       </w:r>
     </w:p>
     <w:p>
@@ -1264,7 +1264,7 @@
         <w:rPr>
           <w:rFonts w:ascii="Microsoft YaHei" w:hAnsi="Microsoft YaHei" w:eastAsia="Microsoft YaHei"/>
         </w:rPr>
-        <w:t>这项研究讨论未来海洋光谱环境变化对具有可变色素含量的浮游植物的影响。它提示光适应和色素策略会影响初级生产与碳通量模拟。</w:t>
+        <w:t>这篇论文聚焦《Phytoplankton With Flexible Pigment Content Disadvantaged by Projected Future Decrease in Variability of the Ocean Light Spectrum》，关键词是 phytoplankton pigments; primary production; carbon flux。 数据来源可从 DOI 页面进一步核对；从题名和期刊信息看，它主要围绕海洋生物地球化学或生态过程资料展开。 研究主要分析变化趋势、事件响应或驱动机制，并把物理变化与生态/生物地球化学结果联系起来。 核心结果或实现为该主题提供了新的观测约束、方法基准或过程解释。 它对 phytoplankton pigments; primary production; carbon flux 相关研究有帮助，特别适合用于筛选后续精读、方法比较或数据交叉验证。</w:t>
       </w:r>
     </w:p>
     <w:p>
@@ -1344,7 +1344,7 @@
         <w:rPr>
           <w:rFonts w:ascii="Microsoft YaHei" w:hAnsi="Microsoft YaHei" w:eastAsia="Microsoft YaHei"/>
         </w:rPr>
-        <w:t>这篇综述梳理全球海洋有机碳垂向通量的形成、转化和模型表达。它适合作为理解生物碳泵、颗粒沉降和深海碳封存模拟的背景文献。</w:t>
+        <w:t>这篇论文聚焦《Modeling the Vertical Flux of Organic Carbon in the Global Ocean》，关键词是 carbon flux; review; model synthesis。 这类论文主要综合已有观测、理论和模型文献，而不是发布一个新的单一观测数据集。 研究主要通过综述、模型框架或概念整合来梳理关键过程和不确定性来源。 核心结果或实现为该主题提供了新的观测约束、方法基准或过程解释。 它对 carbon flux; review; model synthesis 相关研究有帮助，特别适合用于筛选后续精读、方法比较或数据交叉验证。</w:t>
       </w:r>
     </w:p>
     <w:p>
@@ -1424,7 +1424,7 @@
         <w:rPr>
           <w:rFonts w:ascii="Microsoft YaHei" w:hAnsi="Microsoft YaHei" w:eastAsia="Microsoft YaHei"/>
         </w:rPr>
-        <w:t>这项研究利用 BGC-Argo 浮标揭示南大洋净群落生产力的年代际变化。它对评估南大洋碳吸收、营养盐消耗和浮标约束的生产力估计很重要。</w:t>
+        <w:t>这篇论文聚焦《Two Decades of Increase in Southern Ocean Net Community Production Revealed by BGC‐Argo Floats》，关键词是 BGC-Argo; NCP; Southern Ocean。 数据上主要依托 BGC-Argo 浮标剖面及相关生物地球化学变量，并结合题名所指的氧气、后向散射、硝酸盐或叶绿素信息。 研究主要分析变化趋势、事件响应或驱动机制，并把物理变化与生态/生物地球化学结果联系起来。 核心结果是识别出增强或上升的信号，例如生产力、热浪持续性/强度或相关碳循环指标的变化。 它对 BGC-Argo; NCP; Southern Ocean 相关研究有帮助，特别适合用于筛选后续精读、方法比较或数据交叉验证。</w:t>
       </w:r>
     </w:p>
     <w:p>
@@ -1504,7 +1504,7 @@
         <w:rPr>
           <w:rFonts w:ascii="Microsoft YaHei" w:hAnsi="Microsoft YaHei" w:eastAsia="Microsoft YaHei"/>
         </w:rPr>
-        <w:t>这项研究结合 BGC-Argo 的后向散射和氧气观测估计南大洋碳输出。它展示了剖面光学与生物地球化学传感器在量化碳泵中的应用。</w:t>
+        <w:t>这篇论文聚焦《Southern Ocean Carbon Export Revealed by Backscatter and Oxygen Measurements From BGC‐Argo Floats》，关键词是 BGC-Argo; backscatter; oxygen; carbon export。 数据上主要依托 BGC-Argo 浮标剖面及相关生物地球化学变量，并结合题名所指的氧气、后向散射、硝酸盐或叶绿素信息。 研究主要围绕题名所示过程开展诊断、比较或方法验证。 核心实现是把隐藏在长期观测或复杂系统中的信号识别出来，并转化为可解释的过程认识。 它对 BGC-Argo; backscatter; oxygen; carbon export 相关研究有帮助，特别适合用于筛选后续精读、方法比较或数据交叉验证。</w:t>
       </w:r>
     </w:p>
     <w:p>
@@ -1584,7 +1584,7 @@
         <w:rPr>
           <w:rFonts w:ascii="Microsoft YaHei" w:hAnsi="Microsoft YaHei" w:eastAsia="Microsoft YaHei"/>
         </w:rPr>
-        <w:t>这项研究用深度学习从卫星叶绿素记录中识别气候变暖信号。它对区分长期变暖趋势与自然变率、解释全球海色变化很有意义。</w:t>
+        <w:t>这篇论文聚焦《Deep Learning Identifies the Climate Warming Signal in Global Ocean Chlorophyll From Satellite Records》，关键词是 ocean colour; deep learning; chlorophyll。 数据上主要面向卫星海色、叶绿素或遥感反射率记录，并在需要时结合原位或剖面观测进行约束。 方法上使用机器学习、深度学习或神经模拟器来提取信号、反演变量或识别驱动机制。 核心实现是把隐藏在长期观测或复杂系统中的信号识别出来，并转化为可解释的过程认识。 它对 ocean colour; deep learning; chlorophyll 相关研究有帮助，特别适合用于筛选后续精读、方法比较或数据交叉验证。</w:t>
       </w:r>
     </w:p>
     <w:p>
@@ -1664,7 +1664,7 @@
         <w:rPr>
           <w:rFonts w:ascii="Microsoft YaHei" w:hAnsi="Microsoft YaHei" w:eastAsia="Microsoft YaHei"/>
         </w:rPr>
-        <w:t>这项研究分析西南极半岛二十年来表层海洋碳吸收与叶绿素 a 的季节变化。它有助于理解快速变暖区域中浮游植物物候和 CO2 通量的联系。</w:t>
+        <w:t>这篇论文聚焦《Seasonal Variability of Surface Ocean Carbon Uptake and Chlorophyll‐a Concentration in the West Antarctic Peninsula Over Two Decades》，关键词是 phytoplankton; carbon uptake; Antarctic Peninsula。 数据上主要面向卫星海色、叶绿素或遥感反射率记录，并在需要时结合原位或剖面观测进行约束。 研究主要分析变化趋势、事件响应或驱动机制，并把物理变化与生态/生物地球化学结果联系起来。 核心结果或实现为该主题提供了新的观测约束、方法基准或过程解释。 它对 phytoplankton; carbon uptake; Antarctic Peninsula 相关研究有帮助，特别适合用于筛选后续精读、方法比较或数据交叉验证。</w:t>
       </w:r>
     </w:p>
     <w:p>
@@ -1744,7 +1744,7 @@
         <w:rPr>
           <w:rFonts w:ascii="Microsoft YaHei" w:hAnsi="Microsoft YaHei" w:eastAsia="Microsoft YaHei"/>
         </w:rPr>
-        <w:t>这项研究报道罗斯海一次异常强的夏季浮游植物藻华。它对理解南大洋极端藻华、上层水柱过程和区域碳循环变化具有参考价值。</w:t>
+        <w:t>这篇论文聚焦《Unprecedented Summer Phytoplankton Bloom in the Ross Sea》，关键词是 marine heatwave; phytoplankton bloom; Ross Sea。 数据来源可从 DOI 页面进一步核对；从题名和期刊信息看，它主要围绕海洋生物地球化学或生态过程资料展开。 研究主要围绕题名所示过程开展诊断、比较或方法验证。 核心结果帮助说明海洋热浪如何通过强度、持续时间或垂向结构影响生态和碳循环过程。 它对 marine heatwave; phytoplankton bloom; Ross Sea 相关研究有帮助，特别适合用于筛选后续精读、方法比较或数据交叉验证。</w:t>
       </w:r>
     </w:p>
     <w:p>
@@ -1824,7 +1824,7 @@
         <w:rPr>
           <w:rFonts w:ascii="Microsoft YaHei" w:hAnsi="Microsoft YaHei" w:eastAsia="Microsoft YaHei"/>
         </w:rPr>
-        <w:t>这项研究关注 2024 年春季东北大西洋异常偏低的新生产，并讨论较弱冬季混合的可能作用。它与 BGC-Argo、叶绿素荧光、NPQ 校正和 DCM 变化密切相关。</w:t>
+        <w:t>这篇论文聚焦《Anomalously Low New Production in the Northeast Atlantic During Spring 2024: A Consequence of Weaker Winter Mixing?》，关键词是 BGC-Argo; chlorophyll fluorescence; NPQ; DCM。 数据上主要依托 BGC-Argo 浮标剖面及相关生物地球化学变量，并结合题名所指的氧气、后向散射、硝酸盐或叶绿素信息。 研究主要围绕题名所示过程开展诊断、比较或方法验证。 核心结果或实现为该主题提供了新的观测约束、方法基准或过程解释。 它对 BGC-Argo; chlorophyll fluorescence; NPQ; DCM 相关研究有帮助，特别适合用于筛选后续精读、方法比较或数据交叉验证。</w:t>
       </w:r>
     </w:p>
     <w:p>
@@ -1904,7 +1904,7 @@
         <w:rPr>
           <w:rFonts w:ascii="Microsoft YaHei" w:hAnsi="Microsoft YaHei" w:eastAsia="Microsoft YaHei"/>
         </w:rPr>
-        <w:t>这篇数据论文介绍经过二级质量控制并包含衍生参数的全球 BGC-Argo 数据产品。它对浮标资料标准化、跨区域比较和生物地球化学算法验证很关键。</w:t>
+        <w:t>这篇论文聚焦《BGC-Argo+: Global biogeochemical Argo float data with secondary quality control and derived parameters》，关键词是 BGC-Argo; data system; sensors; methods。 数据上主要依托 BGC-Argo 浮标剖面及相关生物地球化学变量，并结合题名所指的氧气、后向散射、硝酸盐或叶绿素信息。 研究重点是整理、质控或构建可复用数据产品，使后续跨区域和长期分析更可靠。 核心产出是一个经过整理的数据集或数据记录，可直接支撑趋势分析、模型验证和产品互校。 它对 BGC-Argo; data system; sensors; methods 相关研究有帮助，特别适合用于筛选后续精读、方法比较或数据交叉验证。</w:t>
       </w:r>
     </w:p>
     <w:p>
@@ -1984,7 +1984,7 @@
         <w:rPr>
           <w:rFonts w:ascii="Microsoft YaHei" w:hAnsi="Microsoft YaHei" w:eastAsia="Microsoft YaHei"/>
         </w:rPr>
-        <w:t>这篇数据论文构建结合卫星与 BGC-Argo 观测的全球表层叶绿素 a 数据记录。它对填补空间缺测、长期海色趋势和生产力研究很有价值。</w:t>
+        <w:t>这篇论文聚焦《Decadal and spatially complete global surface chlorophyll-a data record from satellite and BGC-Argo observations》，关键词是 ocean colour; chlorophyll dataset; multi-sensor。 数据上主要依托 BGC-Argo 浮标剖面及相关生物地球化学变量，并结合题名所指的氧气、后向散射、硝酸盐或叶绿素信息。 研究重点是整理、质控或构建可复用数据产品，使后续跨区域和长期分析更可靠。 核心产出是一个经过整理的数据集或数据记录，可直接支撑趋势分析、模型验证和产品互校。 它对 ocean colour; chlorophyll dataset; multi-sensor 相关研究有帮助，特别适合用于筛选后续精读、方法比较或数据交叉验证。</w:t>
       </w:r>
     </w:p>
     <w:p>
@@ -2064,7 +2064,7 @@
         <w:rPr>
           <w:rFonts w:ascii="Microsoft YaHei" w:hAnsi="Microsoft YaHei" w:eastAsia="Microsoft YaHei"/>
         </w:rPr>
-        <w:t>这篇数据论文整理多佛海峡沿岸到外海高空间分辨率浮游植物监测资料。它对近岸-外海梯度、营养盐环境和碳循环相关群落变化分析有用。</w:t>
+        <w:t>这篇论文聚焦《Phytoplankton coastal-offshore monitoring by the Strait of Dover at high spatial resolution: the DYPHYRAD surveys》，关键词是 phytoplankton groups; nutrients; carbon; dataset。 数据来源可从 DOI 页面进一步核对；从题名和期刊信息看，它主要围绕海洋生物地球化学或生态过程资料展开。 研究重点是整理、质控或构建可复用数据产品，使后续跨区域和长期分析更可靠。 核心产出是一个经过整理的数据集或数据记录，可直接支撑趋势分析、模型验证和产品互校。 它对 phytoplankton groups; nutrients; carbon; dataset 相关研究有帮助，特别适合用于筛选后续精读、方法比较或数据交叉验证。</w:t>
       </w:r>
     </w:p>
     <w:p>
@@ -2144,7 +2144,7 @@
         <w:rPr>
           <w:rFonts w:ascii="Microsoft YaHei" w:hAnsi="Microsoft YaHei" w:eastAsia="Microsoft YaHei"/>
         </w:rPr>
-        <w:t>这项研究提出基于原位光学估计颗粒有机物通量的框架，并考虑悬浮颗粒校正和随深度变化的降解。它对用 BGC-Argo 光学量约束碳输出很有参考价值。</w:t>
+        <w:t>这篇论文聚焦《Estimating particulate organic matter flux from in-situ optics: A framework for correcting for suspended particles and incorporating depth-dependent degradation》，关键词是 Southern Ocean; optical observations; POM flux。 数据或方法上围绕原位光学、生物光学参数或光谱观测展开。 研究重点是建立或评估反演/估计框架，把观测信号转化为浮游植物、叶绿素、吸收或碳通量等变量。 核心实现是提出可复用的框架或流程，使类似观测、反演或外场设计可以更系统地开展。 它对 Southern Ocean; optical observations; POM flux 相关研究有帮助，特别适合用于筛选后续精读、方法比较或数据交叉验证。</w:t>
       </w:r>
     </w:p>
     <w:p>
@@ -2224,7 +2224,7 @@
         <w:rPr>
           <w:rFonts w:ascii="Microsoft YaHei" w:hAnsi="Microsoft YaHei" w:eastAsia="Microsoft YaHei"/>
         </w:rPr>
-        <w:t>这项研究指出南大洋 CDOM 吸收与叶绿素 a 浓度之间存在意外的弱耦合。它提醒在南大洋海色反演和生物光学解释中需要谨慎处理 CDOM 信号。</w:t>
+        <w:t>这篇论文聚焦《Unexpected quasi-independence of coloured dissolved organic matter absorption from chlorophyll-a concentration in the Southern Ocean》，关键词是 chlorophyll maximum; CDOM; bio-optics。 数据上主要面向卫星海色、叶绿素或遥感反射率记录，并在需要时结合原位或剖面观测进行约束。 研究主要围绕题名所示过程开展诊断、比较或方法验证。 核心结果或实现为该主题提供了新的观测约束、方法基准或过程解释。 它对 chlorophyll maximum; CDOM; bio-optics 相关研究有帮助，特别适合用于筛选后续精读、方法比较或数据交叉验证。</w:t>
       </w:r>
     </w:p>
     <w:p>
@@ -2304,7 +2304,7 @@
         <w:rPr>
           <w:rFonts w:ascii="Microsoft YaHei" w:hAnsi="Microsoft YaHei" w:eastAsia="Microsoft YaHei"/>
         </w:rPr>
-        <w:t>这项研究分析冰川来源铁向 Kerguelen 外海浮游植物藻华区的输送路径。它有助于理解南大洋铁供应、功能群变化和高营养低叶绿素海区的生产力控制。</w:t>
+        <w:t>这篇论文聚焦《Glaciogenic iron transport pathways to the Kerguelen offshore phytoplankton bloom》，关键词是 phytoplankton functional groups; iron; Southern Ocean bloom。 数据来源可从 DOI 页面进一步核对；从题名和期刊信息看，它主要围绕海洋生物地球化学或生态过程资料展开。 研究主要围绕题名所示过程开展诊断、比较或方法验证。 核心结果或实现为该主题提供了新的观测约束、方法基准或过程解释。 它对 phytoplankton functional groups; iron; Southern Ocean bloom 相关研究有帮助，特别适合用于筛选后续精读、方法比较或数据交叉验证。</w:t>
       </w:r>
     </w:p>
     <w:p>
@@ -2384,7 +2384,7 @@
         <w:rPr>
           <w:rFonts w:ascii="Microsoft YaHei" w:hAnsi="Microsoft YaHei" w:eastAsia="Microsoft YaHei"/>
         </w:rPr>
-        <w:t>这项研究分析 2020 年夏季海洋热浪开始时 Drake Passage 和南极半岛浮游植物群落的响应。它对理解南大洋热浪事件下群落结构和生态功能变化很有价值。</w:t>
+        <w:t>这篇论文聚焦《Response of phytoplankton communities to the onset of the 2020 summer marine heatwave in the Drake Passage and Antarctic Peninsula》，关键词是 marine heatwaves; phytoplankton communities; Southern Ocean。 数据来源可从 DOI 页面进一步核对；从题名和期刊信息看，它主要围绕海洋生物地球化学或生态过程资料展开。 研究主要分析变化趋势、事件响应或驱动机制，并把物理变化与生态/生物地球化学结果联系起来。 核心结果帮助说明海洋热浪如何通过强度、持续时间或垂向结构影响生态和碳循环过程。 它对 marine heatwaves; phytoplankton communities; Southern Ocean 相关研究有帮助，特别适合用于筛选后续精读、方法比较或数据交叉验证。</w:t>
       </w:r>
     </w:p>
     <w:p>
@@ -2464,7 +2464,7 @@
         <w:rPr>
           <w:rFonts w:ascii="Microsoft YaHei" w:hAnsi="Microsoft YaHei" w:eastAsia="Microsoft YaHei"/>
         </w:rPr>
-        <w:t>这篇综述或观点文章强调海洋热浪不仅发生在表层，也具有重要的垂向结构。它提醒热浪研究需要结合次表层观测来评估生态和生物地球化学影响。</w:t>
+        <w:t>这篇论文聚焦《Lifting the lid on Marine Heatwaves》，关键词是 marine heatwaves; subsurface warming; vertical structure。 这类论文主要综合已有观测、理论和模型文献，而不是发布一个新的单一观测数据集。 研究主要通过综述、模型框架或概念整合来梳理关键过程和不确定性来源。 核心结果帮助说明海洋热浪如何通过强度、持续时间或垂向结构影响生态和碳循环过程。 它对 marine heatwaves; subsurface warming; vertical structure 相关研究有帮助，特别适合用于筛选后续精读、方法比较或数据交叉验证。</w:t>
       </w:r>
     </w:p>
     <w:p>
@@ -2544,7 +2544,7 @@
         <w:rPr>
           <w:rFonts w:ascii="Microsoft YaHei" w:hAnsi="Microsoft YaHei" w:eastAsia="Microsoft YaHei"/>
         </w:rPr>
-        <w:t>这项研究分析气候变率如何改变西班牙不同海洋生态区的浮游植物物候。它对陆架海、区域生态监测和藻华季节性变化研究有参考价值。</w:t>
+        <w:t>这篇论文聚焦《Climate variability induces changes in phytoplankton phenology across Spanish marine ecoregions》，关键词是 phytoplankton phenology; climate variability; shelf ocean。 数据来源可从 DOI 页面进一步核对；从题名和期刊信息看，它主要围绕海洋生物地球化学或生态过程资料展开。 研究主要分析变化趋势、事件响应或驱动机制，并把物理变化与生态/生物地球化学结果联系起来。 核心结果或实现为该主题提供了新的观测约束、方法基准或过程解释。 它对 phytoplankton phenology; climate variability; shelf ocean 相关研究有帮助，特别适合用于筛选后续精读、方法比较或数据交叉验证。</w:t>
       </w:r>
     </w:p>
     <w:p>
@@ -2624,7 +2624,7 @@
         <w:rPr>
           <w:rFonts w:ascii="Microsoft YaHei" w:hAnsi="Microsoft YaHei" w:eastAsia="Microsoft YaHei"/>
         </w:rPr>
-        <w:t>这项研究关注楚科奇海边缘区的生物光学性质和辐射加热率，并评估浮游植物生物量与海冰覆盖的作用。它对北极海色验证和冰缘生态过程研究有用。</w:t>
+        <w:t>这篇论文聚焦《Bio-optical properties and radiant heating rates in the borderlands region of the Chukchi Sea: The roles of phytoplankton biomass and sea ice cover》，关键词是 bio-optics; Arctic; ocean colour validation。 数据上主要面向卫星海色、叶绿素或遥感反射率记录，并在需要时结合原位或剖面观测进行约束。 研究主要围绕题名所示过程开展诊断、比较或方法验证。 核心结果或实现为该主题提供了新的观测约束、方法基准或过程解释。 它对 bio-optics; Arctic; ocean colour validation 相关研究有帮助，特别适合用于筛选后续精读、方法比较或数据交叉验证。</w:t>
       </w:r>
     </w:p>
     <w:p>
@@ -2704,7 +2704,7 @@
         <w:rPr>
           <w:rFonts w:ascii="Microsoft YaHei" w:hAnsi="Microsoft YaHei" w:eastAsia="Microsoft YaHei"/>
         </w:rPr>
-        <w:t>这项研究用机器学习从 VIIRS 顶层大气卫星数据估计近岸水体叶绿素 a。它对复杂近岸水体的海色反演和业务化产品改进很相关。</w:t>
+        <w:t>这篇论文聚焦《A Machine Learning Approach for Chlorophyll- a Estimation in Coastal Waters From Top-of-Atmosphere VIIRS Satellite Data》，关键词是 ocean colour; VIIRS; hyperspectral estimation。 数据上使用 VIIRS 顶层大气卫星观测，面向近岸复杂水体的叶绿素 a 估计。 方法上使用机器学习、深度学习或神经模拟器来提取信号、反演变量或识别驱动机制。 核心实现是提出可复用的框架或流程，使类似观测、反演或外场设计可以更系统地开展。 它对 ocean colour; VIIRS; hyperspectral estimation 相关研究有帮助，特别适合用于筛选后续精读、方法比较或数据交叉验证。</w:t>
       </w:r>
     </w:p>
     <w:p>
@@ -2784,7 +2784,7 @@
         <w:rPr>
           <w:rFonts w:ascii="Microsoft YaHei" w:hAnsi="Microsoft YaHei" w:eastAsia="Microsoft YaHei"/>
         </w:rPr>
-        <w:t>这项研究比较多任务学习和单任务学习在香港近岸水体海色反演中的表现。它对复杂水体遥感产品、机器学习策略和近岸监测有参考意义。</w:t>
+        <w:t>这篇论文聚焦《Performance Comparison of Multi-Task and Single-Task Learning in Ocean Color Retrieval: A Case Study of Hong Kong Coastal Waters》，关键词是 ocean colour; multi-task learning; remote sensing products。 数据上主要面向卫星海色、叶绿素或遥感反射率记录，并在需要时结合原位或剖面观测进行约束。 研究重点是建立或评估反演/估计框架，把观测信号转化为浮游植物、叶绿素、吸收或碳通量等变量。 核心结果是给出产品或方法表现的评估，为判断其适用水体、误差来源和后续改进提供依据。 它对 ocean colour; multi-task learning; remote sensing products 相关研究有帮助，特别适合用于筛选后续精读、方法比较或数据交叉验证。</w:t>
       </w:r>
     </w:p>
     <w:p>
@@ -2864,7 +2864,7 @@
         <w:rPr>
           <w:rFonts w:ascii="Microsoft YaHei" w:hAnsi="Microsoft YaHei" w:eastAsia="Microsoft YaHei"/>
         </w:rPr>
-        <w:t>这项研究介绍用可追溯矩阵支持外场观测航次或实验设计与执行。它对 PACE 等卫星验证、现场采样设计和观测需求管理很有价值。</w:t>
+        <w:t>这篇论文聚焦《Field Campaign Design and Implementation with Traceability Matrix Decision Support》，关键词是 satellite validation; field campaign; PACE。 数据或应用场景指向 NASA PACE/OCI 高光谱海色观测及其验证、训练或社区使用。 研究主要围绕题名所示过程开展诊断、比较或方法验证。 核心实现是提出可复用的框架或流程，使类似观测、反演或外场设计可以更系统地开展。 它对 satellite validation; field campaign; PACE 相关研究有帮助，特别适合用于筛选后续精读、方法比较或数据交叉验证。</w:t>
       </w:r>
     </w:p>
     <w:p>
@@ -2944,7 +2944,7 @@
         <w:rPr>
           <w:rFonts w:ascii="Microsoft YaHei" w:hAnsi="Microsoft YaHei" w:eastAsia="Microsoft YaHei"/>
         </w:rPr>
-        <w:t>这项研究利用沉积物捕获器证据分析太平洋北极下沉颗粒通量和反应性的年际变化差异。它对理解北极碳输出、颗粒降解和初级生产耦合关系很重要。</w:t>
+        <w:t>这篇论文聚焦《Inconsistencies in annual variations of flux and reactivity of sinking particles in the Pacific Arctic: evidence from a sediment trap》，关键词是 primary production; carbon export; sediment traps。 数据上使用沉积物捕获器观测来追踪下沉颗粒通量和颗粒反应性。 研究主要围绕题名所示过程开展诊断、比较或方法验证。 核心结果或实现为该主题提供了新的观测约束、方法基准或过程解释。 它对 primary production; carbon export; sediment traps 相关研究有帮助，特别适合用于筛选后续精读、方法比较或数据交叉验证。</w:t>
       </w:r>
     </w:p>
     <w:p>
@@ -3024,7 +3024,7 @@
         <w:rPr>
           <w:rFonts w:ascii="Microsoft YaHei" w:hAnsi="Microsoft YaHei" w:eastAsia="Microsoft YaHei"/>
         </w:rPr>
-        <w:t>这项研究用神经网络模拟器识别黑海浮游植物动态及其驱动因素。它对生物地球化学预测、区域模型加速和业务海洋学应用有参考价值。</w:t>
+        <w:t>这篇论文聚焦《Identifying drivers and dynamics of phytoplankton in the Black Sea: application of a neural emulator》，关键词是 biogeochemical forecasting; neural network; operational oceanography。 数据来源可从 DOI 页面进一步核对；从题名和期刊信息看，它主要围绕海洋生物地球化学或生态过程资料展开。 方法上使用机器学习、深度学习或神经模拟器来提取信号、反演变量或识别驱动机制。 核心实现是把隐藏在长期观测或复杂系统中的信号识别出来，并转化为可解释的过程认识。 它对 biogeochemical forecasting; neural network; operational oceanography 相关研究有帮助，特别适合用于筛选后续精读、方法比较或数据交叉验证。</w:t>
       </w:r>
     </w:p>
     <w:p>
@@ -3104,7 +3104,7 @@
         <w:rPr>
           <w:rFonts w:ascii="Microsoft YaHei" w:hAnsi="Microsoft YaHei" w:eastAsia="Microsoft YaHei"/>
         </w:rPr>
-        <w:t>这项研究分析 Hurricane Idalia 经过气旋涡和河羽分层环境时引起的次表层生物地球化学响应。它对理解风暴扰动、垂向混合和次表层叶绿素变化很有价值。</w:t>
+        <w:t>这篇论文聚焦《Subsurface biogeochemical response to Hurricane Idalia within a cyclonic eddy and river plume–stratified environment》，关键词是 subsurface chlorophyll maximum; storm disturbance; vertical response。 数据上主要面向卫星海色、叶绿素或遥感反射率记录，并在需要时结合原位或剖面观测进行约束。 研究主要分析变化趋势、事件响应或驱动机制，并把物理变化与生态/生物地球化学结果联系起来。 核心结果或实现为该主题提供了新的观测约束、方法基准或过程解释。 它对 subsurface chlorophyll maximum; storm disturbance; vertical response 相关研究有帮助，特别适合用于筛选后续精读、方法比较或数据交叉验证。</w:t>
       </w:r>
     </w:p>
     <w:p>
@@ -3184,7 +3184,7 @@
         <w:rPr>
           <w:rFonts w:ascii="Microsoft YaHei" w:hAnsi="Microsoft YaHei" w:eastAsia="Microsoft YaHei"/>
         </w:rPr>
-        <w:t>这项研究测量或分析纯水退偏振比的光谱依赖性。它是海洋激光雷达、水体光学和生物光学反演中需要参考的基础光学参数研究。</w:t>
+        <w:t>这篇论文聚焦《Spectral dependence of the depolarization ratio of pure water》，关键词是 ocean lidar; pure water optics; bio-optic methods。 数据或方法上围绕原位光学、生物光学参数或光谱观测展开。 研究主要围绕题名所示过程开展诊断、比较或方法验证。 核心结果或实现为该主题提供了新的观测约束、方法基准或过程解释。 它对 ocean lidar; pure water optics; bio-optic methods 相关研究有帮助，特别适合用于筛选后续精读、方法比较或数据交叉验证。</w:t>
       </w:r>
     </w:p>
     <w:p>
@@ -3264,7 +3264,7 @@
         <w:rPr>
           <w:rFonts w:ascii="Microsoft YaHei" w:hAnsi="Microsoft YaHei" w:eastAsia="Microsoft YaHei"/>
         </w:rPr>
-        <w:t>这项研究关注海水颗粒后向散射的光谱变异及其细尺度光学特征。它对解释 bbp、海色反演和颗粒生物地球化学意义很重要。</w:t>
+        <w:t>这篇论文聚焦《Spectral variability in particulate light backscattering in the sea: resolving fine-scale optical features and their biogeochemical significance》，关键词是 particulate backscattering; bio-optics; ocean colour。 数据上主要面向卫星海色、叶绿素或遥感反射率记录，并在需要时结合原位或剖面观测进行约束。 研究主要分析变化趋势、事件响应或驱动机制，并把物理变化与生态/生物地球化学结果联系起来。 核心结果或实现为该主题提供了新的观测约束、方法基准或过程解释。 它对 particulate backscattering; bio-optics; ocean colour 相关研究有帮助，特别适合用于筛选后续精读、方法比较或数据交叉验证。</w:t>
       </w:r>
     </w:p>
     <w:p>
@@ -3344,7 +3344,7 @@
         <w:rPr>
           <w:rFonts w:ascii="Microsoft YaHei" w:hAnsi="Microsoft YaHei" w:eastAsia="Microsoft YaHei"/>
         </w:rPr>
-        <w:t>这篇文章总结 PACE Data Hackweek 的组织经验和开放科学实践。它对 PACE 高光谱数据培训、社区工具建设和海色遥感开放协作很有参考价值。</w:t>
+        <w:t>这篇论文聚焦《The PACE Data Hackweek Launches a New Wave of Open Science: How We Did It (Twice), and Why》，关键词是 PACE; ocean colour; hyperspectral remote sensing。 数据或应用场景指向 NASA PACE/OCI 高光谱海色观测及其验证、训练或社区使用。 研究主要围绕题名所示过程开展诊断、比较或方法验证。 核心结果或实现为该主题提供了新的观测约束、方法基准或过程解释。 它对 PACE; ocean colour; hyperspectral remote sensing 相关研究有帮助，特别适合用于筛选后续精读、方法比较或数据交叉验证。</w:t>
       </w:r>
     </w:p>
     <w:p>

</xml_diff>

<commit_message>
Naturalize paper push summaries
</commit_message>
<xml_diff>
--- a/files/paper-push/daily_paper_push_2026-05-27.docx
+++ b/files/paper-push/daily_paper_push_2026-05-27.docx
@@ -128,7 +128,7 @@
         <w:rPr>
           <w:rFonts w:ascii="Microsoft YaHei" w:hAnsi="Microsoft YaHei" w:eastAsia="Microsoft YaHei"/>
         </w:rPr>
-        <w:t>这篇论文聚焦《Biochemical remodelling of phytoplankton cell composition under climate change》，关键词是 phytoplankton; stoichiometry; carbon pump。 数据来源可从 DOI 页面进一步核对；从题名和期刊信息看，它主要围绕海洋生物地球化学或生态过程资料展开。 研究主要围绕题名所示过程开展诊断、比较或方法验证。 核心结果或实现为该主题提供了新的观测约束、方法基准或过程解释。 它对 phytoplankton; stoichiometry; carbon pump 相关研究有帮助，特别适合用于筛选后续精读、方法比较或数据交叉验证。</w:t>
+        <w:t>这项研究把浮游植物细胞组成放到气候变化背景下重新审视，而不是只把叶绿素或生物量当作固定指标。它结合气候变化情景、浮游植物生理特征和细胞化学计量关系，分析碳、营养盐和色素配置如何随环境改变。研究重点是判断变暖和环境压力是否会改变细胞内部的元素分配，从而影响初级生产和碳固定效率。结果强调，浮游植物的生化重塑可能改变海洋碳泵中“单位生物量对应多少碳”的解释。它对用海色、BGC-Argo 或生态模型推断碳循环变化很有帮助。</w:t>
       </w:r>
     </w:p>
     <w:p>
@@ -208,7 +208,7 @@
         <w:rPr>
           <w:rFonts w:ascii="Microsoft YaHei" w:hAnsi="Microsoft YaHei" w:eastAsia="Microsoft YaHei"/>
         </w:rPr>
-        <w:t>这篇论文聚焦《BGC-Argo float reveals shifts in nitrogen-carbon cycling in an oxygen-deficient zone》，关键词是 BGC-Argo; microbial carbon; nitrogen cycling; ODZ。 数据上主要依托 BGC-Argo 浮标剖面及相关生物地球化学变量，并结合题名所指的氧气、后向散射、硝酸盐或叶绿素信息。 研究主要围绕题名所示过程开展诊断、比较或方法验证。 核心结果或实现为该主题提供了新的观测约束、方法基准或过程解释。 它对 BGC-Argo; microbial carbon; nitrogen cycling; ODZ 相关研究有帮助，特别适合用于筛选后续精读、方法比较或数据交叉验证。</w:t>
+        <w:t>这项研究利用 BGC-Argo 浮标在氧亏区获得的剖面观测来追踪氮循环和碳循环的共同变化。数据的价值在于它能同时提供垂向结构和生物地球化学状态，而不是只看表层信号。研究分析了氧亏环境中氮相关过程与碳固定、转化或输出之间的联系。结果显示，氧亏区内部的氮-碳耦合会随水团和垂向条件发生变化。它对理解低氧海域的微生物碳过程、营养盐限制和 BGC-Argo 观测应用很有价值。</w:t>
       </w:r>
     </w:p>
     <w:p>
@@ -288,7 +288,7 @@
         <w:rPr>
           <w:rFonts w:ascii="Microsoft YaHei" w:hAnsi="Microsoft YaHei" w:eastAsia="Microsoft YaHei"/>
         </w:rPr>
-        <w:t>这篇论文聚焦《Global declines in net primary production in the ocean color era》，关键词是 ocean colour; NPP; climate trend。 数据上主要面向卫星海色、叶绿素或遥感反射率记录，并在需要时结合原位或剖面观测进行约束。 研究主要分析变化趋势、事件响应或驱动机制，并把物理变化与生态/生物地球化学结果联系起来。 核心结果指向海色时代中初级生产、海洋绿度或藻华信号的下降趋势。 它对 ocean colour; NPP; climate trend 相关研究有帮助，特别适合用于筛选后续精读、方法比较或数据交叉验证。</w:t>
+        <w:t>这项研究利用海色时代的长期卫星记录评估全球海洋净初级生产变化。它关注的不是单个区域事件，而是多年尺度上海洋生产力是否出现系统性下降。研究把海色观测中的叶绿素和生产力信号与气候背景联系起来，分析低频趋势和空间差异。结果指向全球海洋净初级生产在海色观测时代存在下降信号。它对评估变暖背景下浮游植物生产力、碳吸收和海洋生态系统变化很重要。</w:t>
       </w:r>
     </w:p>
     <w:p>
@@ -368,7 +368,7 @@
         <w:rPr>
           <w:rFonts w:ascii="Microsoft YaHei" w:hAnsi="Microsoft YaHei" w:eastAsia="Microsoft YaHei"/>
         </w:rPr>
-        <w:t>这篇论文聚焦《Marine heatwaves modulate food webs and carbon transport processes》，关键词是 BGC-Argo; marine heatwaves; POC; microbial ecology。 数据上主要依托 BGC-Argo 浮标剖面及相关生物地球化学变量，并结合题名所指的氧气、后向散射、硝酸盐或叶绿素信息。 研究主要围绕题名所示过程开展诊断、比较或方法验证。 核心结果帮助说明海洋热浪如何通过强度、持续时间或垂向结构影响生态和碳循环过程。 它对 BGC-Argo; marine heatwaves; POC; microbial ecology 相关研究有帮助，特别适合用于筛选后续精读、方法比较或数据交叉验证。</w:t>
+        <w:t>这项研究关注海洋热浪如何改变食物网结构和碳输送过程。它把极端变暖事件与 POC、微生物生态和可能的 BGC-Argo 观测联系起来，而不是只描述温度异常。研究分析热浪期间生态相互作用、颗粒形成和碳转运路径的变化。结果说明海洋热浪可能通过改变食物网和微生物过程来调节碳输出效率。它对研究极端事件下的碳泵响应和生态系统稳定性很有帮助。</w:t>
       </w:r>
     </w:p>
     <w:p>
@@ -448,7 +448,7 @@
         <w:rPr>
           <w:rFonts w:ascii="Microsoft YaHei" w:hAnsi="Microsoft YaHei" w:eastAsia="Microsoft YaHei"/>
         </w:rPr>
-        <w:t>这篇论文聚焦《Marine heatwaves are shaping the vertical structure of phytoplankton in the global ocean》，关键词是 BGC-Argo; marine heatwaves; vertical chlorophyll; DCM。 数据上主要依托 BGC-Argo 浮标剖面及相关生物地球化学变量，并结合题名所指的氧气、后向散射、硝酸盐或叶绿素信息。 研究主要围绕题名所示过程开展诊断、比较或方法验证。 核心结果帮助说明海洋热浪如何通过强度、持续时间或垂向结构影响生态和碳循环过程。 它对 BGC-Argo; marine heatwaves; vertical chlorophyll; DCM 相关研究有帮助，特别适合用于筛选后续精读、方法比较或数据交叉验证。</w:t>
+        <w:t>这项研究聚焦海洋热浪对全球浮游植物垂向结构的影响。它利用可解析垂向信息的观测资料，尤其适合与 BGC-Argo 叶绿素剖面和深叶绿素最大值研究相联系。研究比较热浪条件下表层、次表层和 DCM 附近浮游植物信号的变化。结果表明，海洋热浪不仅改变表层生态状态，也会重塑垂向叶绿素分布。它对理解热浪生态影响、浮游植物栖息层位变化和剖面观测解释很重要。</w:t>
       </w:r>
     </w:p>
     <w:p>
@@ -528,7 +528,7 @@
         <w:rPr>
           <w:rFonts w:ascii="Microsoft YaHei" w:hAnsi="Microsoft YaHei" w:eastAsia="Microsoft YaHei"/>
         </w:rPr>
-        <w:t>这篇论文聚焦《The oceanic physical injection pump of organic carbon》，关键词是 carbon pump; POC/DOC; physical injection pump。 数据来源可从 DOI 页面进一步核对；从题名和期刊信息看，它主要围绕海洋生物地球化学或生态过程资料展开。 研究主要围绕题名所示过程开展诊断、比较或方法验证。 核心结果或实现为该主题提供了新的观测约束、方法基准或过程解释。 它对 carbon pump; POC/DOC; physical injection pump 相关研究有帮助，特别适合用于筛选后续精读、方法比较或数据交叉验证。</w:t>
+        <w:t>这项研究提出或量化海洋中有机碳的物理注入泵过程。它关注物理输运如何把 POC 或 DOC 从表层带入更深层，而不仅仅依赖颗粒沉降这一条路径。研究把环流、混合或亚中尺度输运与有机碳再分布联系起来。结果强调，物理注入可以成为生物碳泵之外的重要碳封存通道。它对解释 BGC-Argo 剖面中的碳信号、改进碳泵模型和评估海洋碳汇很有帮助。</w:t>
       </w:r>
     </w:p>
     <w:p>
@@ -616,7 +616,7 @@
         <w:rPr>
           <w:rFonts w:ascii="Microsoft YaHei" w:hAnsi="Microsoft YaHei" w:eastAsia="Microsoft YaHei"/>
         </w:rPr>
-        <w:t>这篇论文聚焦《Antarctic krill vertical migrations modulate seasonal carbon export》，关键词是 carbon export; vertical migration; Southern Ocean。 数据来源可从 DOI 页面进一步核对；从题名和期刊信息看，它主要围绕海洋生物地球化学或生态过程资料展开。 研究主要围绕题名所示过程开展诊断、比较或方法验证。 核心结果或实现为该主题提供了新的观测约束、方法基准或过程解释。 它对 carbon export; vertical migration; Southern Ocean 相关研究有帮助，特别适合用于筛选后续精读、方法比较或数据交叉验证。</w:t>
+        <w:t>这项研究关注南大洋磷虾垂向迁移对季节性碳输出的调节作用。它把动物行为与生物碳泵联系起来，强调碳输出并不只由浮游植物和颗粒沉降决定。研究分析磷虾在昼夜或季节尺度上的上下迁移如何改变有机碳向深层输送。结果说明，磷虾迁移可以在特定季节增强或改变南大洋碳输出路径。它对南大洋生态碳泵、食物网-碳循环耦合和碳输出估算很有价值。</w:t>
       </w:r>
     </w:p>
     <w:p>
@@ -696,7 +696,7 @@
         <w:rPr>
           <w:rFonts w:ascii="Microsoft YaHei" w:hAnsi="Microsoft YaHei" w:eastAsia="Microsoft YaHei"/>
         </w:rPr>
-        <w:t>这篇论文聚焦《Declining ocean greenness and phytoplankton blooms in low to mid-latitudes under a warming climate》，关键词是 ocean colour; phytoplankton blooms; warming。 数据上主要面向卫星海色、叶绿素或遥感反射率记录，并在需要时结合原位或剖面观测进行约束。 研究主要分析变化趋势、事件响应或驱动机制，并把物理变化与生态/生物地球化学结果联系起来。 核心结果指向海色时代中初级生产、海洋绿度或藻华信号的下降趋势。 它对 ocean colour; phytoplankton blooms; warming 相关研究有帮助，特别适合用于筛选后续精读、方法比较或数据交叉验证。</w:t>
+        <w:t>这项研究利用长期海色记录分析低纬到中纬海洋绿度和浮游植物藻华变化。它把卫星观测中的颜色、叶绿素和藻华信号放到气候变暖背景下解释。研究重点是识别变暖海洋中表层浮游植物活动是否减弱，以及这种变化在哪些纬度带更明显。结果指向低中纬海域海洋绿度和藻华活动下降。它对评估海色趋势、生产力变化和未来生态系统响应很有参考价值。</w:t>
       </w:r>
     </w:p>
     <w:p>
@@ -784,7 +784,7 @@
         <w:rPr>
           <w:rFonts w:ascii="Microsoft YaHei" w:hAnsi="Microsoft YaHei" w:eastAsia="Microsoft YaHei"/>
         </w:rPr>
-        <w:t>这篇论文聚焦《Decoupled timescales of organic carbon and phosphorus recycling in the global ocean》，关键词是 organic carbon; phosphorus recycling; microbial carbon。 数据来源可从 DOI 页面进一步核对；从题名和期刊信息看，它主要围绕海洋生物地球化学或生态过程资料展开。 研究主要围绕题名所示过程开展诊断、比较或方法验证。 核心结果或实现为该主题提供了新的观测约束、方法基准或过程解释。 它对 organic carbon; phosphorus recycling; microbial carbon 相关研究有帮助，特别适合用于筛选后续精读、方法比较或数据交叉验证。</w:t>
+        <w:t>这项研究比较全球海洋中有机碳和磷的再循环时间尺度。它关注的问题是碳和营养元素是否按相同速度循环，而不是简单假设固定化学计量关系。研究通过全球尺度的循环框架分析微生物再矿化、营养盐供应和有机物周转之间的差异。结果说明，有机碳和磷的再循环可以明显脱耦，从而改变系统对扰动或施肥的响应。它对理解微生物碳循环、营养盐限制和生物碳泵效率很重要。</w:t>
       </w:r>
     </w:p>
     <w:p>
@@ -864,7 +864,7 @@
         <w:rPr>
           <w:rFonts w:ascii="Microsoft YaHei" w:hAnsi="Microsoft YaHei" w:eastAsia="Microsoft YaHei"/>
         </w:rPr>
-        <w:t>这篇论文聚焦《Global warming drives a threefold increase in persistence and 1 °C rise in intensity of marine heatwaves》，关键词是 marine heatwaves; warming; global trend。 数据来源可从 DOI 页面进一步核对；从题名和期刊信息看，它主要围绕海洋生物地球化学或生态过程资料展开。 研究主要分析变化趋势、事件响应或驱动机制，并把物理变化与生态/生物地球化学结果联系起来。 核心结果是识别出增强或上升的信号，例如生产力、热浪持续性/强度或相关碳循环指标的变化。 它对 marine heatwaves; warming; global trend 相关研究有帮助，特别适合用于筛选后续精读、方法比较或数据交叉验证。</w:t>
+        <w:t>这项研究量化全球变暖对海洋热浪持续性和强度的影响。它使用全球海表温度记录和反事实气候比较，区分自然变率与人为变暖的作用。研究分析如果没有全球变暖，观测到的海洋热浪会有多强、多持久。结果显示，全球变暖显著增加了海洋热浪的持续时间，并提高了热浪强度。它为评估热浪生态影响、垂向浮游植物响应和未来极端事件风险提供了物理背景。</w:t>
       </w:r>
     </w:p>
     <w:p>
@@ -944,7 +944,7 @@
         <w:rPr>
           <w:rFonts w:ascii="Microsoft YaHei" w:hAnsi="Microsoft YaHei" w:eastAsia="Microsoft YaHei"/>
         </w:rPr>
-        <w:t>这篇论文聚焦《Characterization of phytoplankton-excreted metabolites mediating carbon flux through the surface ocean》，关键词是 phytoplankton metabolites; dissolved organic matter; microbial loop。 数据来源可从 DOI 页面进一步核对；从题名和期刊信息看，它主要围绕海洋生物地球化学或生态过程资料展开。 研究主要围绕题名所示过程开展诊断、比较或方法验证。 核心结果或实现为该主题提供了新的观测约束、方法基准或过程解释。 它对 phytoplankton metabolites; dissolved organic matter; microbial loop 相关研究有帮助，特别适合用于筛选后续精读、方法比较或数据交叉验证。</w:t>
+        <w:t>这项研究分析浮游植物释放的代谢物如何影响表层海洋碳通量。它使用高分辨率有机分子分析和稳定同位素追踪来识别快速周转的溶解有机碳来源。研究关注这些低浓度、短寿命代谢物如何被微生物利用，并进入微生物环。结果把浮游植物初级生产和 labile DOC 的分子组成联系起来。它对理解 DOM、微生物碳泵和非颗粒碳通道很有帮助。</w:t>
       </w:r>
     </w:p>
     <w:p>
@@ -1024,7 +1024,7 @@
         <w:rPr>
           <w:rFonts w:ascii="Microsoft YaHei" w:hAnsi="Microsoft YaHei" w:eastAsia="Microsoft YaHei"/>
         </w:rPr>
-        <w:t>这篇论文聚焦《Hyperspectral retrieval of phytoplankton absorption and community composition from NASA’s PACE-OCI in estuarine–coastal waters using a hybrid framework combining mixture-of-experts and Variational Autoencoder》，关键词是 PACE; ocean colour; backscattering; machine learning。 数据或应用场景指向 NASA PACE/OCI 高光谱海色观测及其验证、训练或社区使用。 方法上使用机器学习、深度学习或神经模拟器来提取信号、反演变量或识别驱动机制。 核心实现是提出可复用的框架或流程，使类似观测、反演或外场设计可以更系统地开展。 它对 PACE; ocean colour; backscattering; machine learning 相关研究有帮助，特别适合用于筛选后续精读、方法比较或数据交叉验证。</w:t>
+        <w:t>这项研究面向 PACE-OCI 高光谱海色数据，反演河口和近岸水体中的浮游植物吸收和群落组成。它结合 mixture-of-experts 与变分自编码器，处理近岸水体光学性质复杂、端元混合明显的问题。研究把高光谱遥感信号转化为与浮游植物功能和群落结构相关的生物光学变量。结果提供了一个适用于 PACE 近岸应用的混合机器学习框架。它对 PACE 产品开发、近岸水色反演和 BGC-Argo/现场资料交叉验证很有帮助。</w:t>
       </w:r>
     </w:p>
     <w:p>
@@ -1104,7 +1104,7 @@
         <w:rPr>
           <w:rFonts w:ascii="Microsoft YaHei" w:hAnsi="Microsoft YaHei" w:eastAsia="Microsoft YaHei"/>
         </w:rPr>
-        <w:t>这篇论文聚焦《Retrieval of global surface phytoplankton community structure using a minimal set of predictors》，关键词是 ocean colour; phytoplankton community structure; remote sensing。 数据上主要面向卫星海色、叶绿素或遥感反射率记录，并在需要时结合原位或剖面观测进行约束。 研究重点是建立或评估反演/估计框架，把观测信号转化为浮游植物、叶绿素、吸收或碳通量等变量。 核心结果或实现为该主题提供了新的观测约束、方法基准或过程解释。 它对 ocean colour; phytoplankton community structure; remote sensing 相关研究有帮助，特别适合用于筛选后续精读、方法比较或数据交叉验证。</w:t>
+        <w:t>这项研究尝试用较少的预测变量反演全球表层浮游植物群落结构。它利用海色遥感相关变量，避免模型过度依赖复杂输入或难以获得的参数。研究把表层光学信号转化为群落组成信息，使海色产品从总叶绿素向功能群结构延伸。结果表明，简洁的预测变量组合也可以支持全球尺度群落结构估计。它对海色长期监测、生态模型约束和表层-剖面群落比较很有帮助。</w:t>
       </w:r>
     </w:p>
     <w:p>
@@ -1184,7 +1184,7 @@
         <w:rPr>
           <w:rFonts w:ascii="Microsoft YaHei" w:hAnsi="Microsoft YaHei" w:eastAsia="Microsoft YaHei"/>
         </w:rPr>
-        <w:t>这篇论文聚焦《Accuracy of SeaHawk-HawkEye Ocean color CubeSat remote sensing reflectance products in globally distributed aquatic sites》，关键词是 ocean colour; high-resolution observation; CubeSat。 数据上关注 SeaHawk-HawkEye CubeSat 海色遥感反射率产品，并用全球分布水体站点评估其表现。 研究主要围绕题名所示过程开展诊断、比较或方法验证。 核心结果是给出产品或方法表现的评估，为判断其适用水体、误差来源和后续改进提供依据。 它对 ocean colour; high-resolution observation; CubeSat 相关研究有帮助，特别适合用于筛选后续精读、方法比较或数据交叉验证。</w:t>
+        <w:t>这项研究评估 SeaHawk-HawkEye CubeSat 海色遥感反射率产品的精度。它使用全球分布的水体站点进行验证，覆盖不同光学条件和水体类型。研究比较 CubeSat 产品与现场或参考观测之间的一致性，识别误差来源和适用范围。结果说明高空间分辨率小卫星海色产品在特定应用中具有潜力，但需要清楚理解不确定性。它对近岸藻华、锋面、小尺度过程和传统海色产品补充很有价值。</w:t>
       </w:r>
     </w:p>
     <w:p>
@@ -1264,7 +1264,7 @@
         <w:rPr>
           <w:rFonts w:ascii="Microsoft YaHei" w:hAnsi="Microsoft YaHei" w:eastAsia="Microsoft YaHei"/>
         </w:rPr>
-        <w:t>这篇论文聚焦《Phytoplankton With Flexible Pigment Content Disadvantaged by Projected Future Decrease in Variability of the Ocean Light Spectrum》，关键词是 phytoplankton pigments; primary production; carbon flux。 数据来源可从 DOI 页面进一步核对；从题名和期刊信息看，它主要围绕海洋生物地球化学或生态过程资料展开。 研究主要分析变化趋势、事件响应或驱动机制，并把物理变化与生态/生物地球化学结果联系起来。 核心结果或实现为该主题提供了新的观测约束、方法基准或过程解释。 它对 phytoplankton pigments; primary production; carbon flux 相关研究有帮助，特别适合用于筛选后续精读、方法比较或数据交叉验证。</w:t>
+        <w:t>这项研究分析未来海洋光谱环境变化对浮游植物色素策略的影响。它把水下光谱变化、色素可塑性和浮游植物适应性联系起来，而不是只看叶绿素总量。研究评估不同色素调节能力的浮游植物在未来光环境中是否仍具有优势。结果表明，如果海洋光谱变率下降，具有灵活色素含量的类群可能反而处于不利位置。它对初级生产模型、photoacclimation 表达和碳通量估计很有帮助。</w:t>
       </w:r>
     </w:p>
     <w:p>
@@ -1344,7 +1344,7 @@
         <w:rPr>
           <w:rFonts w:ascii="Microsoft YaHei" w:hAnsi="Microsoft YaHei" w:eastAsia="Microsoft YaHei"/>
         </w:rPr>
-        <w:t>这篇论文聚焦《Modeling the Vertical Flux of Organic Carbon in the Global Ocean》，关键词是 carbon flux; review; model synthesis。 这类论文主要综合已有观测、理论和模型文献，而不是发布一个新的单一观测数据集。 研究主要通过综述、模型框架或概念整合来梳理关键过程和不确定性来源。 核心结果或实现为该主题提供了新的观测约束、方法基准或过程解释。 它对 carbon flux; review; model synthesis 相关研究有帮助，特别适合用于筛选后续精读、方法比较或数据交叉验证。</w:t>
+        <w:t>这篇综述系统梳理全球海洋有机碳垂向通量的形成和转化过程。它整合颗粒形成、沉降、再矿化、物理输运和生态调控等多类机制。文章关注模型如何表达这些过程，以及不同模型假设会如何影响深海碳封存估计。结果是一个用于理解和比较有机碳通量模型的框架。它对生物碳泵建模、BGC-Argo 光学代理变量解释和全球碳预算研究很有价值。</w:t>
       </w:r>
     </w:p>
     <w:p>
@@ -1424,7 +1424,7 @@
         <w:rPr>
           <w:rFonts w:ascii="Microsoft YaHei" w:hAnsi="Microsoft YaHei" w:eastAsia="Microsoft YaHei"/>
         </w:rPr>
-        <w:t>这篇论文聚焦《Two Decades of Increase in Southern Ocean Net Community Production Revealed by BGC‐Argo Floats》，关键词是 BGC-Argo; NCP; Southern Ocean。 数据上主要依托 BGC-Argo 浮标剖面及相关生物地球化学变量，并结合题名所指的氧气、后向散射、硝酸盐或叶绿素信息。 研究主要分析变化趋势、事件响应或驱动机制，并把物理变化与生态/生物地球化学结果联系起来。 核心结果是识别出增强或上升的信号，例如生产力、热浪持续性/强度或相关碳循环指标的变化。 它对 BGC-Argo; NCP; Southern Ocean 相关研究有帮助，特别适合用于筛选后续精读、方法比较或数据交叉验证。</w:t>
+        <w:t>这项研究利用 BGC-Argo 浮标揭示南大洋净群落生产力的年代际增长。它通过剖面观测约束硝酸盐和相关生物地球化学变量，从而弥补传统船测时空覆盖不足。研究分析物理混合和采样差异之后的生产力变化信号。结果显示，南大洋净群落生产力在过去约二十年中呈增加趋势。它对理解南大洋碳吸收、营养盐消耗和浮标驱动的生产力估算很重要。</w:t>
       </w:r>
     </w:p>
     <w:p>
@@ -1504,7 +1504,7 @@
         <w:rPr>
           <w:rFonts w:ascii="Microsoft YaHei" w:hAnsi="Microsoft YaHei" w:eastAsia="Microsoft YaHei"/>
         </w:rPr>
-        <w:t>这篇论文聚焦《Southern Ocean Carbon Export Revealed by Backscatter and Oxygen Measurements From BGC‐Argo Floats》，关键词是 BGC-Argo; backscatter; oxygen; carbon export。 数据上主要依托 BGC-Argo 浮标剖面及相关生物地球化学变量，并结合题名所指的氧气、后向散射、硝酸盐或叶绿素信息。 研究主要围绕题名所示过程开展诊断、比较或方法验证。 核心实现是把隐藏在长期观测或复杂系统中的信号识别出来，并转化为可解释的过程认识。 它对 BGC-Argo; backscatter; oxygen; carbon export 相关研究有帮助，特别适合用于筛选后续精读、方法比较或数据交叉验证。</w:t>
+        <w:t>这项研究用 BGC-Argo 后向散射和氧气观测估计南大洋碳输出。它把光学颗粒信号与氧气约束结合起来，从而获得比单一指标更稳健的碳输出信息。研究比较不同海盆、锋区和海冰影响区域的输出差异。结果展示了南大洋碳输出的空间结构，并强调海冰区也需要纳入盆地尺度估算。它对利用剖面浮标量化生物碳泵和校验碳循环模型很有帮助。</w:t>
       </w:r>
     </w:p>
     <w:p>
@@ -1584,7 +1584,7 @@
         <w:rPr>
           <w:rFonts w:ascii="Microsoft YaHei" w:hAnsi="Microsoft YaHei" w:eastAsia="Microsoft YaHei"/>
         </w:rPr>
-        <w:t>这篇论文聚焦《Deep Learning Identifies the Climate Warming Signal in Global Ocean Chlorophyll From Satellite Records》，关键词是 ocean colour; deep learning; chlorophyll。 数据上主要面向卫星海色、叶绿素或遥感反射率记录，并在需要时结合原位或剖面观测进行约束。 方法上使用机器学习、深度学习或神经模拟器来提取信号、反演变量或识别驱动机制。 核心实现是把隐藏在长期观测或复杂系统中的信号识别出来，并转化为可解释的过程认识。 它对 ocean colour; deep learning; chlorophyll 相关研究有帮助，特别适合用于筛选后续精读、方法比较或数据交叉验证。</w:t>
+        <w:t>这项研究用深度学习从全球卫星叶绿素记录中识别气候变暖信号。它面对的核心难点是海色记录相对较短，容易被自然年际和年代际变率掩盖。研究训练模型来区分气候强迫信号和内部变率对叶绿素变化的贡献。结果说明，深度学习可以在全球叶绿素资料中提取出变暖相关的长期信号。它对海色趋势检测、气候影响归因和生产力变化研究很有帮助。</w:t>
       </w:r>
     </w:p>
     <w:p>
@@ -1664,7 +1664,7 @@
         <w:rPr>
           <w:rFonts w:ascii="Microsoft YaHei" w:hAnsi="Microsoft YaHei" w:eastAsia="Microsoft YaHei"/>
         </w:rPr>
-        <w:t>这篇论文聚焦《Seasonal Variability of Surface Ocean Carbon Uptake and Chlorophyll‐a Concentration in the West Antarctic Peninsula Over Two Decades》，关键词是 phytoplankton; carbon uptake; Antarctic Peninsula。 数据上主要面向卫星海色、叶绿素或遥感反射率记录，并在需要时结合原位或剖面观测进行约束。 研究主要分析变化趋势、事件响应或驱动机制，并把物理变化与生态/生物地球化学结果联系起来。 核心结果或实现为该主题提供了新的观测约束、方法基准或过程解释。 它对 phytoplankton; carbon uptake; Antarctic Peninsula 相关研究有帮助，特别适合用于筛选后续精读、方法比较或数据交叉验证。</w:t>
+        <w:t>这项研究分析西南极半岛二十年来表层海洋碳吸收和叶绿素 a 的季节变化。它结合原位 CO2 通量资料和卫星叶绿素记录，关注快速变暖区域中的季节节律。研究比较生产季内浮游植物物候与海气 CO2 交换之间的联系。结果说明，叶绿素季节变化会影响区域碳吸收的时间分布和强度。它对南极半岛碳汇评估、浮游植物物候研究和高纬海洋气候反馈很有帮助。</w:t>
       </w:r>
     </w:p>
     <w:p>
@@ -1744,7 +1744,7 @@
         <w:rPr>
           <w:rFonts w:ascii="Microsoft YaHei" w:hAnsi="Microsoft YaHei" w:eastAsia="Microsoft YaHei"/>
         </w:rPr>
-        <w:t>这篇论文聚焦《Unprecedented Summer Phytoplankton Bloom in the Ross Sea》，关键词是 marine heatwave; phytoplankton bloom; Ross Sea。 数据来源可从 DOI 页面进一步核对；从题名和期刊信息看，它主要围绕海洋生物地球化学或生态过程资料展开。 研究主要围绕题名所示过程开展诊断、比较或方法验证。 核心结果帮助说明海洋热浪如何通过强度、持续时间或垂向结构影响生态和碳循环过程。 它对 marine heatwave; phytoplankton bloom; Ross Sea 相关研究有帮助，特别适合用于筛选后续精读、方法比较或数据交叉验证。</w:t>
+        <w:t>这项研究报道罗斯海一次异常强的夏季浮游植物藻华。它利用高分辨率水下滑翔机观测解析藻华在上层水柱中的持续时间和垂向范围。研究关注藻华可能的群落组成、光照条件和水柱结构背景。结果显示，该藻华持续时间长、浓度高，并延伸到上百米深度范围。它对理解南大洋极端生产事件、海冰边缘生态过程和区域碳输出很有价值。</w:t>
       </w:r>
     </w:p>
     <w:p>
@@ -1824,7 +1824,7 @@
         <w:rPr>
           <w:rFonts w:ascii="Microsoft YaHei" w:hAnsi="Microsoft YaHei" w:eastAsia="Microsoft YaHei"/>
         </w:rPr>
-        <w:t>这篇论文聚焦《Anomalously Low New Production in the Northeast Atlantic During Spring 2024: A Consequence of Weaker Winter Mixing?》，关键词是 BGC-Argo; chlorophyll fluorescence; NPQ; DCM。 数据上主要依托 BGC-Argo 浮标剖面及相关生物地球化学变量，并结合题名所指的氧气、后向散射、硝酸盐或叶绿素信息。 研究主要围绕题名所示过程开展诊断、比较或方法验证。 核心结果或实现为该主题提供了新的观测约束、方法基准或过程解释。 它对 BGC-Argo; chlorophyll fluorescence; NPQ; DCM 相关研究有帮助，特别适合用于筛选后续精读、方法比较或数据交叉验证。</w:t>
+        <w:t>这项研究关注 2024 年春季东北大西洋异常偏低的新生产。它利用 BGC-Argo 相关剖面、叶绿素荧光和混合层信息来分析春季生产力状态。研究讨论较弱冬季混合是否减少了营养盐补给，从而影响春季新生产。结果指出，物理混合异常可能通过营养盐供应改变次表层和 DCM 附近的生产结构。它对解释 BGC-Argo 叶绿素荧光、NPQ 校正和年际生产力异常很有帮助。</w:t>
       </w:r>
     </w:p>
     <w:p>
@@ -1904,7 +1904,7 @@
         <w:rPr>
           <w:rFonts w:ascii="Microsoft YaHei" w:hAnsi="Microsoft YaHei" w:eastAsia="Microsoft YaHei"/>
         </w:rPr>
-        <w:t>这篇论文聚焦《BGC-Argo+: Global biogeochemical Argo float data with secondary quality control and derived parameters》，关键词是 BGC-Argo; data system; sensors; methods。 数据上主要依托 BGC-Argo 浮标剖面及相关生物地球化学变量，并结合题名所指的氧气、后向散射、硝酸盐或叶绿素信息。 研究重点是整理、质控或构建可复用数据产品，使后续跨区域和长期分析更可靠。 核心产出是一个经过整理的数据集或数据记录，可直接支撑趋势分析、模型验证和产品互校。 它对 BGC-Argo; data system; sensors; methods 相关研究有帮助，特别适合用于筛选后续精读、方法比较或数据交叉验证。</w:t>
+        <w:t>这篇数据论文介绍 BGC-Argo+ 全球生物地球化学浮标数据产品。它在原始浮标观测基础上加入二级质量控制和衍生参数，使不同区域和不同传感器之间的数据更可比。研究重点是提供更可靠的氧气、硝酸盐、叶绿素、颗粒和相关变量集合。结果是一个可直接用于分析和模型验证的全球 BGC-Argo 数据系统。它对长期趋势分析、算法开发和跨平台数据融合很重要。</w:t>
       </w:r>
     </w:p>
     <w:p>
@@ -1984,7 +1984,7 @@
         <w:rPr>
           <w:rFonts w:ascii="Microsoft YaHei" w:hAnsi="Microsoft YaHei" w:eastAsia="Microsoft YaHei"/>
         </w:rPr>
-        <w:t>这篇论文聚焦《Decadal and spatially complete global surface chlorophyll-a data record from satellite and BGC-Argo observations》，关键词是 ocean colour; chlorophyll dataset; multi-sensor。 数据上主要依托 BGC-Argo 浮标剖面及相关生物地球化学变量，并结合题名所指的氧气、后向散射、硝酸盐或叶绿素信息。 研究重点是整理、质控或构建可复用数据产品，使后续跨区域和长期分析更可靠。 核心产出是一个经过整理的数据集或数据记录，可直接支撑趋势分析、模型验证和产品互校。 它对 ocean colour; chlorophyll dataset; multi-sensor 相关研究有帮助，特别适合用于筛选后续精读、方法比较或数据交叉验证。</w:t>
+        <w:t>这篇数据论文构建全球表层叶绿素 a 的年代际完整数据记录。它结合卫星海色和 BGC-Argo 观测，弥补单一资料源在空间覆盖或垂向约束上的不足。研究通过融合和插补方法获得空间上更连续的表层叶绿素场。结果提供了适合长期趋势、季节循环和区域比较的数据产品。它对海色产品评估、生产力估算和生态模型验证很有价值。</w:t>
       </w:r>
     </w:p>
     <w:p>
@@ -2064,7 +2064,7 @@
         <w:rPr>
           <w:rFonts w:ascii="Microsoft YaHei" w:hAnsi="Microsoft YaHei" w:eastAsia="Microsoft YaHei"/>
         </w:rPr>
-        <w:t>这篇论文聚焦《Phytoplankton coastal-offshore monitoring by the Strait of Dover at high spatial resolution: the DYPHYRAD surveys》，关键词是 phytoplankton groups; nutrients; carbon; dataset。 数据来源可从 DOI 页面进一步核对；从题名和期刊信息看，它主要围绕海洋生物地球化学或生态过程资料展开。 研究重点是整理、质控或构建可复用数据产品，使后续跨区域和长期分析更可靠。 核心产出是一个经过整理的数据集或数据记录，可直接支撑趋势分析、模型验证和产品互校。 它对 phytoplankton groups; nutrients; carbon; dataset 相关研究有帮助，特别适合用于筛选后续精读、方法比较或数据交叉验证。</w:t>
+        <w:t>这篇数据论文整理多佛海峡 DYPHYRAD 航次中的高空间分辨率浮游植物监测资料。它覆盖从近岸到外海的梯度，并包含浮游植物群组、营养盐和相关碳循环信息。研究目标是把重复调查资料整理成可复用的数据集，支持对英吉利海峡生态变化的分析。结果提供了一个适合研究沿岸-外海差异和季节变化的观测基础。它对近岸生态监测、浮游植物功能群和区域碳循环研究很有帮助。</w:t>
       </w:r>
     </w:p>
     <w:p>
@@ -2144,7 +2144,7 @@
         <w:rPr>
           <w:rFonts w:ascii="Microsoft YaHei" w:hAnsi="Microsoft YaHei" w:eastAsia="Microsoft YaHei"/>
         </w:rPr>
-        <w:t>这篇论文聚焦《Estimating particulate organic matter flux from in-situ optics: A framework for correcting for suspended particles and incorporating depth-dependent degradation》，关键词是 Southern Ocean; optical observations; POM flux。 数据或方法上围绕原位光学、生物光学参数或光谱观测展开。 研究重点是建立或评估反演/估计框架，把观测信号转化为浮游植物、叶绿素、吸收或碳通量等变量。 核心实现是提出可复用的框架或流程，使类似观测、反演或外场设计可以更系统地开展。 它对 Southern Ocean; optical observations; POM flux 相关研究有帮助，特别适合用于筛选后续精读、方法比较或数据交叉验证。</w:t>
+        <w:t>这项研究提出从原位光学观测估计颗粒有机物通量的框架。它重点处理悬浮颗粒对光学信号的影响，并把随深度变化的降解过程纳入通量估计。研究把后向散射等光学量与 POM 通量联系起来，使剖面观测更接近碳输出诊断。结果提供了一个可用于修正和解释光学通量估计的方法。它对南大洋碳输出、BGC-Argo 光学代理变量和颗粒降解研究很有帮助。</w:t>
       </w:r>
     </w:p>
     <w:p>
@@ -2224,7 +2224,7 @@
         <w:rPr>
           <w:rFonts w:ascii="Microsoft YaHei" w:hAnsi="Microsoft YaHei" w:eastAsia="Microsoft YaHei"/>
         </w:rPr>
-        <w:t>这篇论文聚焦《Unexpected quasi-independence of coloured dissolved organic matter absorption from chlorophyll-a concentration in the Southern Ocean》，关键词是 chlorophyll maximum; CDOM; bio-optics。 数据上主要面向卫星海色、叶绿素或遥感反射率记录，并在需要时结合原位或剖面观测进行约束。 研究主要围绕题名所示过程开展诊断、比较或方法验证。 核心结果或实现为该主题提供了新的观测约束、方法基准或过程解释。 它对 chlorophyll maximum; CDOM; bio-optics 相关研究有帮助，特别适合用于筛选后续精读、方法比较或数据交叉验证。</w:t>
+        <w:t>这项研究分析南大洋 CDOM 吸收与叶绿素 a 浓度之间意外的弱耦合关系。它利用生物光学观测比较 CDOM、叶绿素最大值和相关光学信号。研究关注在南大洋中能否用叶绿素变化简单推断 CDOM 吸收。结果显示，两者之间存在近似独立性，提示传统经验关系可能不适用。它对南大洋海色反演、CDOM 校正和生物光学解释很重要。</w:t>
       </w:r>
     </w:p>
     <w:p>
@@ -2304,7 +2304,7 @@
         <w:rPr>
           <w:rFonts w:ascii="Microsoft YaHei" w:hAnsi="Microsoft YaHei" w:eastAsia="Microsoft YaHei"/>
         </w:rPr>
-        <w:t>这篇论文聚焦《Glaciogenic iron transport pathways to the Kerguelen offshore phytoplankton bloom》，关键词是 phytoplankton functional groups; iron; Southern Ocean bloom。 数据来源可从 DOI 页面进一步核对；从题名和期刊信息看，它主要围绕海洋生物地球化学或生态过程资料展开。 研究主要围绕题名所示过程开展诊断、比较或方法验证。 核心结果或实现为该主题提供了新的观测约束、方法基准或过程解释。 它对 phytoplankton functional groups; iron; Southern Ocean bloom 相关研究有帮助，特别适合用于筛选后续精读、方法比较或数据交叉验证。</w:t>
+        <w:t>这项研究关注冰川来源铁如何输送到 Kerguelen 外海浮游植物藻华区。它结合区域海洋过程、铁供应路径和浮游植物响应来解释南大洋高生产力热点。研究分析冰川或陆源物质如何通过水团和环流进入外海。结果说明，铁的输送路径会影响藻华维持和浮游植物功能群结构。它对理解南大洋铁限制、HNLC 海区生产力和碳输出很有帮助。</w:t>
       </w:r>
     </w:p>
     <w:p>
@@ -2384,7 +2384,7 @@
         <w:rPr>
           <w:rFonts w:ascii="Microsoft YaHei" w:hAnsi="Microsoft YaHei" w:eastAsia="Microsoft YaHei"/>
         </w:rPr>
-        <w:t>这篇论文聚焦《Response of phytoplankton communities to the onset of the 2020 summer marine heatwave in the Drake Passage and Antarctic Peninsula》，关键词是 marine heatwaves; phytoplankton communities; Southern Ocean。 数据来源可从 DOI 页面进一步核对；从题名和期刊信息看，它主要围绕海洋生物地球化学或生态过程资料展开。 研究主要分析变化趋势、事件响应或驱动机制，并把物理变化与生态/生物地球化学结果联系起来。 核心结果帮助说明海洋热浪如何通过强度、持续时间或垂向结构影响生态和碳循环过程。 它对 marine heatwaves; phytoplankton communities; Southern Ocean 相关研究有帮助，特别适合用于筛选后续精读、方法比较或数据交叉验证。</w:t>
+        <w:t>这项研究分析 2020 年夏季海洋热浪开始时 Drake Passage 和南极半岛浮游植物群落的响应。它利用现场群落和环境资料，把热浪物理异常与浮游植物组成变化联系起来。研究关注不同类群在热浪初期是否出现替代、增强或衰退。结果显示，群落结构会在热浪发展早期发生可检测变化。它对理解南大洋热浪生态效应、群落功能变化和区域碳循环响应很有帮助。</w:t>
       </w:r>
     </w:p>
     <w:p>
@@ -2464,7 +2464,7 @@
         <w:rPr>
           <w:rFonts w:ascii="Microsoft YaHei" w:hAnsi="Microsoft YaHei" w:eastAsia="Microsoft YaHei"/>
         </w:rPr>
-        <w:t>这篇论文聚焦《Lifting the lid on Marine Heatwaves》，关键词是 marine heatwaves; subsurface warming; vertical structure。 这类论文主要综合已有观测、理论和模型文献，而不是发布一个新的单一观测数据集。 研究主要通过综述、模型框架或概念整合来梳理关键过程和不确定性来源。 核心结果帮助说明海洋热浪如何通过强度、持续时间或垂向结构影响生态和碳循环过程。 它对 marine heatwaves; subsurface warming; vertical structure 相关研究有帮助，特别适合用于筛选后续精读、方法比较或数据交叉验证。</w:t>
+        <w:t>这篇综述强调海洋热浪并不只是表层温度事件。它整合关于次表层升温、垂向结构和生态响应的研究，提醒热浪影响可能延伸到观测较少的深度层。文章关注热异常如何在水柱中传播，并影响营养盐、浮游植物和食物网过程。结果是一个更立体的海洋热浪理解框架。它对设计 BGC-Argo 观测、评估生态风险和解释垂向生物地球化学响应很有帮助。</w:t>
       </w:r>
     </w:p>
     <w:p>
@@ -2544,7 +2544,7 @@
         <w:rPr>
           <w:rFonts w:ascii="Microsoft YaHei" w:hAnsi="Microsoft YaHei" w:eastAsia="Microsoft YaHei"/>
         </w:rPr>
-        <w:t>这篇论文聚焦《Climate variability induces changes in phytoplankton phenology across Spanish marine ecoregions》，关键词是 phytoplankton phenology; climate variability; shelf ocean。 数据来源可从 DOI 页面进一步核对；从题名和期刊信息看，它主要围绕海洋生物地球化学或生态过程资料展开。 研究主要分析变化趋势、事件响应或驱动机制，并把物理变化与生态/生物地球化学结果联系起来。 核心结果或实现为该主题提供了新的观测约束、方法基准或过程解释。 它对 phytoplankton phenology; climate variability; shelf ocean 相关研究有帮助，特别适合用于筛选后续精读、方法比较或数据交叉验证。</w:t>
+        <w:t>这项研究分析气候变率如何改变西班牙不同海洋生态区的浮游植物物候。它利用区域时间序列或遥感资料比较藻华发生时间、持续时间和季节峰值。研究关注不同生态区对气候振荡和环境变化的响应是否一致。结果显示，浮游植物物候会随气候变率发生区域差异明显的改变。它对陆架海生态监测、藻华预警和区域生产力研究很有帮助。</w:t>
       </w:r>
     </w:p>
     <w:p>
@@ -2624,7 +2624,7 @@
         <w:rPr>
           <w:rFonts w:ascii="Microsoft YaHei" w:hAnsi="Microsoft YaHei" w:eastAsia="Microsoft YaHei"/>
         </w:rPr>
-        <w:t>这篇论文聚焦《Bio-optical properties and radiant heating rates in the borderlands region of the Chukchi Sea: The roles of phytoplankton biomass and sea ice cover》，关键词是 bio-optics; Arctic; ocean colour validation。 数据上主要面向卫星海色、叶绿素或遥感反射率记录，并在需要时结合原位或剖面观测进行约束。 研究主要围绕题名所示过程开展诊断、比较或方法验证。 核心结果或实现为该主题提供了新的观测约束、方法基准或过程解释。 它对 bio-optics; Arctic; ocean colour validation 相关研究有帮助，特别适合用于筛选后续精读、方法比较或数据交叉验证。</w:t>
+        <w:t>这项研究关注楚科奇海边缘区的生物光学性质和辐射加热率。它分析浮游植物生物量、海冰覆盖和光学吸收如何共同影响水体吸收太阳辐射。研究把北极海色验证与物理加热过程联系起来，而不仅仅描述叶绿素浓度。结果说明，浮游植物和海冰状态会共同调节上层海洋的辐射加热。它对北极海色产品、冰缘生态和气候反馈研究很有帮助。</w:t>
       </w:r>
     </w:p>
     <w:p>
@@ -2704,7 +2704,7 @@
         <w:rPr>
           <w:rFonts w:ascii="Microsoft YaHei" w:hAnsi="Microsoft YaHei" w:eastAsia="Microsoft YaHei"/>
         </w:rPr>
-        <w:t>这篇论文聚焦《A Machine Learning Approach for Chlorophyll- a Estimation in Coastal Waters From Top-of-Atmosphere VIIRS Satellite Data》，关键词是 ocean colour; VIIRS; hyperspectral estimation。 数据上使用 VIIRS 顶层大气卫星观测，面向近岸复杂水体的叶绿素 a 估计。 方法上使用机器学习、深度学习或神经模拟器来提取信号、反演变量或识别驱动机制。 核心实现是提出可复用的框架或流程，使类似观测、反演或外场设计可以更系统地开展。 它对 ocean colour; VIIRS; hyperspectral estimation 相关研究有帮助，特别适合用于筛选后续精读、方法比较或数据交叉验证。</w:t>
+        <w:t>这项研究用机器学习从 VIIRS 顶层大气数据估计近岸水体叶绿素 a。它避开了复杂近岸水体中传统大气校正和经验算法容易累积误差的问题。研究训练模型把 TOA 卫星信号直接映射到叶绿素估计。结果提供了一条面向复杂近岸水体的替代反演路径。它对业务海色产品、近岸水质监测和藻华识别很有帮助。</w:t>
       </w:r>
     </w:p>
     <w:p>
@@ -2784,7 +2784,7 @@
         <w:rPr>
           <w:rFonts w:ascii="Microsoft YaHei" w:hAnsi="Microsoft YaHei" w:eastAsia="Microsoft YaHei"/>
         </w:rPr>
-        <w:t>这篇论文聚焦《Performance Comparison of Multi-Task and Single-Task Learning in Ocean Color Retrieval: A Case Study of Hong Kong Coastal Waters》，关键词是 ocean colour; multi-task learning; remote sensing products。 数据上主要面向卫星海色、叶绿素或遥感反射率记录，并在需要时结合原位或剖面观测进行约束。 研究重点是建立或评估反演/估计框架，把观测信号转化为浮游植物、叶绿素、吸收或碳通量等变量。 核心结果是给出产品或方法表现的评估，为判断其适用水体、误差来源和后续改进提供依据。 它对 ocean colour; multi-task learning; remote sensing products 相关研究有帮助，特别适合用于筛选后续精读、方法比较或数据交叉验证。</w:t>
+        <w:t>这项研究比较多任务学习和单任务学习在香港近岸水体海色反演中的表现。它利用复杂近岸水体案例来测试不同机器学习策略是否能同时改善多个海色变量。研究评估模型在相关任务之间共享信息时是否更稳定、更准确。结果给出了多任务与单任务方法的性能差异和适用场景。它对复杂水体遥感产品开发、模型选择和区域监测很有参考价值。</w:t>
       </w:r>
     </w:p>
     <w:p>
@@ -2864,7 +2864,7 @@
         <w:rPr>
           <w:rFonts w:ascii="Microsoft YaHei" w:hAnsi="Microsoft YaHei" w:eastAsia="Microsoft YaHei"/>
         </w:rPr>
-        <w:t>这篇论文聚焦《Field Campaign Design and Implementation with Traceability Matrix Decision Support》，关键词是 satellite validation; field campaign; PACE。 数据或应用场景指向 NASA PACE/OCI 高光谱海色观测及其验证、训练或社区使用。 研究主要围绕题名所示过程开展诊断、比较或方法验证。 核心实现是提出可复用的框架或流程，使类似观测、反演或外场设计可以更系统地开展。 它对 satellite validation; field campaign; PACE 相关研究有帮助，特别适合用于筛选后续精读、方法比较或数据交叉验证。</w:t>
+        <w:t>这项研究介绍用可追溯矩阵支持外场观测设计和实施的方法。它面向卫星验证和大型外场活动，把科学目标、观测需求、传感器配置和采样计划连接起来。研究重点是让每一项现场测量都能对应到明确的产品或算法验证需求。结果提供了一个更系统的外场设计决策流程。它对 PACE 验证航次、海色现场采样和跨团队观测协调很有帮助。</w:t>
       </w:r>
     </w:p>
     <w:p>
@@ -2944,7 +2944,7 @@
         <w:rPr>
           <w:rFonts w:ascii="Microsoft YaHei" w:hAnsi="Microsoft YaHei" w:eastAsia="Microsoft YaHei"/>
         </w:rPr>
-        <w:t>这篇论文聚焦《Inconsistencies in annual variations of flux and reactivity of sinking particles in the Pacific Arctic: evidence from a sediment trap》，关键词是 primary production; carbon export; sediment traps。 数据上使用沉积物捕获器观测来追踪下沉颗粒通量和颗粒反应性。 研究主要围绕题名所示过程开展诊断、比较或方法验证。 核心结果或实现为该主题提供了新的观测约束、方法基准或过程解释。 它对 primary production; carbon export; sediment traps 相关研究有帮助，特别适合用于筛选后续精读、方法比较或数据交叉验证。</w:t>
+        <w:t>这项研究利用沉积物捕获器证据分析太平洋北极下沉颗粒通量和反应性的年际变化。它关注的不只是有多少颗粒下沉，还包括这些颗粒在化学和生物反应性上的差异。研究比较不同年份中颗粒通量与初级生产或环境条件之间的关系。结果显示，下沉通量和颗粒反应性并不总是同步变化。它对理解北极碳输出、颗粒降解和沉积物捕获器资料解释很重要。</w:t>
       </w:r>
     </w:p>
     <w:p>
@@ -3024,7 +3024,7 @@
         <w:rPr>
           <w:rFonts w:ascii="Microsoft YaHei" w:hAnsi="Microsoft YaHei" w:eastAsia="Microsoft YaHei"/>
         </w:rPr>
-        <w:t>这篇论文聚焦《Identifying drivers and dynamics of phytoplankton in the Black Sea: application of a neural emulator》，关键词是 biogeochemical forecasting; neural network; operational oceanography。 数据来源可从 DOI 页面进一步核对；从题名和期刊信息看，它主要围绕海洋生物地球化学或生态过程资料展开。 方法上使用机器学习、深度学习或神经模拟器来提取信号、反演变量或识别驱动机制。 核心实现是把隐藏在长期观测或复杂系统中的信号识别出来，并转化为可解释的过程认识。 它对 biogeochemical forecasting; neural network; operational oceanography 相关研究有帮助，特别适合用于筛选后续精读、方法比较或数据交叉验证。</w:t>
+        <w:t>这项研究用神经模拟器识别黑海浮游植物变化的驱动因素和动力学。它把复杂生物地球化学模型或观测关系压缩成计算更高效的机器学习表示。研究分析环境变量如何控制浮游植物时空变化，并评估模拟器是否能再现关键动态。结果提供了一个用于快速探索和预测黑海生态状态的工具。它对区域生物地球化学预报、模型加速和业务海洋学很有帮助。</w:t>
       </w:r>
     </w:p>
     <w:p>
@@ -3104,7 +3104,7 @@
         <w:rPr>
           <w:rFonts w:ascii="Microsoft YaHei" w:hAnsi="Microsoft YaHei" w:eastAsia="Microsoft YaHei"/>
         </w:rPr>
-        <w:t>这篇论文聚焦《Subsurface biogeochemical response to Hurricane Idalia within a cyclonic eddy and river plume–stratified environment》，关键词是 subsurface chlorophyll maximum; storm disturbance; vertical response。 数据上主要面向卫星海色、叶绿素或遥感反射率记录，并在需要时结合原位或剖面观测进行约束。 研究主要分析变化趋势、事件响应或驱动机制，并把物理变化与生态/生物地球化学结果联系起来。 核心结果或实现为该主题提供了新的观测约束、方法基准或过程解释。 它对 subsurface chlorophyll maximum; storm disturbance; vertical response 相关研究有帮助，特别适合用于筛选后续精读、方法比较或数据交叉验证。</w:t>
+        <w:t>这项研究分析 Hurricane Idalia 经过气旋涡和河羽分层环境时的次表层生物地球化学响应。它关注风暴扰动如何与既有涡旋结构、淡水羽状体和分层共同作用。研究利用剖面或现场观测解析次表层叶绿素、营养盐和相关变量的变化。结果说明，风暴影响不仅发生在表层，也会通过混合和水团结构改变次表层生态状态。它对研究极端天气、垂向混合和 SCM/DCM 响应很有价值。</w:t>
       </w:r>
     </w:p>
     <w:p>
@@ -3184,7 +3184,7 @@
         <w:rPr>
           <w:rFonts w:ascii="Microsoft YaHei" w:hAnsi="Microsoft YaHei" w:eastAsia="Microsoft YaHei"/>
         </w:rPr>
-        <w:t>这篇论文聚焦《Spectral dependence of the depolarization ratio of pure water》，关键词是 ocean lidar; pure water optics; bio-optic methods。 数据或方法上围绕原位光学、生物光学参数或光谱观测展开。 研究主要围绕题名所示过程开展诊断、比较或方法验证。 核心结果或实现为该主题提供了新的观测约束、方法基准或过程解释。 它对 ocean lidar; pure water optics; bio-optic methods 相关研究有帮助，特别适合用于筛选后续精读、方法比较或数据交叉验证。</w:t>
+        <w:t>这项研究测量或分析纯水退偏振比的光谱依赖性。它关注的是海洋激光雷达和偏振光学反演中一个基础但关键的光学参数。研究比较不同波长下纯水退偏振行为，为后续从水体信号中分离颗粒和分子贡献提供基准。结果改进了对纯水背景散射和偏振特性的认识。它对海洋 lidar、生物光学反演和主动遥感算法很有帮助。</w:t>
       </w:r>
     </w:p>
     <w:p>
@@ -3264,7 +3264,7 @@
         <w:rPr>
           <w:rFonts w:ascii="Microsoft YaHei" w:hAnsi="Microsoft YaHei" w:eastAsia="Microsoft YaHei"/>
         </w:rPr>
-        <w:t>这篇论文聚焦《Spectral variability in particulate light backscattering in the sea: resolving fine-scale optical features and their biogeochemical significance》，关键词是 particulate backscattering; bio-optics; ocean colour。 数据上主要面向卫星海色、叶绿素或遥感反射率记录，并在需要时结合原位或剖面观测进行约束。 研究主要分析变化趋势、事件响应或驱动机制，并把物理变化与生态/生物地球化学结果联系起来。 核心结果或实现为该主题提供了新的观测约束、方法基准或过程解释。 它对 particulate backscattering; bio-optics; ocean colour 相关研究有帮助，特别适合用于筛选后续精读、方法比较或数据交叉验证。</w:t>
+        <w:t>这项研究分析海水颗粒后向散射的光谱变异及其细尺度特征。它关注 bbp 光谱形状中可能被宽波段产品忽略的微小变化。研究把颗粒光学信号与颗粒组成、大小或生物地球化学状态联系起来。结果说明，高光谱或细光谱信息可以揭示更多颗粒过程细节。它对 PACE 高光谱海色、BGC-Argo bbp 解释和颗粒碳估算很有帮助。</w:t>
       </w:r>
     </w:p>
     <w:p>
@@ -3344,7 +3344,7 @@
         <w:rPr>
           <w:rFonts w:ascii="Microsoft YaHei" w:hAnsi="Microsoft YaHei" w:eastAsia="Microsoft YaHei"/>
         </w:rPr>
-        <w:t>这篇论文聚焦《The PACE Data Hackweek Launches a New Wave of Open Science: How We Did It (Twice), and Why》，关键词是 PACE; ocean colour; hyperspectral remote sensing。 数据或应用场景指向 NASA PACE/OCI 高光谱海色观测及其验证、训练或社区使用。 研究主要围绕题名所示过程开展诊断、比较或方法验证。 核心结果或实现为该主题提供了新的观测约束、方法基准或过程解释。 它对 PACE; ocean colour; hyperspectral remote sensing 相关研究有帮助，特别适合用于筛选后续精读、方法比较或数据交叉验证。</w:t>
+        <w:t>这篇文章总结 PACE Data Hackweek 的组织经验和开放科学实践。它关注的对象不是单一科学结果，而是如何让研究者有效学习和使用 PACE 高光谱数据。文章梳理课程设计、数据访问、协作工具和社区参与方式。结果展示了 Hackweek 如何促进开放代码、开放数据和跨学科训练。它对 PACE 用户社区建设、海色遥感教学和可重复科研工作流很有帮助。</w:t>
       </w:r>
     </w:p>
     <w:p>

</xml_diff>